<commit_message>
Corrige fuente de datos, documento y gráficas
- Se corrige la referencia del conjunto de datos (Online Retail II de UCI)
- Correcciones de redacción y tablas en el documento de Word
- Gráficas con colores estándar de matplotlib
- Tablas CSV con saltos de línea LF y README más completo
</commit_message>
<xml_diff>
--- a/deliverables/Equipo2_Inventario_Resultados.docx
+++ b/deliverables/Equipo2_Inventario_Resultados.docx
@@ -168,7 +168,7 @@
     <w:sdt>
       <w:sdtPr>
         <w:alias w:val="Índice"/>
-        <w:id w:val="1532997085"/>
+        <w:id w:val="-7910726"/>
       </w:sdtPr>
       <w:sdtEndPr/>
       <w:sdtContent>
@@ -196,7 +196,7 @@
           <w:r>
             <w:fldChar w:fldCharType="separate"/>
           </w:r>
-          <w:hyperlink w:anchor="_Toc242203743" w:history="1">
+          <w:hyperlink w:anchor="_Toc242205099" w:history="1">
             <w:r>
               <w:rPr>
                 <w:rStyle w:val="Hipervnculo"/>
@@ -220,7 +220,7 @@
               <w:rPr>
                 <w:noProof/>
               </w:rPr>
-              <w:instrText xml:space="preserve"> PAGEREF _Toc242203743 \h </w:instrText>
+              <w:instrText xml:space="preserve"> PAGEREF _Toc242205099 \h </w:instrText>
             </w:r>
             <w:r>
               <w:rPr>
@@ -262,7 +262,7 @@
               <w14:ligatures w14:val="standardContextual"/>
             </w:rPr>
           </w:pPr>
-          <w:hyperlink w:anchor="_Toc242203744" w:history="1">
+          <w:hyperlink w:anchor="_Toc242205100" w:history="1">
             <w:r>
               <w:rPr>
                 <w:rStyle w:val="Hipervnculo"/>
@@ -286,7 +286,7 @@
               <w:rPr>
                 <w:noProof/>
               </w:rPr>
-              <w:instrText xml:space="preserve"> PAGEREF _Toc242203744 \h </w:instrText>
+              <w:instrText xml:space="preserve"> PAGEREF _Toc242205100 \h </w:instrText>
             </w:r>
             <w:r>
               <w:rPr>
@@ -328,7 +328,7 @@
               <w14:ligatures w14:val="standardContextual"/>
             </w:rPr>
           </w:pPr>
-          <w:hyperlink w:anchor="_Toc242203745" w:history="1">
+          <w:hyperlink w:anchor="_Toc242205101" w:history="1">
             <w:r>
               <w:rPr>
                 <w:rStyle w:val="Hipervnculo"/>
@@ -352,7 +352,7 @@
               <w:rPr>
                 <w:noProof/>
               </w:rPr>
-              <w:instrText xml:space="preserve"> PAGEREF _Toc242203745 \h </w:instrText>
+              <w:instrText xml:space="preserve"> PAGEREF _Toc242205101 \h </w:instrText>
             </w:r>
             <w:r>
               <w:rPr>
@@ -394,7 +394,7 @@
               <w14:ligatures w14:val="standardContextual"/>
             </w:rPr>
           </w:pPr>
-          <w:hyperlink w:anchor="_Toc242203746" w:history="1">
+          <w:hyperlink w:anchor="_Toc242205102" w:history="1">
             <w:r>
               <w:rPr>
                 <w:rStyle w:val="Hipervnculo"/>
@@ -418,7 +418,7 @@
               <w:rPr>
                 <w:noProof/>
               </w:rPr>
-              <w:instrText xml:space="preserve"> PAGEREF _Toc242203746 \h </w:instrText>
+              <w:instrText xml:space="preserve"> PAGEREF _Toc242205102 \h </w:instrText>
             </w:r>
             <w:r>
               <w:rPr>
@@ -460,7 +460,7 @@
               <w14:ligatures w14:val="standardContextual"/>
             </w:rPr>
           </w:pPr>
-          <w:hyperlink w:anchor="_Toc242203747" w:history="1">
+          <w:hyperlink w:anchor="_Toc242205103" w:history="1">
             <w:r>
               <w:rPr>
                 <w:rStyle w:val="Hipervnculo"/>
@@ -484,7 +484,7 @@
               <w:rPr>
                 <w:noProof/>
               </w:rPr>
-              <w:instrText xml:space="preserve"> PAGEREF _Toc242203747 \h </w:instrText>
+              <w:instrText xml:space="preserve"> PAGEREF _Toc242205103 \h </w:instrText>
             </w:r>
             <w:r>
               <w:rPr>
@@ -526,7 +526,7 @@
               <w14:ligatures w14:val="standardContextual"/>
             </w:rPr>
           </w:pPr>
-          <w:hyperlink w:anchor="_Toc242203748" w:history="1">
+          <w:hyperlink w:anchor="_Toc242205104" w:history="1">
             <w:r>
               <w:rPr>
                 <w:rStyle w:val="Hipervnculo"/>
@@ -550,7 +550,7 @@
               <w:rPr>
                 <w:noProof/>
               </w:rPr>
-              <w:instrText xml:space="preserve"> PAGEREF _Toc242203748 \h </w:instrText>
+              <w:instrText xml:space="preserve"> PAGEREF _Toc242205104 \h </w:instrText>
             </w:r>
             <w:r>
               <w:rPr>
@@ -592,7 +592,7 @@
               <w14:ligatures w14:val="standardContextual"/>
             </w:rPr>
           </w:pPr>
-          <w:hyperlink w:anchor="_Toc242203749" w:history="1">
+          <w:hyperlink w:anchor="_Toc242205105" w:history="1">
             <w:r>
               <w:rPr>
                 <w:rStyle w:val="Hipervnculo"/>
@@ -616,7 +616,7 @@
               <w:rPr>
                 <w:noProof/>
               </w:rPr>
-              <w:instrText xml:space="preserve"> PAGEREF _Toc242203749 \h </w:instrText>
+              <w:instrText xml:space="preserve"> PAGEREF _Toc242205105 \h </w:instrText>
             </w:r>
             <w:r>
               <w:rPr>
@@ -658,7 +658,7 @@
               <w14:ligatures w14:val="standardContextual"/>
             </w:rPr>
           </w:pPr>
-          <w:hyperlink w:anchor="_Toc242203750" w:history="1">
+          <w:hyperlink w:anchor="_Toc242205106" w:history="1">
             <w:r>
               <w:rPr>
                 <w:rStyle w:val="Hipervnculo"/>
@@ -682,7 +682,7 @@
               <w:rPr>
                 <w:noProof/>
               </w:rPr>
-              <w:instrText xml:space="preserve"> PAGEREF _Toc242203750 \h </w:instrText>
+              <w:instrText xml:space="preserve"> PAGEREF _Toc242205106 \h </w:instrText>
             </w:r>
             <w:r>
               <w:rPr>
@@ -724,7 +724,7 @@
               <w14:ligatures w14:val="standardContextual"/>
             </w:rPr>
           </w:pPr>
-          <w:hyperlink w:anchor="_Toc242203751" w:history="1">
+          <w:hyperlink w:anchor="_Toc242205107" w:history="1">
             <w:r>
               <w:rPr>
                 <w:rStyle w:val="Hipervnculo"/>
@@ -748,7 +748,7 @@
               <w:rPr>
                 <w:noProof/>
               </w:rPr>
-              <w:instrText xml:space="preserve"> PAGEREF _Toc242203751 \h </w:instrText>
+              <w:instrText xml:space="preserve"> PAGEREF _Toc242205107 \h </w:instrText>
             </w:r>
             <w:r>
               <w:rPr>
@@ -765,7 +765,7 @@
               <w:rPr>
                 <w:noProof/>
               </w:rPr>
-              <w:t>6</w:t>
+              <w:t>7</w:t>
             </w:r>
             <w:r>
               <w:rPr>
@@ -790,7 +790,7 @@
               <w14:ligatures w14:val="standardContextual"/>
             </w:rPr>
           </w:pPr>
-          <w:hyperlink w:anchor="_Toc242203752" w:history="1">
+          <w:hyperlink w:anchor="_Toc242205108" w:history="1">
             <w:r>
               <w:rPr>
                 <w:rStyle w:val="Hipervnculo"/>
@@ -814,7 +814,7 @@
               <w:rPr>
                 <w:noProof/>
               </w:rPr>
-              <w:instrText xml:space="preserve"> PAGEREF _Toc242203752 \h </w:instrText>
+              <w:instrText xml:space="preserve"> PAGEREF _Toc242205108 \h </w:instrText>
             </w:r>
             <w:r>
               <w:rPr>
@@ -831,7 +831,7 @@
               <w:rPr>
                 <w:noProof/>
               </w:rPr>
-              <w:t>7</w:t>
+              <w:t>8</w:t>
             </w:r>
             <w:r>
               <w:rPr>
@@ -856,7 +856,7 @@
               <w14:ligatures w14:val="standardContextual"/>
             </w:rPr>
           </w:pPr>
-          <w:hyperlink w:anchor="_Toc242203753" w:history="1">
+          <w:hyperlink w:anchor="_Toc242205109" w:history="1">
             <w:r>
               <w:rPr>
                 <w:rStyle w:val="Hipervnculo"/>
@@ -880,7 +880,7 @@
               <w:rPr>
                 <w:noProof/>
               </w:rPr>
-              <w:instrText xml:space="preserve"> PAGEREF _Toc242203753 \h </w:instrText>
+              <w:instrText xml:space="preserve"> PAGEREF _Toc242205109 \h </w:instrText>
             </w:r>
             <w:r>
               <w:rPr>
@@ -897,7 +897,7 @@
               <w:rPr>
                 <w:noProof/>
               </w:rPr>
-              <w:t>14</w:t>
+              <w:t>16</w:t>
             </w:r>
             <w:r>
               <w:rPr>
@@ -922,7 +922,7 @@
               <w14:ligatures w14:val="standardContextual"/>
             </w:rPr>
           </w:pPr>
-          <w:hyperlink w:anchor="_Toc242203754" w:history="1">
+          <w:hyperlink w:anchor="_Toc242205110" w:history="1">
             <w:r>
               <w:rPr>
                 <w:rStyle w:val="Hipervnculo"/>
@@ -946,7 +946,7 @@
               <w:rPr>
                 <w:noProof/>
               </w:rPr>
-              <w:instrText xml:space="preserve"> PAGEREF _Toc242203754 \h </w:instrText>
+              <w:instrText xml:space="preserve"> PAGEREF _Toc242205110 \h </w:instrText>
             </w:r>
             <w:r>
               <w:rPr>
@@ -963,7 +963,7 @@
               <w:rPr>
                 <w:noProof/>
               </w:rPr>
-              <w:t>15</w:t>
+              <w:t>17</w:t>
             </w:r>
             <w:r>
               <w:rPr>
@@ -999,7 +999,7 @@
       <w:pPr>
         <w:pStyle w:val="Ttulo1"/>
       </w:pPr>
-      <w:bookmarkStart w:id="0" w:name="_Toc242203743"/>
+      <w:bookmarkStart w:id="0" w:name="_Toc242205099"/>
       <w:r>
         <w:lastRenderedPageBreak/>
         <w:t>1. Introducción</w:t>
@@ -1028,7 +1028,7 @@
       <w:pPr>
         <w:pStyle w:val="Ttulo1"/>
       </w:pPr>
-      <w:bookmarkStart w:id="1" w:name="_Toc242203744"/>
+      <w:bookmarkStart w:id="1" w:name="_Toc242205100"/>
       <w:r>
         <w:t>2. Descripción del conjunto de datos</w:t>
       </w:r>
@@ -1040,7 +1040,7 @@
         <w:jc w:val="both"/>
       </w:pPr>
       <w:r>
-        <w:t>Se utilizó el conjunto Online Retail, publicado en Kaggle con el archivo supermarket_data.csv. Contiene las líneas de venta de una tienda en línea con sede en Reino Unido que vende principalmente artículos de regalo y decoración, muchos de ellos a clientes mayoristas. Cada fila corresponde a un producto dentro de una factura, por lo que una factura con diez productos distintos ocupa diez filas.</w:t>
+        <w:t>Se utilizó el conjunto publicado en Kaggle como Supermarket Dataset (archivo supermarket_data.csv). Aunque el nombre sugiere un supermercado, su contenido es la hoja "Year 2010-2011" del conjunto Online Retail II de UCI (Chen, 2019), con las mismas columnas y las mismas 541,910 filas. Contiene las líneas de venta de una tienda en línea con sede en Reino Unido que vende principalmente artículos de regalo y decoración, muchos de ellos a clientes mayoristas. Cada fila corresponde a un producto dentro de una factura, por lo que una factura con diez productos distintos ocupa diez filas.</w:t>
       </w:r>
     </w:p>
     <w:p>
@@ -1224,7 +1224,7 @@
                 <w:sz w:val="19"/>
                 <w:szCs w:val="19"/>
               </w:rPr>
-              <w:t>Kaggle, conjunto Online Retail (archivo supermarket_data.csv)</w:t>
+              <w:t>Kaggle, Supermarket Dataset (archivo supermarket_data.csv); origen: Online Retail II, UCI</w:t>
             </w:r>
           </w:p>
         </w:tc>
@@ -1465,7 +1465,7 @@
                 <w:sz w:val="19"/>
                 <w:szCs w:val="19"/>
               </w:rPr>
-              <w:t>Productos distintos (StockCode)</w:t>
+              <w:t>Códigos de producto distintos (sin depurar)</w:t>
             </w:r>
           </w:p>
         </w:tc>
@@ -1525,6 +1525,7 @@
           </w:tcPr>
           <w:p>
             <w:pPr>
+              <w:keepNext/>
               <w:keepLines/>
             </w:pPr>
             <w:r>
@@ -1555,6 +1556,7 @@
           </w:tcPr>
           <w:p>
             <w:pPr>
+              <w:keepNext/>
               <w:keepLines/>
             </w:pPr>
             <w:r>
@@ -2454,6 +2456,7 @@
           </w:tcPr>
           <w:p>
             <w:pPr>
+              <w:keepNext/>
               <w:keepLines/>
             </w:pPr>
             <w:r>
@@ -2484,6 +2487,7 @@
           </w:tcPr>
           <w:p>
             <w:pPr>
+              <w:keepNext/>
               <w:keepLines/>
             </w:pPr>
             <w:r>
@@ -2514,6 +2518,7 @@
           </w:tcPr>
           <w:p>
             <w:pPr>
+              <w:keepNext/>
               <w:keepLines/>
             </w:pPr>
             <w:r>
@@ -2546,7 +2551,7 @@
       <w:pPr>
         <w:pStyle w:val="Ttulo1"/>
       </w:pPr>
-      <w:bookmarkStart w:id="2" w:name="_Toc242203745"/>
+      <w:bookmarkStart w:id="2" w:name="_Toc242205101"/>
       <w:r>
         <w:t>3. Limpieza de datos</w:t>
       </w:r>
@@ -3324,6 +3329,7 @@
           </w:tcPr>
           <w:p>
             <w:pPr>
+              <w:keepNext/>
               <w:keepLines/>
             </w:pPr>
             <w:r>
@@ -3354,6 +3360,7 @@
           </w:tcPr>
           <w:p>
             <w:pPr>
+              <w:keepNext/>
               <w:keepLines/>
               <w:jc w:val="right"/>
             </w:pPr>
@@ -5280,6 +5287,7 @@
           </w:tcPr>
           <w:p>
             <w:pPr>
+              <w:keepNext/>
               <w:keepLines/>
             </w:pPr>
           </w:p>
@@ -5303,6 +5311,7 @@
           </w:tcPr>
           <w:p>
             <w:pPr>
+              <w:keepNext/>
               <w:keepLines/>
             </w:pPr>
             <w:r>
@@ -5335,6 +5344,7 @@
           </w:tcPr>
           <w:p>
             <w:pPr>
+              <w:keepNext/>
               <w:keepLines/>
               <w:jc w:val="right"/>
             </w:pPr>
@@ -5368,6 +5378,7 @@
           </w:tcPr>
           <w:p>
             <w:pPr>
+              <w:keepNext/>
               <w:keepLines/>
               <w:jc w:val="right"/>
             </w:pPr>
@@ -5401,6 +5412,7 @@
           </w:tcPr>
           <w:p>
             <w:pPr>
+              <w:keepNext/>
               <w:keepLines/>
               <w:jc w:val="right"/>
             </w:pPr>
@@ -5434,9 +5446,18 @@
     </w:p>
     <w:p>
       <w:pPr>
+        <w:spacing w:after="160" w:line="300" w:lineRule="auto"/>
+        <w:jc w:val="both"/>
+      </w:pPr>
+      <w:r>
+        <w:t>Los conteos de la Tabla 4 son distintos a los de la Tabla 3 porque cada regla se aplica sobre las filas que dejaron las anteriores. Por ejemplo, muchas cantidades negativas ya habían salido con las facturas canceladas, y la regla 10 no elimina filas porque las descripciones vacías ya se habían eliminado antes. Se eliminan 5,270 duplicados y no 5,268 porque, al unificar los nombres de los productos, 2 líneas repetidas en la misma factura con el nombre escrito de otra forma quedaron como duplicados exactos.</w:t>
+      </w:r>
+    </w:p>
+    <w:p>
+      <w:pPr>
         <w:pStyle w:val="Ttulo2"/>
       </w:pPr>
-      <w:bookmarkStart w:id="3" w:name="_Toc242203746"/>
+      <w:bookmarkStart w:id="3" w:name="_Toc242205102"/>
       <w:r>
         <w:t>3.1 Justificación de las reglas</w:t>
       </w:r>
@@ -5541,6 +5562,7 @@
           <w:b/>
           <w:bCs/>
         </w:rPr>
+        <w:lastRenderedPageBreak/>
         <w:t xml:space="preserve">Cantidad o precio menor o igual a cero. </w:t>
       </w:r>
       <w:r>
@@ -5583,7 +5605,6 @@
           <w:b/>
           <w:bCs/>
         </w:rPr>
-        <w:lastRenderedPageBreak/>
         <w:t xml:space="preserve">Clientes sin identificador. </w:t>
       </w:r>
       <w:r>
@@ -5627,14 +5648,14 @@
         <w:t>519,231 líneas de venta</w:t>
       </w:r>
       <w:r>
-        <w:t xml:space="preserve"> (95.81 % del original), con 3,790 productos distintos, 19,627 facturas, 4,322 clientes registrados y 38 países. El ingreso total por venta de productos es de £9,798,951.95. Se agregó la columna Total, que es el importe de cada línea (Quantity × Price). Al final del proceso, el notebook comprueba que no queden duplicados, cancelaciones, cantidades o precios menores o iguales a cero, ni códigos de servicio. El conjunto limpio conserva 3,790 productos distintos, más de los 150 que pide el proyecto.</w:t>
+        <w:t xml:space="preserve"> (95.81 % del original), con 3,790 productos distintos, 19,627 facturas, 4,322 clientes registrados y 38 países. El ingreso total por venta de productos es de £9,798,951.95. Se agregó la columna Total, que es el importe de cada línea (Quantity × Price). Al final del proceso, el notebook comprueba que no queden duplicados, cancelaciones, cantidades o precios menores o iguales a cero, ni códigos de servicio. De los 4,070 códigos originales, 112 eran el mismo código escrito con minúsculas, 19 eran códigos de servicio o vales de regalo y 149 no tenían ninguna venta válida, por lo que quedan 3,790 productos, muchos más que los 150 que pide el proyecto.</w:t>
       </w:r>
     </w:p>
     <w:p>
       <w:pPr>
         <w:pStyle w:val="Ttulo1"/>
       </w:pPr>
-      <w:bookmarkStart w:id="4" w:name="_Toc242203747"/>
+      <w:bookmarkStart w:id="4" w:name="_Toc242205103"/>
       <w:r>
         <w:t>4. Análisis estadístico descriptivo</w:t>
       </w:r>
@@ -5646,7 +5667,7 @@
         <w:jc w:val="both"/>
       </w:pPr>
       <w:r>
-        <w:t>Se analizaron las tres variables numéricas de cada línea de venta: Quantity (unidades vendidas), Price (precio unitario en £) y Total (importe de la línea en £). La varianza y la desviación estándar se calcularon como muestrales, con divisor n - 1. Cada medida se calculó dos veces, con pandas y con NumPy/SciPy, y se verificó que ambos resultados coincidieran.</w:t>
+        <w:t>Se analizaron las tres variables numéricas de cada línea de venta: Quantity (unidades vendidas), Price (precio unitario en £) y Total (importe de la línea en £). La varianza y la desviación estándar se calcularon como muestrales, con divisor n - 1, porque los 13 meses son una muestra de la operación de la tienda; con 519,231 observaciones la diferencia con la versión poblacional es mínima. Cada medida se calculó dos veces, con pandas y con NumPy/SciPy, y se verificó que ambos resultados coincidieran.</w:t>
       </w:r>
     </w:p>
     <w:p>
@@ -7590,6 +7611,7 @@
           </w:tcPr>
           <w:p>
             <w:pPr>
+              <w:keepNext/>
               <w:keepLines/>
             </w:pPr>
             <w:r>
@@ -7620,6 +7642,7 @@
           </w:tcPr>
           <w:p>
             <w:pPr>
+              <w:keepNext/>
               <w:keepLines/>
               <w:jc w:val="right"/>
             </w:pPr>
@@ -7651,6 +7674,7 @@
           </w:tcPr>
           <w:p>
             <w:pPr>
+              <w:keepNext/>
               <w:keepLines/>
               <w:jc w:val="right"/>
             </w:pPr>
@@ -7682,6 +7706,7 @@
           </w:tcPr>
           <w:p>
             <w:pPr>
+              <w:keepNext/>
               <w:keepLines/>
               <w:jc w:val="right"/>
             </w:pPr>
@@ -7715,7 +7740,7 @@
       <w:pPr>
         <w:pStyle w:val="Ttulo2"/>
       </w:pPr>
-      <w:bookmarkStart w:id="5" w:name="_Toc242203748"/>
+      <w:bookmarkStart w:id="5" w:name="_Toc242205104"/>
       <w:r>
         <w:t>4.1 Tendencia central</w:t>
       </w:r>
@@ -7748,7 +7773,7 @@
         <w:t xml:space="preserve">Quantity. </w:t>
       </w:r>
       <w:r>
-        <w:t>La cantidad más frecuente es 1 unidad (141,912 líneas), la mitad de las líneas tiene 4 unidades o menos y el promedio es de 10.25 unidades. El 86.6 % de las líneas tiene 12 unidades o menos.</w:t>
+        <w:t>La cantidad más frecuente es 1 unidad (141,912 líneas), la mitad de las líneas tiene 4 unidades o menos y el promedio es de 10.25 unidades. El 86.6 % de las líneas tiene 12 unidades o menos.</w:t>
       </w:r>
     </w:p>
     <w:p>
@@ -7769,7 +7794,7 @@
         <w:t xml:space="preserve">Price. </w:t>
       </w:r>
       <w:r>
-        <w:t>El precio más frecuente es £1.25 (48,678 líneas), la mediana es £2.08 y la media £3.26. El 84.2 % de las líneas tiene un precio de £5 o menos.</w:t>
+        <w:t>El precio más frecuente es £1.25 (48,678 líneas), la mediana es £2.08 y la media £3.26. El 84.2 % de las líneas tiene un precio de £5 o menos.</w:t>
       </w:r>
     </w:p>
     <w:p>
@@ -7797,7 +7822,7 @@
       <w:pPr>
         <w:pStyle w:val="Ttulo2"/>
       </w:pPr>
-      <w:bookmarkStart w:id="6" w:name="_Toc242203749"/>
+      <w:bookmarkStart w:id="6" w:name="_Toc242205105"/>
       <w:r>
         <w:t>4.2 Dispersión</w:t>
       </w:r>
@@ -7809,7 +7834,7 @@
         <w:jc w:val="both"/>
       </w:pPr>
       <w:r>
-        <w:t>El coeficiente de variación de Quantity (360.37 %) y de Total (334.36 %) supera por mucho el 100 %, lo que indica que los datos están muy dispersos respecto a la media. La desviación estándar de Quantity es de 36.95 unidades, mientras que el rango intercuartílico es de solo 10 unidades: el 50 % central de las líneas está entre 1 y 11 unidades, y la desviación estándar está inflada por los pedidos de mayoreo. Price es la variable menos dispersa, con un coeficiente de variación de 128.75 % y un IQR de £2.88.</w:t>
+        <w:t>El coeficiente de variación de Quantity (360.37 %) y de Total (334.36 %) supera por mucho el 100 %, lo que indica que los datos están muy dispersos respecto a la media. La desviación estándar de Quantity es de 36.95 unidades, mientras que el rango intercuartílico es de solo 10 unidades: el 50 % central de las líneas está entre 1 y 11 unidades, y la desviación estándar está inflada por los pedidos de mayoreo. Price es la variable menos dispersa, con un coeficiente de variación de 128.75 % y un IQR de £2.88.</w:t>
       </w:r>
     </w:p>
     <w:p>
@@ -7862,12 +7887,13 @@
         <w:tblLook w:val="04A0" w:firstRow="1" w:lastRow="0" w:firstColumn="1" w:lastColumn="0" w:noHBand="0" w:noVBand="1"/>
       </w:tblPr>
       <w:tblGrid>
-        <w:gridCol w:w="1360"/>
-        <w:gridCol w:w="1200"/>
-        <w:gridCol w:w="1800"/>
-        <w:gridCol w:w="1600"/>
-        <w:gridCol w:w="1800"/>
-        <w:gridCol w:w="1600"/>
+        <w:gridCol w:w="1160"/>
+        <w:gridCol w:w="1000"/>
+        <w:gridCol w:w="1500"/>
+        <w:gridCol w:w="1400"/>
+        <w:gridCol w:w="1400"/>
+        <w:gridCol w:w="1500"/>
+        <w:gridCol w:w="1400"/>
       </w:tblGrid>
       <w:tr>
         <w:trPr>
@@ -7876,7 +7902,7 @@
         </w:trPr>
         <w:tc>
           <w:tcPr>
-            <w:tcW w:w="1360" w:type="dxa"/>
+            <w:tcW w:w="1160" w:type="dxa"/>
             <w:tcBorders>
               <w:top w:val="single" w:sz="4" w:space="0" w:color="000000"/>
               <w:left w:val="single" w:sz="4" w:space="0" w:color="000000"/>
@@ -7910,7 +7936,7 @@
         </w:tc>
         <w:tc>
           <w:tcPr>
-            <w:tcW w:w="1200" w:type="dxa"/>
+            <w:tcW w:w="1000" w:type="dxa"/>
             <w:tcBorders>
               <w:top w:val="single" w:sz="4" w:space="0" w:color="000000"/>
               <w:left w:val="single" w:sz="4" w:space="0" w:color="000000"/>
@@ -7944,7 +7970,7 @@
         </w:tc>
         <w:tc>
           <w:tcPr>
-            <w:tcW w:w="1800" w:type="dxa"/>
+            <w:tcW w:w="1500" w:type="dxa"/>
             <w:tcBorders>
               <w:top w:val="single" w:sz="4" w:space="0" w:color="000000"/>
               <w:left w:val="single" w:sz="4" w:space="0" w:color="000000"/>
@@ -7978,7 +8004,7 @@
         </w:tc>
         <w:tc>
           <w:tcPr>
-            <w:tcW w:w="1600" w:type="dxa"/>
+            <w:tcW w:w="1400" w:type="dxa"/>
             <w:tcBorders>
               <w:top w:val="single" w:sz="4" w:space="0" w:color="000000"/>
               <w:left w:val="single" w:sz="4" w:space="0" w:color="000000"/>
@@ -8006,13 +8032,13 @@
                 <w:sz w:val="19"/>
                 <w:szCs w:val="19"/>
               </w:rPr>
-              <w:t>Límite superior</w:t>
-            </w:r>
-          </w:p>
-        </w:tc>
-        <w:tc>
-          <w:tcPr>
-            <w:tcW w:w="1800" w:type="dxa"/>
+              <w:t>Límite inferior</w:t>
+            </w:r>
+          </w:p>
+        </w:tc>
+        <w:tc>
+          <w:tcPr>
+            <w:tcW w:w="1400" w:type="dxa"/>
             <w:tcBorders>
               <w:top w:val="single" w:sz="4" w:space="0" w:color="000000"/>
               <w:left w:val="single" w:sz="4" w:space="0" w:color="000000"/>
@@ -8040,13 +8066,47 @@
                 <w:sz w:val="19"/>
                 <w:szCs w:val="19"/>
               </w:rPr>
+              <w:t>Límite superior</w:t>
+            </w:r>
+          </w:p>
+        </w:tc>
+        <w:tc>
+          <w:tcPr>
+            <w:tcW w:w="1500" w:type="dxa"/>
+            <w:tcBorders>
+              <w:top w:val="single" w:sz="4" w:space="0" w:color="000000"/>
+              <w:left w:val="single" w:sz="4" w:space="0" w:color="000000"/>
+              <w:bottom w:val="single" w:sz="4" w:space="0" w:color="000000"/>
+              <w:right w:val="single" w:sz="4" w:space="0" w:color="000000"/>
+            </w:tcBorders>
+            <w:tcMar>
+              <w:top w:w="60" w:type="dxa"/>
+              <w:left w:w="100" w:type="dxa"/>
+              <w:bottom w:w="60" w:type="dxa"/>
+              <w:right w:w="100" w:type="dxa"/>
+            </w:tcMar>
+            <w:vAlign w:val="center"/>
+          </w:tcPr>
+          <w:p>
+            <w:pPr>
+              <w:keepNext/>
+              <w:keepLines/>
+              <w:jc w:val="center"/>
+            </w:pPr>
+            <w:r>
+              <w:rPr>
+                <w:b/>
+                <w:bCs/>
+                <w:sz w:val="19"/>
+                <w:szCs w:val="19"/>
+              </w:rPr>
               <w:t>Valores atípicos</w:t>
             </w:r>
           </w:p>
         </w:tc>
         <w:tc>
           <w:tcPr>
-            <w:tcW w:w="1600" w:type="dxa"/>
+            <w:tcW w:w="1400" w:type="dxa"/>
             <w:tcBorders>
               <w:top w:val="single" w:sz="4" w:space="0" w:color="000000"/>
               <w:left w:val="single" w:sz="4" w:space="0" w:color="000000"/>
@@ -8086,7 +8146,7 @@
         </w:trPr>
         <w:tc>
           <w:tcPr>
-            <w:tcW w:w="1360" w:type="dxa"/>
+            <w:tcW w:w="1160" w:type="dxa"/>
             <w:tcBorders>
               <w:top w:val="single" w:sz="4" w:space="0" w:color="000000"/>
               <w:left w:val="single" w:sz="4" w:space="0" w:color="000000"/>
@@ -8117,7 +8177,7 @@
         </w:tc>
         <w:tc>
           <w:tcPr>
-            <w:tcW w:w="1200" w:type="dxa"/>
+            <w:tcW w:w="1000" w:type="dxa"/>
             <w:tcBorders>
               <w:top w:val="single" w:sz="4" w:space="0" w:color="000000"/>
               <w:left w:val="single" w:sz="4" w:space="0" w:color="000000"/>
@@ -8149,7 +8209,7 @@
         </w:tc>
         <w:tc>
           <w:tcPr>
-            <w:tcW w:w="1800" w:type="dxa"/>
+            <w:tcW w:w="1500" w:type="dxa"/>
             <w:tcBorders>
               <w:top w:val="single" w:sz="4" w:space="0" w:color="000000"/>
               <w:left w:val="single" w:sz="4" w:space="0" w:color="000000"/>
@@ -8181,7 +8241,39 @@
         </w:tc>
         <w:tc>
           <w:tcPr>
-            <w:tcW w:w="1600" w:type="dxa"/>
+            <w:tcW w:w="1400" w:type="dxa"/>
+            <w:tcBorders>
+              <w:top w:val="single" w:sz="4" w:space="0" w:color="000000"/>
+              <w:left w:val="single" w:sz="4" w:space="0" w:color="000000"/>
+              <w:bottom w:val="single" w:sz="4" w:space="0" w:color="000000"/>
+              <w:right w:val="single" w:sz="4" w:space="0" w:color="000000"/>
+            </w:tcBorders>
+            <w:tcMar>
+              <w:top w:w="60" w:type="dxa"/>
+              <w:left w:w="100" w:type="dxa"/>
+              <w:bottom w:w="60" w:type="dxa"/>
+              <w:right w:w="100" w:type="dxa"/>
+            </w:tcMar>
+            <w:vAlign w:val="center"/>
+          </w:tcPr>
+          <w:p>
+            <w:pPr>
+              <w:keepNext/>
+              <w:keepLines/>
+              <w:jc w:val="right"/>
+            </w:pPr>
+            <w:r>
+              <w:rPr>
+                <w:sz w:val="19"/>
+                <w:szCs w:val="19"/>
+              </w:rPr>
+              <w:t>-14.00</w:t>
+            </w:r>
+          </w:p>
+        </w:tc>
+        <w:tc>
+          <w:tcPr>
+            <w:tcW w:w="1400" w:type="dxa"/>
             <w:tcBorders>
               <w:top w:val="single" w:sz="4" w:space="0" w:color="000000"/>
               <w:left w:val="single" w:sz="4" w:space="0" w:color="000000"/>
@@ -8213,7 +8305,7 @@
         </w:tc>
         <w:tc>
           <w:tcPr>
-            <w:tcW w:w="1800" w:type="dxa"/>
+            <w:tcW w:w="1500" w:type="dxa"/>
             <w:tcBorders>
               <w:top w:val="single" w:sz="4" w:space="0" w:color="000000"/>
               <w:left w:val="single" w:sz="4" w:space="0" w:color="000000"/>
@@ -8245,7 +8337,7 @@
         </w:tc>
         <w:tc>
           <w:tcPr>
-            <w:tcW w:w="1600" w:type="dxa"/>
+            <w:tcW w:w="1400" w:type="dxa"/>
             <w:tcBorders>
               <w:top w:val="single" w:sz="4" w:space="0" w:color="000000"/>
               <w:left w:val="single" w:sz="4" w:space="0" w:color="000000"/>
@@ -8283,7 +8375,7 @@
         </w:trPr>
         <w:tc>
           <w:tcPr>
-            <w:tcW w:w="1360" w:type="dxa"/>
+            <w:tcW w:w="1160" w:type="dxa"/>
             <w:tcBorders>
               <w:top w:val="single" w:sz="4" w:space="0" w:color="000000"/>
               <w:left w:val="single" w:sz="4" w:space="0" w:color="000000"/>
@@ -8314,7 +8406,7 @@
         </w:tc>
         <w:tc>
           <w:tcPr>
-            <w:tcW w:w="1200" w:type="dxa"/>
+            <w:tcW w:w="1000" w:type="dxa"/>
             <w:tcBorders>
               <w:top w:val="single" w:sz="4" w:space="0" w:color="000000"/>
               <w:left w:val="single" w:sz="4" w:space="0" w:color="000000"/>
@@ -8346,7 +8438,7 @@
         </w:tc>
         <w:tc>
           <w:tcPr>
-            <w:tcW w:w="1800" w:type="dxa"/>
+            <w:tcW w:w="1500" w:type="dxa"/>
             <w:tcBorders>
               <w:top w:val="single" w:sz="4" w:space="0" w:color="000000"/>
               <w:left w:val="single" w:sz="4" w:space="0" w:color="000000"/>
@@ -8378,7 +8470,39 @@
         </w:tc>
         <w:tc>
           <w:tcPr>
-            <w:tcW w:w="1600" w:type="dxa"/>
+            <w:tcW w:w="1400" w:type="dxa"/>
+            <w:tcBorders>
+              <w:top w:val="single" w:sz="4" w:space="0" w:color="000000"/>
+              <w:left w:val="single" w:sz="4" w:space="0" w:color="000000"/>
+              <w:bottom w:val="single" w:sz="4" w:space="0" w:color="000000"/>
+              <w:right w:val="single" w:sz="4" w:space="0" w:color="000000"/>
+            </w:tcBorders>
+            <w:tcMar>
+              <w:top w:w="60" w:type="dxa"/>
+              <w:left w:w="100" w:type="dxa"/>
+              <w:bottom w:w="60" w:type="dxa"/>
+              <w:right w:w="100" w:type="dxa"/>
+            </w:tcMar>
+            <w:vAlign w:val="center"/>
+          </w:tcPr>
+          <w:p>
+            <w:pPr>
+              <w:keepNext/>
+              <w:keepLines/>
+              <w:jc w:val="right"/>
+            </w:pPr>
+            <w:r>
+              <w:rPr>
+                <w:sz w:val="19"/>
+                <w:szCs w:val="19"/>
+              </w:rPr>
+              <w:t>-3.07</w:t>
+            </w:r>
+          </w:p>
+        </w:tc>
+        <w:tc>
+          <w:tcPr>
+            <w:tcW w:w="1400" w:type="dxa"/>
             <w:tcBorders>
               <w:top w:val="single" w:sz="4" w:space="0" w:color="000000"/>
               <w:left w:val="single" w:sz="4" w:space="0" w:color="000000"/>
@@ -8410,7 +8534,7 @@
         </w:tc>
         <w:tc>
           <w:tcPr>
-            <w:tcW w:w="1800" w:type="dxa"/>
+            <w:tcW w:w="1500" w:type="dxa"/>
             <w:tcBorders>
               <w:top w:val="single" w:sz="4" w:space="0" w:color="000000"/>
               <w:left w:val="single" w:sz="4" w:space="0" w:color="000000"/>
@@ -8442,7 +8566,7 @@
         </w:tc>
         <w:tc>
           <w:tcPr>
-            <w:tcW w:w="1600" w:type="dxa"/>
+            <w:tcW w:w="1400" w:type="dxa"/>
             <w:tcBorders>
               <w:top w:val="single" w:sz="4" w:space="0" w:color="000000"/>
               <w:left w:val="single" w:sz="4" w:space="0" w:color="000000"/>
@@ -8480,23 +8604,24 @@
         </w:trPr>
         <w:tc>
           <w:tcPr>
-            <w:tcW w:w="1360" w:type="dxa"/>
-            <w:tcBorders>
-              <w:top w:val="single" w:sz="4" w:space="0" w:color="000000"/>
-              <w:left w:val="single" w:sz="4" w:space="0" w:color="000000"/>
-              <w:bottom w:val="single" w:sz="4" w:space="0" w:color="000000"/>
-              <w:right w:val="single" w:sz="4" w:space="0" w:color="000000"/>
-            </w:tcBorders>
-            <w:tcMar>
-              <w:top w:w="60" w:type="dxa"/>
-              <w:left w:w="100" w:type="dxa"/>
-              <w:bottom w:w="60" w:type="dxa"/>
-              <w:right w:w="100" w:type="dxa"/>
-            </w:tcMar>
-            <w:vAlign w:val="center"/>
-          </w:tcPr>
-          <w:p>
-            <w:pPr>
+            <w:tcW w:w="1160" w:type="dxa"/>
+            <w:tcBorders>
+              <w:top w:val="single" w:sz="4" w:space="0" w:color="000000"/>
+              <w:left w:val="single" w:sz="4" w:space="0" w:color="000000"/>
+              <w:bottom w:val="single" w:sz="4" w:space="0" w:color="000000"/>
+              <w:right w:val="single" w:sz="4" w:space="0" w:color="000000"/>
+            </w:tcBorders>
+            <w:tcMar>
+              <w:top w:w="60" w:type="dxa"/>
+              <w:left w:w="100" w:type="dxa"/>
+              <w:bottom w:w="60" w:type="dxa"/>
+              <w:right w:w="100" w:type="dxa"/>
+            </w:tcMar>
+            <w:vAlign w:val="center"/>
+          </w:tcPr>
+          <w:p>
+            <w:pPr>
+              <w:keepNext/>
               <w:keepLines/>
             </w:pPr>
             <w:r>
@@ -8510,23 +8635,24 @@
         </w:tc>
         <w:tc>
           <w:tcPr>
-            <w:tcW w:w="1200" w:type="dxa"/>
-            <w:tcBorders>
-              <w:top w:val="single" w:sz="4" w:space="0" w:color="000000"/>
-              <w:left w:val="single" w:sz="4" w:space="0" w:color="000000"/>
-              <w:bottom w:val="single" w:sz="4" w:space="0" w:color="000000"/>
-              <w:right w:val="single" w:sz="4" w:space="0" w:color="000000"/>
-            </w:tcBorders>
-            <w:tcMar>
-              <w:top w:w="60" w:type="dxa"/>
-              <w:left w:w="100" w:type="dxa"/>
-              <w:bottom w:w="60" w:type="dxa"/>
-              <w:right w:w="100" w:type="dxa"/>
-            </w:tcMar>
-            <w:vAlign w:val="center"/>
-          </w:tcPr>
-          <w:p>
-            <w:pPr>
+            <w:tcW w:w="1000" w:type="dxa"/>
+            <w:tcBorders>
+              <w:top w:val="single" w:sz="4" w:space="0" w:color="000000"/>
+              <w:left w:val="single" w:sz="4" w:space="0" w:color="000000"/>
+              <w:bottom w:val="single" w:sz="4" w:space="0" w:color="000000"/>
+              <w:right w:val="single" w:sz="4" w:space="0" w:color="000000"/>
+            </w:tcBorders>
+            <w:tcMar>
+              <w:top w:w="60" w:type="dxa"/>
+              <w:left w:w="100" w:type="dxa"/>
+              <w:bottom w:w="60" w:type="dxa"/>
+              <w:right w:w="100" w:type="dxa"/>
+            </w:tcMar>
+            <w:vAlign w:val="center"/>
+          </w:tcPr>
+          <w:p>
+            <w:pPr>
+              <w:keepNext/>
               <w:keepLines/>
               <w:jc w:val="right"/>
             </w:pPr>
@@ -8541,23 +8667,24 @@
         </w:tc>
         <w:tc>
           <w:tcPr>
-            <w:tcW w:w="1800" w:type="dxa"/>
-            <w:tcBorders>
-              <w:top w:val="single" w:sz="4" w:space="0" w:color="000000"/>
-              <w:left w:val="single" w:sz="4" w:space="0" w:color="000000"/>
-              <w:bottom w:val="single" w:sz="4" w:space="0" w:color="000000"/>
-              <w:right w:val="single" w:sz="4" w:space="0" w:color="000000"/>
-            </w:tcBorders>
-            <w:tcMar>
-              <w:top w:w="60" w:type="dxa"/>
-              <w:left w:w="100" w:type="dxa"/>
-              <w:bottom w:w="60" w:type="dxa"/>
-              <w:right w:w="100" w:type="dxa"/>
-            </w:tcMar>
-            <w:vAlign w:val="center"/>
-          </w:tcPr>
-          <w:p>
-            <w:pPr>
+            <w:tcW w:w="1500" w:type="dxa"/>
+            <w:tcBorders>
+              <w:top w:val="single" w:sz="4" w:space="0" w:color="000000"/>
+              <w:left w:val="single" w:sz="4" w:space="0" w:color="000000"/>
+              <w:bottom w:val="single" w:sz="4" w:space="0" w:color="000000"/>
+              <w:right w:val="single" w:sz="4" w:space="0" w:color="000000"/>
+            </w:tcBorders>
+            <w:tcMar>
+              <w:top w:w="60" w:type="dxa"/>
+              <w:left w:w="100" w:type="dxa"/>
+              <w:bottom w:w="60" w:type="dxa"/>
+              <w:right w:w="100" w:type="dxa"/>
+            </w:tcMar>
+            <w:vAlign w:val="center"/>
+          </w:tcPr>
+          <w:p>
+            <w:pPr>
+              <w:keepNext/>
               <w:keepLines/>
               <w:jc w:val="right"/>
             </w:pPr>
@@ -8572,23 +8699,56 @@
         </w:tc>
         <w:tc>
           <w:tcPr>
-            <w:tcW w:w="1600" w:type="dxa"/>
-            <w:tcBorders>
-              <w:top w:val="single" w:sz="4" w:space="0" w:color="000000"/>
-              <w:left w:val="single" w:sz="4" w:space="0" w:color="000000"/>
-              <w:bottom w:val="single" w:sz="4" w:space="0" w:color="000000"/>
-              <w:right w:val="single" w:sz="4" w:space="0" w:color="000000"/>
-            </w:tcBorders>
-            <w:tcMar>
-              <w:top w:w="60" w:type="dxa"/>
-              <w:left w:w="100" w:type="dxa"/>
-              <w:bottom w:w="60" w:type="dxa"/>
-              <w:right w:w="100" w:type="dxa"/>
-            </w:tcMar>
-            <w:vAlign w:val="center"/>
-          </w:tcPr>
-          <w:p>
-            <w:pPr>
+            <w:tcW w:w="1400" w:type="dxa"/>
+            <w:tcBorders>
+              <w:top w:val="single" w:sz="4" w:space="0" w:color="000000"/>
+              <w:left w:val="single" w:sz="4" w:space="0" w:color="000000"/>
+              <w:bottom w:val="single" w:sz="4" w:space="0" w:color="000000"/>
+              <w:right w:val="single" w:sz="4" w:space="0" w:color="000000"/>
+            </w:tcBorders>
+            <w:tcMar>
+              <w:top w:w="60" w:type="dxa"/>
+              <w:left w:w="100" w:type="dxa"/>
+              <w:bottom w:w="60" w:type="dxa"/>
+              <w:right w:w="100" w:type="dxa"/>
+            </w:tcMar>
+            <w:vAlign w:val="center"/>
+          </w:tcPr>
+          <w:p>
+            <w:pPr>
+              <w:keepNext/>
+              <w:keepLines/>
+              <w:jc w:val="right"/>
+            </w:pPr>
+            <w:r>
+              <w:rPr>
+                <w:sz w:val="19"/>
+                <w:szCs w:val="19"/>
+              </w:rPr>
+              <w:t>-16.80</w:t>
+            </w:r>
+          </w:p>
+        </w:tc>
+        <w:tc>
+          <w:tcPr>
+            <w:tcW w:w="1400" w:type="dxa"/>
+            <w:tcBorders>
+              <w:top w:val="single" w:sz="4" w:space="0" w:color="000000"/>
+              <w:left w:val="single" w:sz="4" w:space="0" w:color="000000"/>
+              <w:bottom w:val="single" w:sz="4" w:space="0" w:color="000000"/>
+              <w:right w:val="single" w:sz="4" w:space="0" w:color="000000"/>
+            </w:tcBorders>
+            <w:tcMar>
+              <w:top w:w="60" w:type="dxa"/>
+              <w:left w:w="100" w:type="dxa"/>
+              <w:bottom w:w="60" w:type="dxa"/>
+              <w:right w:w="100" w:type="dxa"/>
+            </w:tcMar>
+            <w:vAlign w:val="center"/>
+          </w:tcPr>
+          <w:p>
+            <w:pPr>
+              <w:keepNext/>
               <w:keepLines/>
               <w:jc w:val="right"/>
             </w:pPr>
@@ -8603,23 +8763,24 @@
         </w:tc>
         <w:tc>
           <w:tcPr>
-            <w:tcW w:w="1800" w:type="dxa"/>
-            <w:tcBorders>
-              <w:top w:val="single" w:sz="4" w:space="0" w:color="000000"/>
-              <w:left w:val="single" w:sz="4" w:space="0" w:color="000000"/>
-              <w:bottom w:val="single" w:sz="4" w:space="0" w:color="000000"/>
-              <w:right w:val="single" w:sz="4" w:space="0" w:color="000000"/>
-            </w:tcBorders>
-            <w:tcMar>
-              <w:top w:w="60" w:type="dxa"/>
-              <w:left w:w="100" w:type="dxa"/>
-              <w:bottom w:w="60" w:type="dxa"/>
-              <w:right w:w="100" w:type="dxa"/>
-            </w:tcMar>
-            <w:vAlign w:val="center"/>
-          </w:tcPr>
-          <w:p>
-            <w:pPr>
+            <w:tcW w:w="1500" w:type="dxa"/>
+            <w:tcBorders>
+              <w:top w:val="single" w:sz="4" w:space="0" w:color="000000"/>
+              <w:left w:val="single" w:sz="4" w:space="0" w:color="000000"/>
+              <w:bottom w:val="single" w:sz="4" w:space="0" w:color="000000"/>
+              <w:right w:val="single" w:sz="4" w:space="0" w:color="000000"/>
+            </w:tcBorders>
+            <w:tcMar>
+              <w:top w:w="60" w:type="dxa"/>
+              <w:left w:w="100" w:type="dxa"/>
+              <w:bottom w:w="60" w:type="dxa"/>
+              <w:right w:w="100" w:type="dxa"/>
+            </w:tcMar>
+            <w:vAlign w:val="center"/>
+          </w:tcPr>
+          <w:p>
+            <w:pPr>
+              <w:keepNext/>
               <w:keepLines/>
               <w:jc w:val="right"/>
             </w:pPr>
@@ -8634,23 +8795,24 @@
         </w:tc>
         <w:tc>
           <w:tcPr>
-            <w:tcW w:w="1600" w:type="dxa"/>
-            <w:tcBorders>
-              <w:top w:val="single" w:sz="4" w:space="0" w:color="000000"/>
-              <w:left w:val="single" w:sz="4" w:space="0" w:color="000000"/>
-              <w:bottom w:val="single" w:sz="4" w:space="0" w:color="000000"/>
-              <w:right w:val="single" w:sz="4" w:space="0" w:color="000000"/>
-            </w:tcBorders>
-            <w:tcMar>
-              <w:top w:w="60" w:type="dxa"/>
-              <w:left w:w="100" w:type="dxa"/>
-              <w:bottom w:w="60" w:type="dxa"/>
-              <w:right w:w="100" w:type="dxa"/>
-            </w:tcMar>
-            <w:vAlign w:val="center"/>
-          </w:tcPr>
-          <w:p>
-            <w:pPr>
+            <w:tcW w:w="1400" w:type="dxa"/>
+            <w:tcBorders>
+              <w:top w:val="single" w:sz="4" w:space="0" w:color="000000"/>
+              <w:left w:val="single" w:sz="4" w:space="0" w:color="000000"/>
+              <w:bottom w:val="single" w:sz="4" w:space="0" w:color="000000"/>
+              <w:right w:val="single" w:sz="4" w:space="0" w:color="000000"/>
+            </w:tcBorders>
+            <w:tcMar>
+              <w:top w:w="60" w:type="dxa"/>
+              <w:left w:w="100" w:type="dxa"/>
+              <w:bottom w:w="60" w:type="dxa"/>
+              <w:right w:w="100" w:type="dxa"/>
+            </w:tcMar>
+            <w:vAlign w:val="center"/>
+          </w:tcPr>
+          <w:p>
+            <w:pPr>
+              <w:keepNext/>
               <w:keepLines/>
               <w:jc w:val="right"/>
             </w:pPr>
@@ -8686,14 +8848,14 @@
         <w:jc w:val="both"/>
       </w:pPr>
       <w:r>
-        <w:t>Entre el 5.14 % y el 7.80 % de las líneas son atípicas. No se eliminaron porque corresponden a pedidos de mayoreo y a productos de precio alto que existen en el negocio, no a errores de captura.</w:t>
+        <w:t>Según la variable, entre el 5.14 % (Quantity) y el 7.80 % (Total) de las líneas son atípicas. No se eliminaron porque corresponden a pedidos de mayoreo y a productos de precio alto que existen en el negocio; en los valores más grandes que se revisaron no se encontraron errores de captura.</w:t>
       </w:r>
     </w:p>
     <w:p>
       <w:pPr>
         <w:pStyle w:val="Ttulo2"/>
       </w:pPr>
-      <w:bookmarkStart w:id="7" w:name="_Toc242203750"/>
+      <w:bookmarkStart w:id="7" w:name="_Toc242205106"/>
       <w:r>
         <w:t>4.3 Covarianza y correlación</w:t>
       </w:r>
@@ -8705,7 +8867,17 @@
         <w:jc w:val="both"/>
       </w:pPr>
       <w:r>
-        <w:t>La covarianza indica si dos variables se mueven en la misma dirección, pero su magnitud depende de las unidades de cada variable. La correlación de Pearson la estandariza entre ‑1 y 1. Como las variables están muy sesgadas, también se calculó la correlación de Spearman, que trabaja con los rangos de los datos y es mucho menos sensible a los valores extremos.</w:t>
+        <w:t>La covarianza indica si dos variables se mueven en la misma dirección, pero su magnitud depende de las unidades de cada variable. La correlación de Pearson la estandariza entre</w:t>
+      </w:r>
+      <w:r>
+        <w:t xml:space="preserve"> </w:t>
+      </w:r>
+      <w:r>
+        <w:noBreakHyphen/>
+        <w:t>1</w:t>
+      </w:r>
+      <w:r>
+        <w:t xml:space="preserve"> y 1. Como las variables están muy sesgadas, también se calculó la correlación de Spearman, que trabaja con los rangos de los datos y es mucho menos sensible a los valores extremos.</w:t>
       </w:r>
     </w:p>
     <w:p>
@@ -9177,6 +9349,7 @@
           </w:tcPr>
           <w:p>
             <w:pPr>
+              <w:keepNext/>
               <w:keepLines/>
             </w:pPr>
             <w:r>
@@ -9207,6 +9380,7 @@
           </w:tcPr>
           <w:p>
             <w:pPr>
+              <w:keepNext/>
               <w:keepLines/>
               <w:jc w:val="right"/>
             </w:pPr>
@@ -9238,6 +9412,7 @@
           </w:tcPr>
           <w:p>
             <w:pPr>
+              <w:keepNext/>
               <w:keepLines/>
               <w:jc w:val="right"/>
             </w:pPr>
@@ -9269,6 +9444,7 @@
           </w:tcPr>
           <w:p>
             <w:pPr>
+              <w:keepNext/>
               <w:keepLines/>
               <w:jc w:val="right"/>
             </w:pPr>
@@ -9776,6 +9952,7 @@
           </w:tcPr>
           <w:p>
             <w:pPr>
+              <w:keepNext/>
               <w:keepLines/>
             </w:pPr>
             <w:r>
@@ -9806,6 +9983,7 @@
           </w:tcPr>
           <w:p>
             <w:pPr>
+              <w:keepNext/>
               <w:keepLines/>
               <w:jc w:val="right"/>
             </w:pPr>
@@ -9837,6 +10015,7 @@
           </w:tcPr>
           <w:p>
             <w:pPr>
+              <w:keepNext/>
               <w:keepLines/>
               <w:jc w:val="right"/>
             </w:pPr>
@@ -9868,6 +10047,7 @@
           </w:tcPr>
           <w:p>
             <w:pPr>
+              <w:keepNext/>
               <w:keepLines/>
               <w:jc w:val="right"/>
             </w:pPr>
@@ -9903,14 +10083,44 @@
         <w:jc w:val="both"/>
       </w:pPr>
       <w:r>
-        <w:t>Quantity y Total tienen covarianza positiva (1,518.04) y la correlación más alta (Pearson 0.651, Spearman 0.684): las líneas con más unidades generan más ingreso. Quantity y Price tienen covarianza negativa (‑14.55). Con Pearson la relación parece casi nula (‑0.094), pero con Spearman es moderada (‑0.406). La diferencia se debe a que la relación no es lineal y a los valores extremos, que afectan mucho más a Pearson que a Spearman. En la práctica, los productos baratos se compran en cantidades mayores por línea que los productos caros.</w:t>
+        <w:t xml:space="preserve">Quantity y Total tienen covarianza positiva (1,518.04) y la correlación más alta (Pearson 0.651, Spearman 0.684): las líneas con más unidades generan más ingreso. Quantity y Price tienen covarianza negativa </w:t>
+      </w:r>
+      <w:r>
+        <w:t>(</w:t>
+      </w:r>
+      <w:r>
+        <w:noBreakHyphen/>
+        <w:t>1</w:t>
+      </w:r>
+      <w:r>
+        <w:t xml:space="preserve">4.55). Con Pearson la relación parece casi nula </w:t>
+      </w:r>
+      <w:r>
+        <w:t>(</w:t>
+      </w:r>
+      <w:r>
+        <w:noBreakHyphen/>
+        <w:t>0</w:t>
+      </w:r>
+      <w:r>
+        <w:t xml:space="preserve">.094), pero con Spearman es moderada </w:t>
+      </w:r>
+      <w:r>
+        <w:t>(</w:t>
+      </w:r>
+      <w:r>
+        <w:noBreakHyphen/>
+        <w:t>0</w:t>
+      </w:r>
+      <w:r>
+        <w:t>.406). La diferencia se debe a que la relación no es lineal y a los valores extremos, que afectan mucho más a Pearson que a Spearman. En la práctica, los productos baratos se compran en cantidades mayores por línea que los productos caros.</w:t>
       </w:r>
     </w:p>
     <w:p>
       <w:pPr>
         <w:pStyle w:val="Ttulo2"/>
       </w:pPr>
-      <w:bookmarkStart w:id="8" w:name="_Toc242203751"/>
+      <w:bookmarkStart w:id="8" w:name="_Toc242205107"/>
       <w:r>
         <w:t>4.4 Análisis por producto</w:t>
       </w:r>
@@ -12152,6 +12362,7 @@
           </w:tcPr>
           <w:p>
             <w:pPr>
+              <w:keepNext/>
               <w:keepLines/>
             </w:pPr>
             <w:r>
@@ -12182,6 +12393,7 @@
           </w:tcPr>
           <w:p>
             <w:pPr>
+              <w:keepNext/>
               <w:keepLines/>
               <w:jc w:val="right"/>
             </w:pPr>
@@ -12213,6 +12425,7 @@
           </w:tcPr>
           <w:p>
             <w:pPr>
+              <w:keepNext/>
               <w:keepLines/>
               <w:jc w:val="right"/>
             </w:pPr>
@@ -12244,6 +12457,7 @@
           </w:tcPr>
           <w:p>
             <w:pPr>
+              <w:keepNext/>
               <w:keepLines/>
               <w:jc w:val="right"/>
             </w:pPr>
@@ -12275,6 +12489,7 @@
           </w:tcPr>
           <w:p>
             <w:pPr>
+              <w:keepNext/>
               <w:keepLines/>
               <w:jc w:val="right"/>
             </w:pPr>
@@ -12310,14 +12525,14 @@
         <w:jc w:val="both"/>
       </w:pPr>
       <w:r>
-        <w:t>Un producto típico vendió 404.5 unidades y generó £710.23 en el año (medianas), pero los promedios son 1,404.65 unidades y £2,585.48, de nuevo por la asimetría positiva. El ingreso está muy concentrado: 834 productos, el 22.0 % del catálogo, generan el 80 % del ingreso, mientras que la mitad de los productos con menor ingreso aporta solo el 4.3 %.</w:t>
+        <w:t>Un producto típico vendió 404.5 unidades y generó £710.23 en el periodo analizado (medianas), pero los promedios son 1,404.65 unidades y £2,585.48, de nuevo por la asimetría positiva. El ingreso está muy concentrado: 834 productos, el 22.0 % del catálogo, generan el 80 % del ingreso, mientras que la mitad de los productos con menor ingreso aporta solo el 4.3 %.</w:t>
       </w:r>
     </w:p>
     <w:p>
       <w:pPr>
         <w:pStyle w:val="Ttulo1"/>
       </w:pPr>
-      <w:bookmarkStart w:id="9" w:name="_Toc242203752"/>
+      <w:bookmarkStart w:id="9" w:name="_Toc242205108"/>
       <w:r>
         <w:t>5. Visualización de datos</w:t>
       </w:r>
@@ -12343,8 +12558,8 @@
           <w:noProof/>
         </w:rPr>
         <w:drawing>
-          <wp:inline distT="0" distB="0" distL="0" distR="0" wp14:anchorId="64184BBC" wp14:editId="131E6A87">
-            <wp:extent cx="5048250" cy="3038475"/>
+          <wp:inline distT="0" distB="0" distL="0" distR="0" wp14:anchorId="550BE50D" wp14:editId="445F0EDF">
+            <wp:extent cx="5715000" cy="3438525"/>
             <wp:effectExtent l="0" t="0" r="0" b="0"/>
             <wp:docPr id="1" name="fig01_histograma_quantity.png" descr="Histograma de frecuencias de las unidades por línea de venta" title="Histograma de frecuencias de las unidades por línea de venta"/>
             <wp:cNvGraphicFramePr>
@@ -12369,7 +12584,7 @@
                   <pic:spPr bwMode="auto">
                     <a:xfrm>
                       <a:off x="0" y="0"/>
-                      <a:ext cx="5048250" cy="3038475"/>
+                      <a:ext cx="5715000" cy="3438525"/>
                     </a:xfrm>
                     <a:prstGeom prst="rect">
                       <a:avLst/>
@@ -12410,7 +12625,7 @@
         <w:jc w:val="both"/>
       </w:pPr>
       <w:r>
-        <w:t>La barra más alta corresponde a 1 unidad y la frecuencia cae rápidamente conforme aumenta la cantidad. Se observan picos en 6, 12 y 24 unidades, que coinciden con presentaciones por paquete o por docena; el 19.6 % de las líneas son múltiplos de 12. Para que la forma sea visible se muestra el 99 % de las líneas, con cantidades de hasta 100 unidades.</w:t>
+        <w:t>La barra más alta corresponde a 1 unidad y la frecuencia cae rápidamente conforme aumenta la cantidad. Se observan picos en 6, 12 y 24 unidades, que coinciden con presentaciones por paquete o por docena; el 19.6 % de las líneas son múltiplos de 12. Para que la forma sea visible se muestra el 99 % de las líneas, con cantidades de hasta 100 unidades.</w:t>
       </w:r>
     </w:p>
     <w:p>
@@ -12424,8 +12639,8 @@
           <w:noProof/>
         </w:rPr>
         <w:drawing>
-          <wp:inline distT="0" distB="0" distL="0" distR="0" wp14:anchorId="10E980DB" wp14:editId="690113CB">
-            <wp:extent cx="5048250" cy="3171825"/>
+          <wp:inline distT="0" distB="0" distL="0" distR="0" wp14:anchorId="0DCA511D" wp14:editId="25967FAE">
+            <wp:extent cx="5715000" cy="3590925"/>
             <wp:effectExtent l="0" t="0" r="0" b="0"/>
             <wp:docPr id="2" name="fig02_densidad_price.png" descr="Histograma y curva de densidad del precio unitario" title="Histograma y curva de densidad del precio unitario"/>
             <wp:cNvGraphicFramePr>
@@ -12450,7 +12665,7 @@
                   <pic:spPr bwMode="auto">
                     <a:xfrm>
                       <a:off x="0" y="0"/>
-                      <a:ext cx="5048250" cy="3171825"/>
+                      <a:ext cx="5715000" cy="3590925"/>
                     </a:xfrm>
                     <a:prstGeom prst="rect">
                       <a:avLst/>
@@ -12505,8 +12720,8 @@
           <w:noProof/>
         </w:rPr>
         <w:drawing>
-          <wp:inline distT="0" distB="0" distL="0" distR="0" wp14:anchorId="69614276" wp14:editId="533FA266">
-            <wp:extent cx="5048250" cy="3181350"/>
+          <wp:inline distT="0" distB="0" distL="0" distR="0" wp14:anchorId="19AD0E41" wp14:editId="1F089780">
+            <wp:extent cx="5715000" cy="3600450"/>
             <wp:effectExtent l="0" t="0" r="0" b="0"/>
             <wp:docPr id="3" name="fig03_densidad_total.png" descr="Curva de densidad del importe por línea en escala logarítmica" title="Curva de densidad del importe por línea en escala logarítmica"/>
             <wp:cNvGraphicFramePr>
@@ -12531,7 +12746,7 @@
                   <pic:spPr bwMode="auto">
                     <a:xfrm>
                       <a:off x="0" y="0"/>
-                      <a:ext cx="5048250" cy="3181350"/>
+                      <a:ext cx="5715000" cy="3600450"/>
                     </a:xfrm>
                     <a:prstGeom prst="rect">
                       <a:avLst/>
@@ -12586,8 +12801,8 @@
           <w:noProof/>
         </w:rPr>
         <w:drawing>
-          <wp:inline distT="0" distB="0" distL="0" distR="0" wp14:anchorId="4B4614B8" wp14:editId="5A95C5BC">
-            <wp:extent cx="5048250" cy="3448050"/>
+          <wp:inline distT="0" distB="0" distL="0" distR="0" wp14:anchorId="27A8D2B5" wp14:editId="12A82EFE">
+            <wp:extent cx="5715000" cy="3905250"/>
             <wp:effectExtent l="0" t="0" r="0" b="0"/>
             <wp:docPr id="4" name="fig04_boxplots.png" descr="Diagramas de caja y bigotes de Quantity, Price y Total" title="Diagramas de caja y bigotes de Quantity, Price y Total"/>
             <wp:cNvGraphicFramePr>
@@ -12612,7 +12827,7 @@
                   <pic:spPr bwMode="auto">
                     <a:xfrm>
                       <a:off x="0" y="0"/>
-                      <a:ext cx="5048250" cy="3448050"/>
+                      <a:ext cx="5715000" cy="3905250"/>
                     </a:xfrm>
                     <a:prstGeom prst="rect">
                       <a:avLst/>
@@ -12667,8 +12882,8 @@
           <w:noProof/>
         </w:rPr>
         <w:drawing>
-          <wp:inline distT="0" distB="0" distL="0" distR="0" wp14:anchorId="3ECFB6E8" wp14:editId="41A8B48E">
-            <wp:extent cx="5048250" cy="3409950"/>
+          <wp:inline distT="0" distB="0" distL="0" distR="0" wp14:anchorId="591F7374" wp14:editId="269D1749">
+            <wp:extent cx="5715000" cy="3867150"/>
             <wp:effectExtent l="0" t="0" r="0" b="0"/>
             <wp:docPr id="5" name="fig05_dispersion_unidades_ingreso.png" descr="Gráfico de dispersión entre unidades vendidas e ingreso por producto" title="Gráfico de dispersión entre unidades vendidas e ingreso por producto"/>
             <wp:cNvGraphicFramePr>
@@ -12693,7 +12908,7 @@
                   <pic:spPr bwMode="auto">
                     <a:xfrm>
                       <a:off x="0" y="0"/>
-                      <a:ext cx="5048250" cy="3409950"/>
+                      <a:ext cx="5715000" cy="3867150"/>
                     </a:xfrm>
                     <a:prstGeom prst="rect">
                       <a:avLst/>
@@ -12748,8 +12963,8 @@
           <w:noProof/>
         </w:rPr>
         <w:drawing>
-          <wp:inline distT="0" distB="0" distL="0" distR="0" wp14:anchorId="00237000" wp14:editId="6A8C5D41">
-            <wp:extent cx="5048250" cy="2800350"/>
+          <wp:inline distT="0" distB="0" distL="0" distR="0" wp14:anchorId="739325CE" wp14:editId="6F1E4B51">
+            <wp:extent cx="5715000" cy="3171825"/>
             <wp:effectExtent l="0" t="0" r="0" b="0"/>
             <wp:docPr id="6" name="fig06_ingreso_mensual.png" descr="Ingreso mensual por venta de productos" title="Ingreso mensual por venta de productos"/>
             <wp:cNvGraphicFramePr>
@@ -12774,7 +12989,7 @@
                   <pic:spPr bwMode="auto">
                     <a:xfrm>
                       <a:off x="0" y="0"/>
-                      <a:ext cx="5048250" cy="2800350"/>
+                      <a:ext cx="5715000" cy="3171825"/>
                     </a:xfrm>
                     <a:prstGeom prst="rect">
                       <a:avLst/>
@@ -12829,8 +13044,8 @@
           <w:noProof/>
         </w:rPr>
         <w:drawing>
-          <wp:inline distT="0" distB="0" distL="0" distR="0" wp14:anchorId="25E27BBB" wp14:editId="7CB1731F">
-            <wp:extent cx="5048250" cy="2781300"/>
+          <wp:inline distT="0" distB="0" distL="0" distR="0" wp14:anchorId="783C4973" wp14:editId="3BDAB7B0">
+            <wp:extent cx="5715000" cy="3152775"/>
             <wp:effectExtent l="0" t="0" r="0" b="0"/>
             <wp:docPr id="7" name="fig07_top10_productos.png" descr="Diez productos con mayor ingreso" title="Diez productos con mayor ingreso"/>
             <wp:cNvGraphicFramePr>
@@ -12855,7 +13070,7 @@
                   <pic:spPr bwMode="auto">
                     <a:xfrm>
                       <a:off x="0" y="0"/>
-                      <a:ext cx="5048250" cy="2781300"/>
+                      <a:ext cx="5715000" cy="3152775"/>
                     </a:xfrm>
                     <a:prstGeom prst="rect">
                       <a:avLst/>
@@ -12896,7 +13111,7 @@
         <w:jc w:val="both"/>
       </w:pPr>
       <w:r>
-        <w:t>Los diez productos con mayor ingreso suman el 8.1 % del total. El primero, Regency Cakestand 3 Tier, generó £169,901, un 70 % más que el segundo, White Hanging Heart T-light Holder (£99,789).</w:t>
+        <w:t>Los diez productos con mayor ingreso suman el 8.1 % del total. El primero, Regency Cakestand 3 Tier, generó £169,901, un 70 % más que el segundo, White Hanging Heart T-light Holder (£99,789).</w:t>
       </w:r>
     </w:p>
     <w:p>
@@ -12910,8 +13125,8 @@
           <w:noProof/>
         </w:rPr>
         <w:drawing>
-          <wp:inline distT="0" distB="0" distL="0" distR="0" wp14:anchorId="3E9A6353" wp14:editId="43E132C1">
-            <wp:extent cx="5048250" cy="3238500"/>
+          <wp:inline distT="0" distB="0" distL="0" distR="0" wp14:anchorId="50C5BEF7" wp14:editId="4D3BF660">
+            <wp:extent cx="5715000" cy="3657600"/>
             <wp:effectExtent l="0" t="0" r="0" b="0"/>
             <wp:docPr id="8" name="fig08_ingreso_por_pais.png" descr="Diez países con mayor ingreso, sin contar al Reino Unido" title="Diez países con mayor ingreso, sin contar al Reino Unido"/>
             <wp:cNvGraphicFramePr>
@@ -12936,7 +13151,7 @@
                   <pic:spPr bwMode="auto">
                     <a:xfrm>
                       <a:off x="0" y="0"/>
-                      <a:ext cx="5048250" cy="3238500"/>
+                      <a:ext cx="5715000" cy="3657600"/>
                     </a:xfrm>
                     <a:prstGeom prst="rect">
                       <a:avLst/>
@@ -12977,7 +13192,7 @@
         <w:jc w:val="both"/>
       </w:pPr>
       <w:r>
-        <w:t>El Reino Unido concentra el 84.80 % del ingreso total, por lo que se omitió de la gráfica para poder comparar a los demás países. Le siguen Países Bajos (2.89 %), Irlanda (2.67 %), Alemania (2.06 %) y Francia (1.87 %). Los porcentajes se calcularon sobre el ingreso total.</w:t>
+        <w:t>El Reino Unido concentra el 84.80 % del ingreso total, por lo que se omitió de la gráfica para poder comparar a los demás países. Le siguen Países Bajos (2.89 %), Irlanda (2.67 %), Alemania (2.06 %) y Francia (1.87 %). Los porcentajes se calcularon sobre el ingreso total.</w:t>
       </w:r>
     </w:p>
     <w:p>
@@ -12991,8 +13206,8 @@
           <w:noProof/>
         </w:rPr>
         <w:drawing>
-          <wp:inline distT="0" distB="0" distL="0" distR="0" wp14:anchorId="3164FA85" wp14:editId="09EB8315">
-            <wp:extent cx="4286250" cy="3390900"/>
+          <wp:inline distT="0" distB="0" distL="0" distR="0" wp14:anchorId="1067A941" wp14:editId="73D4D70F">
+            <wp:extent cx="4762500" cy="3771900"/>
             <wp:effectExtent l="0" t="0" r="0" b="0"/>
             <wp:docPr id="9" name="fig09_correlacion_productos.png" descr="Mapa de calor de la correlación de Spearman entre variables de producto" title="Mapa de calor de la correlación de Spearman entre variables de producto"/>
             <wp:cNvGraphicFramePr>
@@ -13017,7 +13232,7 @@
                   <pic:spPr bwMode="auto">
                     <a:xfrm>
                       <a:off x="0" y="0"/>
-                      <a:ext cx="4286250" cy="3390900"/>
+                      <a:ext cx="4762500" cy="3771900"/>
                     </a:xfrm>
                     <a:prstGeom prst="rect">
                       <a:avLst/>
@@ -13058,7 +13273,17 @@
         <w:jc w:val="both"/>
       </w:pPr>
       <w:r>
-        <w:t>La correlación más alta es entre facturas e ingreso (0.925): el ingreso de un producto se relaciona sobre todo con cuántas veces se vende. El precio mediano casi no se relaciona con el ingreso (0.090) y tiene una correlación negativa con las unidades vendidas (‑0.364).</w:t>
+        <w:t xml:space="preserve">La correlación más alta es entre facturas e ingreso (0.925): el ingreso de un producto se relaciona sobre todo con cuántas veces se vende. El precio mediano casi no se relaciona con el ingreso (0.090) y tiene una correlación negativa con las unidades vendidas </w:t>
+      </w:r>
+      <w:r>
+        <w:t>(</w:t>
+      </w:r>
+      <w:r>
+        <w:noBreakHyphen/>
+        <w:t>0</w:t>
+      </w:r>
+      <w:r>
+        <w:t>.364).</w:t>
       </w:r>
     </w:p>
     <w:p>
@@ -13072,8 +13297,8 @@
           <w:noProof/>
         </w:rPr>
         <w:drawing>
-          <wp:inline distT="0" distB="0" distL="0" distR="0" wp14:anchorId="2B106A09" wp14:editId="2FC0B7F5">
-            <wp:extent cx="5048250" cy="3124200"/>
+          <wp:inline distT="0" distB="0" distL="0" distR="0" wp14:anchorId="474B6059" wp14:editId="31BC0096">
+            <wp:extent cx="5715000" cy="3533775"/>
             <wp:effectExtent l="0" t="0" r="0" b="0"/>
             <wp:docPr id="10" name="fig10_pareto_ingreso.png" descr="Curva de concentración del ingreso por producto" title="Curva de concentración del ingreso por producto"/>
             <wp:cNvGraphicFramePr>
@@ -13098,7 +13323,7 @@
                   <pic:spPr bwMode="auto">
                     <a:xfrm>
                       <a:off x="0" y="0"/>
-                      <a:ext cx="5048250" cy="3124200"/>
+                      <a:ext cx="5715000" cy="3533775"/>
                     </a:xfrm>
                     <a:prstGeom prst="rect">
                       <a:avLst/>
@@ -13139,14 +13364,14 @@
         <w:jc w:val="both"/>
       </w:pPr>
       <w:r>
-        <w:t>La curva sube muy rápido al inicio: 834 productos (22.0 %) generan el 80 % del ingreso, mientras que la mitad de los productos con menor ingreso aporta solo el 4.3 %. Es un comportamiento parecido a la regla de Pareto, en la que una parte pequeña del catálogo explica la mayor parte de las ventas.</w:t>
+        <w:t>La curva sube muy rápido al inicio: 834 productos (22.0 %) generan el 80 % del ingreso, mientras que la mitad de los productos con menor ingreso aporta solo el 4.3 %. Es un comportamiento parecido a la regla de Pareto, en la que una parte pequeña del catálogo explica la mayor parte de las ventas.</w:t>
       </w:r>
     </w:p>
     <w:p>
       <w:pPr>
         <w:pStyle w:val="Ttulo1"/>
       </w:pPr>
-      <w:bookmarkStart w:id="10" w:name="_Toc242203753"/>
+      <w:bookmarkStart w:id="10" w:name="_Toc242205109"/>
       <w:r>
         <w:t>6. Conclusiones</w:t>
       </w:r>
@@ -13177,7 +13402,7 @@
         <w:jc w:val="both"/>
       </w:pPr>
       <w:r>
-        <w:t>Los valores atípicos representan entre el 5.14 % y el 7.80 % de las líneas. Son pedidos de mayoreo y productos de precio alto que forman parte del negocio, y explican que la desviación estándar de Quantity (36.95) sea mucho mayor que su IQR (10).</w:t>
+        <w:t>Según la variable, los valores atípicos representan entre el 5.14 % (Quantity) y el 7.80 % (Total) de las líneas. Son pedidos de mayoreo y productos de precio alto que forman parte del negocio, y explican que la desviación estándar de Quantity (36.95) sea mucho mayor que su IQR (10).</w:t>
       </w:r>
     </w:p>
     <w:p>
@@ -13191,7 +13416,17 @@
         <w:jc w:val="both"/>
       </w:pPr>
       <w:r>
-        <w:t>El precio y la cantidad tienen una relación inversa moderada (Spearman ‑0.406): los productos baratos se compran en mayores cantidades. El importe de una línea depende más de la cantidad (Spearman 0.684) que del precio (0.329).</w:t>
+        <w:t>El precio y la cantidad tienen una relación inversa moderada (Spearman</w:t>
+      </w:r>
+      <w:r>
+        <w:t xml:space="preserve"> </w:t>
+      </w:r>
+      <w:r>
+        <w:noBreakHyphen/>
+        <w:t>0</w:t>
+      </w:r>
+      <w:r>
+        <w:t>.406): los productos baratos se compran en mayores cantidades. El importe de una línea depende más de la cantidad (Spearman 0.684) que del precio (0.329).</w:t>
       </w:r>
     </w:p>
     <w:p>
@@ -13205,7 +13440,7 @@
         <w:jc w:val="both"/>
       </w:pPr>
       <w:r>
-        <w:t>A nivel producto, el ingreso se relaciona con la frecuencia con que se vende cada artículo (Spearman entre facturas e ingreso de 0.925) y no de su precio (0.090). Como 834 productos generan el 80 % del ingreso, conviene priorizar su disponibilidad en el inventario.</w:t>
+        <w:t>A nivel producto, el ingreso se relaciona con la frecuencia con que se vende cada artículo (Spearman entre facturas e ingreso de 0.925) y no con su precio (0.090). Como 834 productos generan el 80 % del ingreso, conviene priorizar su disponibilidad en el inventario.</w:t>
       </w:r>
     </w:p>
     <w:p>
@@ -13233,7 +13468,7 @@
         <w:jc w:val="both"/>
       </w:pPr>
       <w:r>
-        <w:t>El negocio depende del mercado del Reino Unido, que aporta el 84.80 % del ingreso. Los principales mercados internacionales son Países Bajos, Irlanda, Alemania y Francia, que en conjunto suman 9.49 %.</w:t>
+        <w:t>El negocio depende del mercado del Reino Unido, que aporta el 84.80 % del ingreso. Los principales mercados internacionales son Países Bajos, Irlanda, Alemania y Francia, que en conjunto suman 9.49 %.</w:t>
       </w:r>
     </w:p>
     <w:p>
@@ -13254,7 +13489,7 @@
       <w:pPr>
         <w:pStyle w:val="Ttulo1"/>
       </w:pPr>
-      <w:bookmarkStart w:id="11" w:name="_Toc242203754"/>
+      <w:bookmarkStart w:id="11" w:name="_Toc242205110"/>
       <w:r>
         <w:t>Referencias</w:t>
       </w:r>
@@ -13266,7 +13501,7 @@
         <w:ind w:left="720" w:hanging="720"/>
       </w:pPr>
       <w:r>
-        <w:t>Badole, S. (s. f.). Supermarket data [Conjunto de datos]. Kaggle. https://www.kaggle.com/datasets/saurabhbadole/supermarket-data</w:t>
+        <w:t>Badole, S. (2024). Supermarket Dataset [Conjunto de datos]. Kaggle. https://www.kaggle.com/datasets/saurabhbadole/supermarket-data</w:t>
       </w:r>
     </w:p>
     <w:p>
@@ -13275,7 +13510,7 @@
         <w:ind w:left="720" w:hanging="720"/>
       </w:pPr>
       <w:r>
-        <w:t>Chen, D. (2015). Online Retail [Conjunto de datos]. UCI Machine Learning Repository. https://doi.org/10.24432/C5BW33</w:t>
+        <w:t>Chen, D. (2019). Online Retail II [Conjunto de datos]. UCI Machine Learning Repository. https://doi.org/10.24432/C5CG6D</w:t>
       </w:r>
     </w:p>
     <w:sectPr>
@@ -13382,118 +13617,10 @@
 <file path=word/numbering.xml><?xml version="1.0" encoding="utf-8"?>
 <w:numbering xmlns:wpc="http://schemas.microsoft.com/office/word/2010/wordprocessingCanvas" xmlns:cx="http://schemas.microsoft.com/office/drawing/2014/chartex" xmlns:cx1="http://schemas.microsoft.com/office/drawing/2015/9/8/chartex" xmlns:cx2="http://schemas.microsoft.com/office/drawing/2015/10/21/chartex" xmlns:cx3="http://schemas.microsoft.com/office/drawing/2016/5/9/chartex" xmlns:cx4="http://schemas.microsoft.com/office/drawing/2016/5/10/chartex" xmlns:cx5="http://schemas.microsoft.com/office/drawing/2016/5/11/chartex" xmlns:cx6="http://schemas.microsoft.com/office/drawing/2016/5/12/chartex" xmlns:cx7="http://schemas.microsoft.com/office/drawing/2016/5/13/chartex" xmlns:cx8="http://schemas.microsoft.com/office/drawing/2016/5/14/chartex" xmlns:mc="http://schemas.openxmlformats.org/markup-compatibility/2006" xmlns:aink="http://schemas.microsoft.com/office/drawing/2016/ink" xmlns:am3d="http://schemas.microsoft.com/office/drawing/2017/model3d" xmlns:o="urn:schemas-microsoft-com:office:office" xmlns:oel="http://schemas.microsoft.com/office/2019/extlst" xmlns:r="http://schemas.openxmlformats.org/officeDocument/2006/relationships" xmlns:m="http://schemas.openxmlformats.org/officeDocument/2006/math" xmlns:v="urn:schemas-microsoft-com:vml" xmlns:wp14="http://schemas.microsoft.com/office/word/2010/wordprocessingDrawing" xmlns:wp="http://schemas.openxmlformats.org/drawingml/2006/wordprocessingDrawing" xmlns:w10="urn:schemas-microsoft-com:office:word" xmlns:w="http://schemas.openxmlformats.org/wordprocessingml/2006/main" xmlns:w14="http://schemas.microsoft.com/office/word/2010/wordml" xmlns:w15="http://schemas.microsoft.com/office/word/2012/wordml" xmlns:w16cex="http://schemas.microsoft.com/office/word/2018/wordml/cex" xmlns:w16cid="http://schemas.microsoft.com/office/word/2016/wordml/cid" xmlns:w16="http://schemas.microsoft.com/office/word/2018/wordml" xmlns:w16du="http://schemas.microsoft.com/office/word/2023/wordml/word16du" xmlns:w16sdtdh="http://schemas.microsoft.com/office/word/2020/wordml/sdtdatahash" xmlns:w16sdtfl="http://schemas.microsoft.com/office/word/2024/wordml/sdtformatlock" xmlns:w16se="http://schemas.microsoft.com/office/word/2015/wordml/symex" xmlns:wpg="http://schemas.microsoft.com/office/word/2010/wordprocessingGroup" xmlns:wpi="http://schemas.microsoft.com/office/word/2010/wordprocessingInk" xmlns:wne="http://schemas.microsoft.com/office/word/2006/wordml" xmlns:wps="http://schemas.microsoft.com/office/word/2010/wordprocessingShape" mc:Ignorable="w14 w15 w16se w16cid w16 w16cex w16sdtdh w16sdtfl w16du wp14">
   <w:abstractNum w:abstractNumId="0" w15:restartNumberingAfterBreak="0">
-    <w:nsid w:val="1D796F5D"/>
+    <w:nsid w:val="3F487497"/>
     <w:multiLevelType w:val="hybridMultilevel"/>
-    <w:tmpl w:val="0DFE145C"/>
-    <w:lvl w:ilvl="0" w:tplc="96409668">
-      <w:start w:val="1"/>
-      <w:numFmt w:val="bullet"/>
-      <w:lvlText w:val="•"/>
-      <w:lvlJc w:val="left"/>
-      <w:pPr>
-        <w:ind w:left="720" w:hanging="360"/>
-      </w:pPr>
-    </w:lvl>
-    <w:lvl w:ilvl="1" w:tplc="A8A07904">
-      <w:numFmt w:val="decimal"/>
-      <w:lvlText w:val=""/>
-      <w:lvlJc w:val="left"/>
-    </w:lvl>
-    <w:lvl w:ilvl="2" w:tplc="F5462E54">
-      <w:numFmt w:val="decimal"/>
-      <w:lvlText w:val=""/>
-      <w:lvlJc w:val="left"/>
-    </w:lvl>
-    <w:lvl w:ilvl="3" w:tplc="CAD0216A">
-      <w:numFmt w:val="decimal"/>
-      <w:lvlText w:val=""/>
-      <w:lvlJc w:val="left"/>
-    </w:lvl>
-    <w:lvl w:ilvl="4" w:tplc="4232C496">
-      <w:numFmt w:val="decimal"/>
-      <w:lvlText w:val=""/>
-      <w:lvlJc w:val="left"/>
-    </w:lvl>
-    <w:lvl w:ilvl="5" w:tplc="5FC0CF4C">
-      <w:numFmt w:val="decimal"/>
-      <w:lvlText w:val=""/>
-      <w:lvlJc w:val="left"/>
-    </w:lvl>
-    <w:lvl w:ilvl="6" w:tplc="501E21AC">
-      <w:numFmt w:val="decimal"/>
-      <w:lvlText w:val=""/>
-      <w:lvlJc w:val="left"/>
-    </w:lvl>
-    <w:lvl w:ilvl="7" w:tplc="22C679C6">
-      <w:numFmt w:val="decimal"/>
-      <w:lvlText w:val=""/>
-      <w:lvlJc w:val="left"/>
-    </w:lvl>
-    <w:lvl w:ilvl="8" w:tplc="129C3C22">
-      <w:numFmt w:val="decimal"/>
-      <w:lvlText w:val=""/>
-      <w:lvlJc w:val="left"/>
-    </w:lvl>
-  </w:abstractNum>
-  <w:abstractNum w:abstractNumId="1" w15:restartNumberingAfterBreak="0">
-    <w:nsid w:val="36AB724D"/>
-    <w:multiLevelType w:val="hybridMultilevel"/>
-    <w:tmpl w:val="888CC9FE"/>
-    <w:lvl w:ilvl="0" w:tplc="A10A731C">
-      <w:start w:val="1"/>
-      <w:numFmt w:val="decimal"/>
-      <w:lvlText w:val="%1."/>
-      <w:lvlJc w:val="left"/>
-      <w:pPr>
-        <w:ind w:left="720" w:hanging="360"/>
-      </w:pPr>
-    </w:lvl>
-    <w:lvl w:ilvl="1" w:tplc="68E244F4">
-      <w:numFmt w:val="decimal"/>
-      <w:lvlText w:val=""/>
-      <w:lvlJc w:val="left"/>
-    </w:lvl>
-    <w:lvl w:ilvl="2" w:tplc="ABFC80F8">
-      <w:numFmt w:val="decimal"/>
-      <w:lvlText w:val=""/>
-      <w:lvlJc w:val="left"/>
-    </w:lvl>
-    <w:lvl w:ilvl="3" w:tplc="28826144">
-      <w:numFmt w:val="decimal"/>
-      <w:lvlText w:val=""/>
-      <w:lvlJc w:val="left"/>
-    </w:lvl>
-    <w:lvl w:ilvl="4" w:tplc="05C0FC84">
-      <w:numFmt w:val="decimal"/>
-      <w:lvlText w:val=""/>
-      <w:lvlJc w:val="left"/>
-    </w:lvl>
-    <w:lvl w:ilvl="5" w:tplc="18EC66CE">
-      <w:numFmt w:val="decimal"/>
-      <w:lvlText w:val=""/>
-      <w:lvlJc w:val="left"/>
-    </w:lvl>
-    <w:lvl w:ilvl="6" w:tplc="58400104">
-      <w:numFmt w:val="decimal"/>
-      <w:lvlText w:val=""/>
-      <w:lvlJc w:val="left"/>
-    </w:lvl>
-    <w:lvl w:ilvl="7" w:tplc="3C2CED56">
-      <w:numFmt w:val="decimal"/>
-      <w:lvlText w:val=""/>
-      <w:lvlJc w:val="left"/>
-    </w:lvl>
-    <w:lvl w:ilvl="8" w:tplc="99F0184E">
-      <w:numFmt w:val="decimal"/>
-      <w:lvlText w:val=""/>
-      <w:lvlJc w:val="left"/>
-    </w:lvl>
-  </w:abstractNum>
-  <w:abstractNum w:abstractNumId="2" w15:restartNumberingAfterBreak="0">
-    <w:nsid w:val="684B501F"/>
-    <w:multiLevelType w:val="hybridMultilevel"/>
-    <w:tmpl w:val="884C2F86"/>
-    <w:lvl w:ilvl="0" w:tplc="7B7EF396" w:tentative="1">
+    <w:tmpl w:val="081C972C"/>
+    <w:lvl w:ilvl="0" w:tplc="FD647FD6" w:tentative="1">
       <w:start w:val="1"/>
       <w:numFmt w:val="bullet"/>
       <w:lvlText w:val="●"/>
@@ -13502,7 +13629,7 @@
         <w:ind w:left="720" w:hanging="360"/>
       </w:pPr>
     </w:lvl>
-    <w:lvl w:ilvl="1" w:tplc="75EE89CE" w:tentative="1">
+    <w:lvl w:ilvl="1" w:tplc="A56CCD82" w:tentative="1">
       <w:start w:val="1"/>
       <w:numFmt w:val="bullet"/>
       <w:lvlText w:val="○"/>
@@ -13511,7 +13638,7 @@
         <w:ind w:left="1440" w:hanging="360"/>
       </w:pPr>
     </w:lvl>
-    <w:lvl w:ilvl="2" w:tplc="4462DC2A" w:tentative="1">
+    <w:lvl w:ilvl="2" w:tplc="AA5E700E" w:tentative="1">
       <w:start w:val="1"/>
       <w:numFmt w:val="bullet"/>
       <w:lvlText w:val="■"/>
@@ -13520,7 +13647,7 @@
         <w:ind w:left="2160" w:hanging="360"/>
       </w:pPr>
     </w:lvl>
-    <w:lvl w:ilvl="3" w:tplc="D196028E" w:tentative="1">
+    <w:lvl w:ilvl="3" w:tplc="51B034A4" w:tentative="1">
       <w:start w:val="1"/>
       <w:numFmt w:val="bullet"/>
       <w:lvlText w:val="●"/>
@@ -13529,7 +13656,7 @@
         <w:ind w:left="2880" w:hanging="360"/>
       </w:pPr>
     </w:lvl>
-    <w:lvl w:ilvl="4" w:tplc="44FCE930" w:tentative="1">
+    <w:lvl w:ilvl="4" w:tplc="E62CC564" w:tentative="1">
       <w:start w:val="1"/>
       <w:numFmt w:val="bullet"/>
       <w:lvlText w:val="○"/>
@@ -13538,7 +13665,7 @@
         <w:ind w:left="3600" w:hanging="360"/>
       </w:pPr>
     </w:lvl>
-    <w:lvl w:ilvl="5" w:tplc="9320BACC" w:tentative="1">
+    <w:lvl w:ilvl="5" w:tplc="15A81350" w:tentative="1">
       <w:start w:val="1"/>
       <w:numFmt w:val="bullet"/>
       <w:lvlText w:val="■"/>
@@ -13547,7 +13674,7 @@
         <w:ind w:left="4320" w:hanging="360"/>
       </w:pPr>
     </w:lvl>
-    <w:lvl w:ilvl="6" w:tplc="B8CABF38" w:tentative="1">
+    <w:lvl w:ilvl="6" w:tplc="27425EBA" w:tentative="1">
       <w:start w:val="1"/>
       <w:numFmt w:val="bullet"/>
       <w:lvlText w:val="●"/>
@@ -13556,7 +13683,7 @@
         <w:ind w:left="5040" w:hanging="360"/>
       </w:pPr>
     </w:lvl>
-    <w:lvl w:ilvl="7" w:tplc="69FEB3EA" w:tentative="1">
+    <w:lvl w:ilvl="7" w:tplc="89BEB0A6" w:tentative="1">
       <w:start w:val="1"/>
       <w:numFmt w:val="bullet"/>
       <w:lvlText w:val="●"/>
@@ -13565,7 +13692,7 @@
         <w:ind w:left="5760" w:hanging="360"/>
       </w:pPr>
     </w:lvl>
-    <w:lvl w:ilvl="8" w:tplc="91643E00" w:tentative="1">
+    <w:lvl w:ilvl="8" w:tplc="49EC606E" w:tentative="1">
       <w:start w:val="1"/>
       <w:numFmt w:val="bullet"/>
       <w:lvlText w:val="●"/>
@@ -13575,19 +13702,127 @@
       </w:pPr>
     </w:lvl>
   </w:abstractNum>
-  <w:num w:numId="1" w16cid:durableId="1752312585">
+  <w:abstractNum w:abstractNumId="1" w15:restartNumberingAfterBreak="0">
+    <w:nsid w:val="68821460"/>
+    <w:multiLevelType w:val="hybridMultilevel"/>
+    <w:tmpl w:val="A2D8C374"/>
+    <w:lvl w:ilvl="0" w:tplc="ACFCEB62">
+      <w:start w:val="1"/>
+      <w:numFmt w:val="decimal"/>
+      <w:lvlText w:val="%1."/>
+      <w:lvlJc w:val="left"/>
+      <w:pPr>
+        <w:ind w:left="720" w:hanging="360"/>
+      </w:pPr>
+    </w:lvl>
+    <w:lvl w:ilvl="1" w:tplc="A84C1E38">
+      <w:numFmt w:val="decimal"/>
+      <w:lvlText w:val=""/>
+      <w:lvlJc w:val="left"/>
+    </w:lvl>
+    <w:lvl w:ilvl="2" w:tplc="A2E82CA0">
+      <w:numFmt w:val="decimal"/>
+      <w:lvlText w:val=""/>
+      <w:lvlJc w:val="left"/>
+    </w:lvl>
+    <w:lvl w:ilvl="3" w:tplc="49F251A6">
+      <w:numFmt w:val="decimal"/>
+      <w:lvlText w:val=""/>
+      <w:lvlJc w:val="left"/>
+    </w:lvl>
+    <w:lvl w:ilvl="4" w:tplc="CBBA2BA0">
+      <w:numFmt w:val="decimal"/>
+      <w:lvlText w:val=""/>
+      <w:lvlJc w:val="left"/>
+    </w:lvl>
+    <w:lvl w:ilvl="5" w:tplc="083C55A0">
+      <w:numFmt w:val="decimal"/>
+      <w:lvlText w:val=""/>
+      <w:lvlJc w:val="left"/>
+    </w:lvl>
+    <w:lvl w:ilvl="6" w:tplc="65B8B9D2">
+      <w:numFmt w:val="decimal"/>
+      <w:lvlText w:val=""/>
+      <w:lvlJc w:val="left"/>
+    </w:lvl>
+    <w:lvl w:ilvl="7" w:tplc="62DADBC8">
+      <w:numFmt w:val="decimal"/>
+      <w:lvlText w:val=""/>
+      <w:lvlJc w:val="left"/>
+    </w:lvl>
+    <w:lvl w:ilvl="8" w:tplc="40765554">
+      <w:numFmt w:val="decimal"/>
+      <w:lvlText w:val=""/>
+      <w:lvlJc w:val="left"/>
+    </w:lvl>
+  </w:abstractNum>
+  <w:abstractNum w:abstractNumId="2" w15:restartNumberingAfterBreak="0">
+    <w:nsid w:val="7FD85599"/>
+    <w:multiLevelType w:val="hybridMultilevel"/>
+    <w:tmpl w:val="0E7E3A58"/>
+    <w:lvl w:ilvl="0" w:tplc="A32A318E">
+      <w:start w:val="1"/>
+      <w:numFmt w:val="bullet"/>
+      <w:lvlText w:val="•"/>
+      <w:lvlJc w:val="left"/>
+      <w:pPr>
+        <w:ind w:left="720" w:hanging="360"/>
+      </w:pPr>
+    </w:lvl>
+    <w:lvl w:ilvl="1" w:tplc="9AF4F766">
+      <w:numFmt w:val="decimal"/>
+      <w:lvlText w:val=""/>
+      <w:lvlJc w:val="left"/>
+    </w:lvl>
+    <w:lvl w:ilvl="2" w:tplc="C658A898">
+      <w:numFmt w:val="decimal"/>
+      <w:lvlText w:val=""/>
+      <w:lvlJc w:val="left"/>
+    </w:lvl>
+    <w:lvl w:ilvl="3" w:tplc="3B28D24E">
+      <w:numFmt w:val="decimal"/>
+      <w:lvlText w:val=""/>
+      <w:lvlJc w:val="left"/>
+    </w:lvl>
+    <w:lvl w:ilvl="4" w:tplc="85244170">
+      <w:numFmt w:val="decimal"/>
+      <w:lvlText w:val=""/>
+      <w:lvlJc w:val="left"/>
+    </w:lvl>
+    <w:lvl w:ilvl="5" w:tplc="C82E1576">
+      <w:numFmt w:val="decimal"/>
+      <w:lvlText w:val=""/>
+      <w:lvlJc w:val="left"/>
+    </w:lvl>
+    <w:lvl w:ilvl="6" w:tplc="AE1ABD5E">
+      <w:numFmt w:val="decimal"/>
+      <w:lvlText w:val=""/>
+      <w:lvlJc w:val="left"/>
+    </w:lvl>
+    <w:lvl w:ilvl="7" w:tplc="5EB0E4AA">
+      <w:numFmt w:val="decimal"/>
+      <w:lvlText w:val=""/>
+      <w:lvlJc w:val="left"/>
+    </w:lvl>
+    <w:lvl w:ilvl="8" w:tplc="D3BA142A">
+      <w:numFmt w:val="decimal"/>
+      <w:lvlText w:val=""/>
+      <w:lvlJc w:val="left"/>
+    </w:lvl>
+  </w:abstractNum>
+  <w:num w:numId="1" w16cid:durableId="997076014">
+    <w:abstractNumId w:val="0"/>
+    <w:lvlOverride w:ilvl="0">
+      <w:startOverride w:val="1"/>
+    </w:lvlOverride>
+  </w:num>
+  <w:num w:numId="2" w16cid:durableId="1966813839">
     <w:abstractNumId w:val="2"/>
     <w:lvlOverride w:ilvl="0">
       <w:startOverride w:val="1"/>
     </w:lvlOverride>
   </w:num>
-  <w:num w:numId="2" w16cid:durableId="512762122">
-    <w:abstractNumId w:val="0"/>
-    <w:lvlOverride w:ilvl="0">
-      <w:startOverride w:val="1"/>
-    </w:lvlOverride>
-  </w:num>
-  <w:num w:numId="3" w16cid:durableId="443691828">
+  <w:num w:numId="3" w16cid:durableId="260456301">
     <w:abstractNumId w:val="1"/>
     <w:lvlOverride w:ilvl="0">
       <w:startOverride w:val="1"/>
@@ -14227,7 +14462,7 @@
     <w:autoRedefine/>
     <w:uiPriority w:val="39"/>
     <w:unhideWhenUsed/>
-    <w:rsid w:val="00EC4E2F"/>
+    <w:rsid w:val="00F74699"/>
     <w:pPr>
       <w:spacing w:after="100"/>
     </w:pPr>
@@ -14239,7 +14474,7 @@
     <w:autoRedefine/>
     <w:uiPriority w:val="39"/>
     <w:unhideWhenUsed/>
-    <w:rsid w:val="00EC4E2F"/>
+    <w:rsid w:val="00F74699"/>
     <w:pPr>
       <w:spacing w:after="100"/>
       <w:ind w:left="220"/>

</xml_diff>

<commit_message>
Ajustes finales en capturas, notebook y documento
Se parte una línea larga que salía cortada en la captura 22, la celda de estilo muestra un mensaje al ejecutarse y se aclara la conclusión sobre el importe por línea. Se actualiza el nombre del conjunto de datos en las portadas.
</commit_message>
<xml_diff>
--- a/deliverables/Equipo2_Inventario_Resultados.docx
+++ b/deliverables/Equipo2_Inventario_Resultados.docx
@@ -62,7 +62,7 @@
           <w:sz w:val="24"/>
           <w:szCs w:val="24"/>
         </w:rPr>
-        <w:t>Conjunto de datos: Online Retail (Kaggle)</w:t>
+        <w:t>Conjunto de datos: Online Retail II (UCI), publicado en Kaggle</w:t>
       </w:r>
     </w:p>
     <w:p>
@@ -161,14 +161,13 @@
           <w:sz w:val="32"/>
           <w:szCs w:val="32"/>
         </w:rPr>
-        <w:lastRenderedPageBreak/>
         <w:t>Índice</w:t>
       </w:r>
     </w:p>
     <w:sdt>
       <w:sdtPr>
         <w:alias w:val="Índice"/>
-        <w:id w:val="-7910726"/>
+        <w:id w:val="-2132780299"/>
       </w:sdtPr>
       <w:sdtEndPr/>
       <w:sdtContent>
@@ -196,7 +195,7 @@
           <w:r>
             <w:fldChar w:fldCharType="separate"/>
           </w:r>
-          <w:hyperlink w:anchor="_Toc242205099" w:history="1">
+          <w:hyperlink w:anchor="_Toc242264008" w:history="1">
             <w:r>
               <w:rPr>
                 <w:rStyle w:val="Hipervnculo"/>
@@ -220,7 +219,7 @@
               <w:rPr>
                 <w:noProof/>
               </w:rPr>
-              <w:instrText xml:space="preserve"> PAGEREF _Toc242205099 \h </w:instrText>
+              <w:instrText xml:space="preserve"> PAGEREF _Toc242264008 \h </w:instrText>
             </w:r>
             <w:r>
               <w:rPr>
@@ -262,7 +261,7 @@
               <w14:ligatures w14:val="standardContextual"/>
             </w:rPr>
           </w:pPr>
-          <w:hyperlink w:anchor="_Toc242205100" w:history="1">
+          <w:hyperlink w:anchor="_Toc242264009" w:history="1">
             <w:r>
               <w:rPr>
                 <w:rStyle w:val="Hipervnculo"/>
@@ -286,7 +285,7 @@
               <w:rPr>
                 <w:noProof/>
               </w:rPr>
-              <w:instrText xml:space="preserve"> PAGEREF _Toc242205100 \h </w:instrText>
+              <w:instrText xml:space="preserve"> PAGEREF _Toc242264009 \h </w:instrText>
             </w:r>
             <w:r>
               <w:rPr>
@@ -328,7 +327,7 @@
               <w14:ligatures w14:val="standardContextual"/>
             </w:rPr>
           </w:pPr>
-          <w:hyperlink w:anchor="_Toc242205101" w:history="1">
+          <w:hyperlink w:anchor="_Toc242264010" w:history="1">
             <w:r>
               <w:rPr>
                 <w:rStyle w:val="Hipervnculo"/>
@@ -352,7 +351,7 @@
               <w:rPr>
                 <w:noProof/>
               </w:rPr>
-              <w:instrText xml:space="preserve"> PAGEREF _Toc242205101 \h </w:instrText>
+              <w:instrText xml:space="preserve"> PAGEREF _Toc242264010 \h </w:instrText>
             </w:r>
             <w:r>
               <w:rPr>
@@ -394,7 +393,7 @@
               <w14:ligatures w14:val="standardContextual"/>
             </w:rPr>
           </w:pPr>
-          <w:hyperlink w:anchor="_Toc242205102" w:history="1">
+          <w:hyperlink w:anchor="_Toc242264011" w:history="1">
             <w:r>
               <w:rPr>
                 <w:rStyle w:val="Hipervnculo"/>
@@ -418,7 +417,7 @@
               <w:rPr>
                 <w:noProof/>
               </w:rPr>
-              <w:instrText xml:space="preserve"> PAGEREF _Toc242205102 \h </w:instrText>
+              <w:instrText xml:space="preserve"> PAGEREF _Toc242264011 \h </w:instrText>
             </w:r>
             <w:r>
               <w:rPr>
@@ -460,7 +459,7 @@
               <w14:ligatures w14:val="standardContextual"/>
             </w:rPr>
           </w:pPr>
-          <w:hyperlink w:anchor="_Toc242205103" w:history="1">
+          <w:hyperlink w:anchor="_Toc242264012" w:history="1">
             <w:r>
               <w:rPr>
                 <w:rStyle w:val="Hipervnculo"/>
@@ -484,7 +483,7 @@
               <w:rPr>
                 <w:noProof/>
               </w:rPr>
-              <w:instrText xml:space="preserve"> PAGEREF _Toc242205103 \h </w:instrText>
+              <w:instrText xml:space="preserve"> PAGEREF _Toc242264012 \h </w:instrText>
             </w:r>
             <w:r>
               <w:rPr>
@@ -526,7 +525,7 @@
               <w14:ligatures w14:val="standardContextual"/>
             </w:rPr>
           </w:pPr>
-          <w:hyperlink w:anchor="_Toc242205104" w:history="1">
+          <w:hyperlink w:anchor="_Toc242264013" w:history="1">
             <w:r>
               <w:rPr>
                 <w:rStyle w:val="Hipervnculo"/>
@@ -550,7 +549,7 @@
               <w:rPr>
                 <w:noProof/>
               </w:rPr>
-              <w:instrText xml:space="preserve"> PAGEREF _Toc242205104 \h </w:instrText>
+              <w:instrText xml:space="preserve"> PAGEREF _Toc242264013 \h </w:instrText>
             </w:r>
             <w:r>
               <w:rPr>
@@ -592,7 +591,7 @@
               <w14:ligatures w14:val="standardContextual"/>
             </w:rPr>
           </w:pPr>
-          <w:hyperlink w:anchor="_Toc242205105" w:history="1">
+          <w:hyperlink w:anchor="_Toc242264014" w:history="1">
             <w:r>
               <w:rPr>
                 <w:rStyle w:val="Hipervnculo"/>
@@ -616,7 +615,7 @@
               <w:rPr>
                 <w:noProof/>
               </w:rPr>
-              <w:instrText xml:space="preserve"> PAGEREF _Toc242205105 \h </w:instrText>
+              <w:instrText xml:space="preserve"> PAGEREF _Toc242264014 \h </w:instrText>
             </w:r>
             <w:r>
               <w:rPr>
@@ -658,7 +657,7 @@
               <w14:ligatures w14:val="standardContextual"/>
             </w:rPr>
           </w:pPr>
-          <w:hyperlink w:anchor="_Toc242205106" w:history="1">
+          <w:hyperlink w:anchor="_Toc242264015" w:history="1">
             <w:r>
               <w:rPr>
                 <w:rStyle w:val="Hipervnculo"/>
@@ -682,7 +681,7 @@
               <w:rPr>
                 <w:noProof/>
               </w:rPr>
-              <w:instrText xml:space="preserve"> PAGEREF _Toc242205106 \h </w:instrText>
+              <w:instrText xml:space="preserve"> PAGEREF _Toc242264015 \h </w:instrText>
             </w:r>
             <w:r>
               <w:rPr>
@@ -724,7 +723,7 @@
               <w14:ligatures w14:val="standardContextual"/>
             </w:rPr>
           </w:pPr>
-          <w:hyperlink w:anchor="_Toc242205107" w:history="1">
+          <w:hyperlink w:anchor="_Toc242264016" w:history="1">
             <w:r>
               <w:rPr>
                 <w:rStyle w:val="Hipervnculo"/>
@@ -748,7 +747,7 @@
               <w:rPr>
                 <w:noProof/>
               </w:rPr>
-              <w:instrText xml:space="preserve"> PAGEREF _Toc242205107 \h </w:instrText>
+              <w:instrText xml:space="preserve"> PAGEREF _Toc242264016 \h </w:instrText>
             </w:r>
             <w:r>
               <w:rPr>
@@ -790,7 +789,7 @@
               <w14:ligatures w14:val="standardContextual"/>
             </w:rPr>
           </w:pPr>
-          <w:hyperlink w:anchor="_Toc242205108" w:history="1">
+          <w:hyperlink w:anchor="_Toc242264017" w:history="1">
             <w:r>
               <w:rPr>
                 <w:rStyle w:val="Hipervnculo"/>
@@ -814,7 +813,7 @@
               <w:rPr>
                 <w:noProof/>
               </w:rPr>
-              <w:instrText xml:space="preserve"> PAGEREF _Toc242205108 \h </w:instrText>
+              <w:instrText xml:space="preserve"> PAGEREF _Toc242264017 \h </w:instrText>
             </w:r>
             <w:r>
               <w:rPr>
@@ -856,7 +855,7 @@
               <w14:ligatures w14:val="standardContextual"/>
             </w:rPr>
           </w:pPr>
-          <w:hyperlink w:anchor="_Toc242205109" w:history="1">
+          <w:hyperlink w:anchor="_Toc242264018" w:history="1">
             <w:r>
               <w:rPr>
                 <w:rStyle w:val="Hipervnculo"/>
@@ -880,7 +879,7 @@
               <w:rPr>
                 <w:noProof/>
               </w:rPr>
-              <w:instrText xml:space="preserve"> PAGEREF _Toc242205109 \h </w:instrText>
+              <w:instrText xml:space="preserve"> PAGEREF _Toc242264018 \h </w:instrText>
             </w:r>
             <w:r>
               <w:rPr>
@@ -922,7 +921,7 @@
               <w14:ligatures w14:val="standardContextual"/>
             </w:rPr>
           </w:pPr>
-          <w:hyperlink w:anchor="_Toc242205110" w:history="1">
+          <w:hyperlink w:anchor="_Toc242264019" w:history="1">
             <w:r>
               <w:rPr>
                 <w:rStyle w:val="Hipervnculo"/>
@@ -946,7 +945,7 @@
               <w:rPr>
                 <w:noProof/>
               </w:rPr>
-              <w:instrText xml:space="preserve"> PAGEREF _Toc242205110 \h </w:instrText>
+              <w:instrText xml:space="preserve"> PAGEREF _Toc242264019 \h </w:instrText>
             </w:r>
             <w:r>
               <w:rPr>
@@ -999,9 +998,8 @@
       <w:pPr>
         <w:pStyle w:val="Ttulo1"/>
       </w:pPr>
-      <w:bookmarkStart w:id="0" w:name="_Toc242205099"/>
-      <w:r>
-        <w:lastRenderedPageBreak/>
+      <w:bookmarkStart w:id="0" w:name="_Toc242264008"/>
+      <w:r>
         <w:t>1. Introducción</w:t>
       </w:r>
       <w:bookmarkEnd w:id="0"/>
@@ -1028,7 +1026,7 @@
       <w:pPr>
         <w:pStyle w:val="Ttulo1"/>
       </w:pPr>
-      <w:bookmarkStart w:id="1" w:name="_Toc242205100"/>
+      <w:bookmarkStart w:id="1" w:name="_Toc242264009"/>
       <w:r>
         <w:t>2. Descripción del conjunto de datos</w:t>
       </w:r>
@@ -1040,7 +1038,10 @@
         <w:jc w:val="both"/>
       </w:pPr>
       <w:r>
-        <w:t>Se utilizó el conjunto publicado en Kaggle como Supermarket Dataset (archivo supermarket_data.csv). Aunque el nombre sugiere un supermercado, su contenido es la hoja "Year 2010-2011" del conjunto Online Retail II de UCI (Chen, 2019), con las mismas columnas y las mismas 541,910 filas. Contiene las líneas de venta de una tienda en línea con sede en Reino Unido que vende principalmente artículos de regalo y decoración, muchos de ellos a clientes mayoristas. Cada fila corresponde a un producto dentro de una factura, por lo que una factura con diez productos distintos ocupa diez filas.</w:t>
+        <w:t>Se utilizó el conjunto publicado en Kaggle como Supermarket Dataset (archivo supermarket_data.csv). Aunque el nombre sugiere un supermercado, su contenido es la hoja "Year 2010-2011" del conjunto Online Retail II de UCI (Chen, 2019), con las mismas columnas y las mismas 541,910 filas. Contiene las líneas de venta de una tienda en línea con sede en Reino Unido que vende principalmente artículos de regalo y decoración, muchos de ellos a clientes mayoristas. Cada fila corresponde a un producto dentro de una fa</w:t>
+      </w:r>
+      <w:r>
+        <w:t>ctura, por lo que una factura con diez productos distintos ocupa diez filas.</w:t>
       </w:r>
     </w:p>
     <w:p>
@@ -1088,6 +1089,12 @@
         <w:gridCol w:w="5760"/>
       </w:tblGrid>
       <w:tr>
+        <w:tblPrEx>
+          <w:tblCellMar>
+            <w:top w:w="0" w:type="dxa"/>
+            <w:bottom w:w="0" w:type="dxa"/>
+          </w:tblCellMar>
+        </w:tblPrEx>
         <w:trPr>
           <w:tblHeader/>
           <w:jc w:val="center"/>
@@ -1162,6 +1169,12 @@
         </w:tc>
       </w:tr>
       <w:tr>
+        <w:tblPrEx>
+          <w:tblCellMar>
+            <w:top w:w="0" w:type="dxa"/>
+            <w:bottom w:w="0" w:type="dxa"/>
+          </w:tblCellMar>
+        </w:tblPrEx>
         <w:trPr>
           <w:cantSplit/>
           <w:jc w:val="center"/>
@@ -1230,6 +1243,12 @@
         </w:tc>
       </w:tr>
       <w:tr>
+        <w:tblPrEx>
+          <w:tblCellMar>
+            <w:top w:w="0" w:type="dxa"/>
+            <w:bottom w:w="0" w:type="dxa"/>
+          </w:tblCellMar>
+        </w:tblPrEx>
         <w:trPr>
           <w:cantSplit/>
           <w:jc w:val="center"/>
@@ -1298,6 +1317,12 @@
         </w:tc>
       </w:tr>
       <w:tr>
+        <w:tblPrEx>
+          <w:tblCellMar>
+            <w:top w:w="0" w:type="dxa"/>
+            <w:bottom w:w="0" w:type="dxa"/>
+          </w:tblCellMar>
+        </w:tblPrEx>
         <w:trPr>
           <w:cantSplit/>
           <w:jc w:val="center"/>
@@ -1366,6 +1391,12 @@
         </w:tc>
       </w:tr>
       <w:tr>
+        <w:tblPrEx>
+          <w:tblCellMar>
+            <w:top w:w="0" w:type="dxa"/>
+            <w:bottom w:w="0" w:type="dxa"/>
+          </w:tblCellMar>
+        </w:tblPrEx>
         <w:trPr>
           <w:cantSplit/>
           <w:jc w:val="center"/>
@@ -1434,6 +1465,12 @@
         </w:tc>
       </w:tr>
       <w:tr>
+        <w:tblPrEx>
+          <w:tblCellMar>
+            <w:top w:w="0" w:type="dxa"/>
+            <w:bottom w:w="0" w:type="dxa"/>
+          </w:tblCellMar>
+        </w:tblPrEx>
         <w:trPr>
           <w:cantSplit/>
           <w:jc w:val="center"/>
@@ -1502,6 +1539,12 @@
         </w:tc>
       </w:tr>
       <w:tr>
+        <w:tblPrEx>
+          <w:tblCellMar>
+            <w:top w:w="0" w:type="dxa"/>
+            <w:bottom w:w="0" w:type="dxa"/>
+          </w:tblCellMar>
+        </w:tblPrEx>
         <w:trPr>
           <w:cantSplit/>
           <w:jc w:val="center"/>
@@ -1597,7 +1640,6 @@
           <w:sz w:val="20"/>
           <w:szCs w:val="20"/>
         </w:rPr>
-        <w:lastRenderedPageBreak/>
         <w:t xml:space="preserve">Tabla 2. </w:t>
       </w:r>
       <w:r>
@@ -1632,6 +1674,12 @@
         <w:gridCol w:w="6160"/>
       </w:tblGrid>
       <w:tr>
+        <w:tblPrEx>
+          <w:tblCellMar>
+            <w:top w:w="0" w:type="dxa"/>
+            <w:bottom w:w="0" w:type="dxa"/>
+          </w:tblCellMar>
+        </w:tblPrEx>
         <w:trPr>
           <w:tblHeader/>
           <w:jc w:val="center"/>
@@ -1740,6 +1788,12 @@
         </w:tc>
       </w:tr>
       <w:tr>
+        <w:tblPrEx>
+          <w:tblCellMar>
+            <w:top w:w="0" w:type="dxa"/>
+            <w:bottom w:w="0" w:type="dxa"/>
+          </w:tblCellMar>
+        </w:tblPrEx>
         <w:trPr>
           <w:cantSplit/>
           <w:jc w:val="center"/>
@@ -1839,6 +1893,12 @@
         </w:tc>
       </w:tr>
       <w:tr>
+        <w:tblPrEx>
+          <w:tblCellMar>
+            <w:top w:w="0" w:type="dxa"/>
+            <w:bottom w:w="0" w:type="dxa"/>
+          </w:tblCellMar>
+        </w:tblPrEx>
         <w:trPr>
           <w:cantSplit/>
           <w:jc w:val="center"/>
@@ -1938,6 +1998,12 @@
         </w:tc>
       </w:tr>
       <w:tr>
+        <w:tblPrEx>
+          <w:tblCellMar>
+            <w:top w:w="0" w:type="dxa"/>
+            <w:bottom w:w="0" w:type="dxa"/>
+          </w:tblCellMar>
+        </w:tblPrEx>
         <w:trPr>
           <w:cantSplit/>
           <w:jc w:val="center"/>
@@ -2037,6 +2103,12 @@
         </w:tc>
       </w:tr>
       <w:tr>
+        <w:tblPrEx>
+          <w:tblCellMar>
+            <w:top w:w="0" w:type="dxa"/>
+            <w:bottom w:w="0" w:type="dxa"/>
+          </w:tblCellMar>
+        </w:tblPrEx>
         <w:trPr>
           <w:cantSplit/>
           <w:jc w:val="center"/>
@@ -2136,6 +2208,12 @@
         </w:tc>
       </w:tr>
       <w:tr>
+        <w:tblPrEx>
+          <w:tblCellMar>
+            <w:top w:w="0" w:type="dxa"/>
+            <w:bottom w:w="0" w:type="dxa"/>
+          </w:tblCellMar>
+        </w:tblPrEx>
         <w:trPr>
           <w:cantSplit/>
           <w:jc w:val="center"/>
@@ -2235,6 +2313,12 @@
         </w:tc>
       </w:tr>
       <w:tr>
+        <w:tblPrEx>
+          <w:tblCellMar>
+            <w:top w:w="0" w:type="dxa"/>
+            <w:bottom w:w="0" w:type="dxa"/>
+          </w:tblCellMar>
+        </w:tblPrEx>
         <w:trPr>
           <w:cantSplit/>
           <w:jc w:val="center"/>
@@ -2334,6 +2418,12 @@
         </w:tc>
       </w:tr>
       <w:tr>
+        <w:tblPrEx>
+          <w:tblCellMar>
+            <w:top w:w="0" w:type="dxa"/>
+            <w:bottom w:w="0" w:type="dxa"/>
+          </w:tblCellMar>
+        </w:tblPrEx>
         <w:trPr>
           <w:cantSplit/>
           <w:jc w:val="center"/>
@@ -2433,6 +2523,12 @@
         </w:tc>
       </w:tr>
       <w:tr>
+        <w:tblPrEx>
+          <w:tblCellMar>
+            <w:top w:w="0" w:type="dxa"/>
+            <w:bottom w:w="0" w:type="dxa"/>
+          </w:tblCellMar>
+        </w:tblPrEx>
         <w:trPr>
           <w:cantSplit/>
           <w:jc w:val="center"/>
@@ -2551,7 +2647,7 @@
       <w:pPr>
         <w:pStyle w:val="Ttulo1"/>
       </w:pPr>
-      <w:bookmarkStart w:id="2" w:name="_Toc242205101"/>
+      <w:bookmarkStart w:id="2" w:name="_Toc242264010"/>
       <w:r>
         <w:t>3. Limpieza de datos</w:t>
       </w:r>
@@ -2611,6 +2707,12 @@
         <w:gridCol w:w="2400"/>
       </w:tblGrid>
       <w:tr>
+        <w:tblPrEx>
+          <w:tblCellMar>
+            <w:top w:w="0" w:type="dxa"/>
+            <w:bottom w:w="0" w:type="dxa"/>
+          </w:tblCellMar>
+        </w:tblPrEx>
         <w:trPr>
           <w:tblHeader/>
           <w:jc w:val="center"/>
@@ -2685,6 +2787,12 @@
         </w:tc>
       </w:tr>
       <w:tr>
+        <w:tblPrEx>
+          <w:tblCellMar>
+            <w:top w:w="0" w:type="dxa"/>
+            <w:bottom w:w="0" w:type="dxa"/>
+          </w:tblCellMar>
+        </w:tblPrEx>
         <w:trPr>
           <w:cantSplit/>
           <w:jc w:val="center"/>
@@ -2754,6 +2862,12 @@
         </w:tc>
       </w:tr>
       <w:tr>
+        <w:tblPrEx>
+          <w:tblCellMar>
+            <w:top w:w="0" w:type="dxa"/>
+            <w:bottom w:w="0" w:type="dxa"/>
+          </w:tblCellMar>
+        </w:tblPrEx>
         <w:trPr>
           <w:cantSplit/>
           <w:jc w:val="center"/>
@@ -2823,6 +2937,12 @@
         </w:tc>
       </w:tr>
       <w:tr>
+        <w:tblPrEx>
+          <w:tblCellMar>
+            <w:top w:w="0" w:type="dxa"/>
+            <w:bottom w:w="0" w:type="dxa"/>
+          </w:tblCellMar>
+        </w:tblPrEx>
         <w:trPr>
           <w:cantSplit/>
           <w:jc w:val="center"/>
@@ -2892,6 +3012,12 @@
         </w:tc>
       </w:tr>
       <w:tr>
+        <w:tblPrEx>
+          <w:tblCellMar>
+            <w:top w:w="0" w:type="dxa"/>
+            <w:bottom w:w="0" w:type="dxa"/>
+          </w:tblCellMar>
+        </w:tblPrEx>
         <w:trPr>
           <w:cantSplit/>
           <w:jc w:val="center"/>
@@ -2961,6 +3087,12 @@
         </w:tc>
       </w:tr>
       <w:tr>
+        <w:tblPrEx>
+          <w:tblCellMar>
+            <w:top w:w="0" w:type="dxa"/>
+            <w:bottom w:w="0" w:type="dxa"/>
+          </w:tblCellMar>
+        </w:tblPrEx>
         <w:trPr>
           <w:cantSplit/>
           <w:jc w:val="center"/>
@@ -3030,6 +3162,12 @@
         </w:tc>
       </w:tr>
       <w:tr>
+        <w:tblPrEx>
+          <w:tblCellMar>
+            <w:top w:w="0" w:type="dxa"/>
+            <w:bottom w:w="0" w:type="dxa"/>
+          </w:tblCellMar>
+        </w:tblPrEx>
         <w:trPr>
           <w:cantSplit/>
           <w:jc w:val="center"/>
@@ -3099,6 +3237,12 @@
         </w:tc>
       </w:tr>
       <w:tr>
+        <w:tblPrEx>
+          <w:tblCellMar>
+            <w:top w:w="0" w:type="dxa"/>
+            <w:bottom w:w="0" w:type="dxa"/>
+          </w:tblCellMar>
+        </w:tblPrEx>
         <w:trPr>
           <w:cantSplit/>
           <w:jc w:val="center"/>
@@ -3168,6 +3312,12 @@
         </w:tc>
       </w:tr>
       <w:tr>
+        <w:tblPrEx>
+          <w:tblCellMar>
+            <w:top w:w="0" w:type="dxa"/>
+            <w:bottom w:w="0" w:type="dxa"/>
+          </w:tblCellMar>
+        </w:tblPrEx>
         <w:trPr>
           <w:cantSplit/>
           <w:jc w:val="center"/>
@@ -3237,6 +3387,12 @@
         </w:tc>
       </w:tr>
       <w:tr>
+        <w:tblPrEx>
+          <w:tblCellMar>
+            <w:top w:w="0" w:type="dxa"/>
+            <w:bottom w:w="0" w:type="dxa"/>
+          </w:tblCellMar>
+        </w:tblPrEx>
         <w:trPr>
           <w:cantSplit/>
           <w:jc w:val="center"/>
@@ -3306,6 +3462,12 @@
         </w:tc>
       </w:tr>
       <w:tr>
+        <w:tblPrEx>
+          <w:tblCellMar>
+            <w:top w:w="0" w:type="dxa"/>
+            <w:bottom w:w="0" w:type="dxa"/>
+          </w:tblCellMar>
+        </w:tblPrEx>
         <w:trPr>
           <w:cantSplit/>
           <w:jc w:val="center"/>
@@ -3387,7 +3549,7 @@
           <w:sz w:val="18"/>
           <w:szCs w:val="18"/>
         </w:rPr>
-        <w:t>Fuente: Elaboración propia con datos de Online Retail (Kaggle).</w:t>
+        <w:t>Fuente: Elaboración propia con datos de Online Retail II (UCI), publicados en Kaggle.</w:t>
       </w:r>
     </w:p>
     <w:p>
@@ -3411,7 +3573,6 @@
           <w:sz w:val="20"/>
           <w:szCs w:val="20"/>
         </w:rPr>
-        <w:lastRenderedPageBreak/>
         <w:t xml:space="preserve">Tabla 4. </w:t>
       </w:r>
       <w:r>
@@ -3448,6 +3609,12 @@
         <w:gridCol w:w="1520"/>
       </w:tblGrid>
       <w:tr>
+        <w:tblPrEx>
+          <w:tblCellMar>
+            <w:top w:w="0" w:type="dxa"/>
+            <w:bottom w:w="0" w:type="dxa"/>
+          </w:tblCellMar>
+        </w:tblPrEx>
         <w:trPr>
           <w:tblHeader/>
           <w:jc w:val="center"/>
@@ -3624,6 +3791,12 @@
         </w:tc>
       </w:tr>
       <w:tr>
+        <w:tblPrEx>
+          <w:tblCellMar>
+            <w:top w:w="0" w:type="dxa"/>
+            <w:bottom w:w="0" w:type="dxa"/>
+          </w:tblCellMar>
+        </w:tblPrEx>
         <w:trPr>
           <w:cantSplit/>
           <w:jc w:val="center"/>
@@ -3788,6 +3961,12 @@
         </w:tc>
       </w:tr>
       <w:tr>
+        <w:tblPrEx>
+          <w:tblCellMar>
+            <w:top w:w="0" w:type="dxa"/>
+            <w:bottom w:w="0" w:type="dxa"/>
+          </w:tblCellMar>
+        </w:tblPrEx>
         <w:trPr>
           <w:cantSplit/>
           <w:jc w:val="center"/>
@@ -3952,6 +4131,12 @@
         </w:tc>
       </w:tr>
       <w:tr>
+        <w:tblPrEx>
+          <w:tblCellMar>
+            <w:top w:w="0" w:type="dxa"/>
+            <w:bottom w:w="0" w:type="dxa"/>
+          </w:tblCellMar>
+        </w:tblPrEx>
         <w:trPr>
           <w:cantSplit/>
           <w:jc w:val="center"/>
@@ -4116,6 +4301,12 @@
         </w:tc>
       </w:tr>
       <w:tr>
+        <w:tblPrEx>
+          <w:tblCellMar>
+            <w:top w:w="0" w:type="dxa"/>
+            <w:bottom w:w="0" w:type="dxa"/>
+          </w:tblCellMar>
+        </w:tblPrEx>
         <w:trPr>
           <w:cantSplit/>
           <w:jc w:val="center"/>
@@ -4280,6 +4471,12 @@
         </w:tc>
       </w:tr>
       <w:tr>
+        <w:tblPrEx>
+          <w:tblCellMar>
+            <w:top w:w="0" w:type="dxa"/>
+            <w:bottom w:w="0" w:type="dxa"/>
+          </w:tblCellMar>
+        </w:tblPrEx>
         <w:trPr>
           <w:cantSplit/>
           <w:jc w:val="center"/>
@@ -4444,6 +4641,12 @@
         </w:tc>
       </w:tr>
       <w:tr>
+        <w:tblPrEx>
+          <w:tblCellMar>
+            <w:top w:w="0" w:type="dxa"/>
+            <w:bottom w:w="0" w:type="dxa"/>
+          </w:tblCellMar>
+        </w:tblPrEx>
         <w:trPr>
           <w:cantSplit/>
           <w:jc w:val="center"/>
@@ -4608,6 +4811,12 @@
         </w:tc>
       </w:tr>
       <w:tr>
+        <w:tblPrEx>
+          <w:tblCellMar>
+            <w:top w:w="0" w:type="dxa"/>
+            <w:bottom w:w="0" w:type="dxa"/>
+          </w:tblCellMar>
+        </w:tblPrEx>
         <w:trPr>
           <w:cantSplit/>
           <w:jc w:val="center"/>
@@ -4772,6 +4981,12 @@
         </w:tc>
       </w:tr>
       <w:tr>
+        <w:tblPrEx>
+          <w:tblCellMar>
+            <w:top w:w="0" w:type="dxa"/>
+            <w:bottom w:w="0" w:type="dxa"/>
+          </w:tblCellMar>
+        </w:tblPrEx>
         <w:trPr>
           <w:cantSplit/>
           <w:jc w:val="center"/>
@@ -4936,6 +5151,12 @@
         </w:tc>
       </w:tr>
       <w:tr>
+        <w:tblPrEx>
+          <w:tblCellMar>
+            <w:top w:w="0" w:type="dxa"/>
+            <w:bottom w:w="0" w:type="dxa"/>
+          </w:tblCellMar>
+        </w:tblPrEx>
         <w:trPr>
           <w:cantSplit/>
           <w:jc w:val="center"/>
@@ -5100,6 +5321,12 @@
         </w:tc>
       </w:tr>
       <w:tr>
+        <w:tblPrEx>
+          <w:tblCellMar>
+            <w:top w:w="0" w:type="dxa"/>
+            <w:bottom w:w="0" w:type="dxa"/>
+          </w:tblCellMar>
+        </w:tblPrEx>
         <w:trPr>
           <w:cantSplit/>
           <w:jc w:val="center"/>
@@ -5264,6 +5491,12 @@
         </w:tc>
       </w:tr>
       <w:tr>
+        <w:tblPrEx>
+          <w:tblCellMar>
+            <w:top w:w="0" w:type="dxa"/>
+            <w:bottom w:w="0" w:type="dxa"/>
+          </w:tblCellMar>
+        </w:tblPrEx>
         <w:trPr>
           <w:cantSplit/>
           <w:jc w:val="center"/>
@@ -5441,7 +5674,7 @@
           <w:sz w:val="18"/>
           <w:szCs w:val="18"/>
         </w:rPr>
-        <w:t>Fuente: Elaboración propia con datos de Online Retail (Kaggle).</w:t>
+        <w:t>Fuente: Elaboración propia con datos de Online Retail II (UCI), publicados en Kaggle.</w:t>
       </w:r>
     </w:p>
     <w:p>
@@ -5457,7 +5690,7 @@
       <w:pPr>
         <w:pStyle w:val="Ttulo2"/>
       </w:pPr>
-      <w:bookmarkStart w:id="3" w:name="_Toc242205102"/>
+      <w:bookmarkStart w:id="3" w:name="_Toc242264011"/>
       <w:r>
         <w:t>3.1 Justificación de las reglas</w:t>
       </w:r>
@@ -5562,7 +5795,6 @@
           <w:b/>
           <w:bCs/>
         </w:rPr>
-        <w:lastRenderedPageBreak/>
         <w:t xml:space="preserve">Cantidad o precio menor o igual a cero. </w:t>
       </w:r>
       <w:r>
@@ -5648,14 +5880,17 @@
         <w:t>519,231 líneas de venta</w:t>
       </w:r>
       <w:r>
-        <w:t xml:space="preserve"> (95.81 % del original), con 3,790 productos distintos, 19,627 facturas, 4,322 clientes registrados y 38 países. El ingreso total por venta de productos es de £9,798,951.95. Se agregó la columna Total, que es el importe de cada línea (Quantity × Price). Al final del proceso, el notebook comprueba que no queden duplicados, cancelaciones, cantidades o precios menores o iguales a cero, ni códigos de servicio. De los 4,070 códigos originales, 112 eran el mismo código escrito con minúsculas, 19 eran códigos de servicio o vales de regalo y 149 no tenían ninguna venta válida, por lo que quedan 3,790 productos, muchos más que los 150 que pide el proyecto.</w:t>
+        <w:t xml:space="preserve"> (95.81 % del original), con 3,790 productos distintos, 19,627 facturas, 4,322 clientes registrados y 38 países. El ingreso total por venta de productos es de £9,798,951.95. Se agregó la columna Total, que es el importe de cada línea (Quantity × Price). Al final del proceso, el notebook comprueba que no queden duplicados, cancelaciones, cantidades o precios menores o iguales a cero, ni códigos de servicio. De los 4,070 códigos originales, 112 eran el mismo código escrito con minúsculas, 19 eran códigos de s</w:t>
+      </w:r>
+      <w:r>
+        <w:t>ervicio o vales de regalo y 149 no tenían ninguna venta válida, por lo que quedan 3,790 productos, muchos más que los 150 que pide el proyecto.</w:t>
       </w:r>
     </w:p>
     <w:p>
       <w:pPr>
         <w:pStyle w:val="Ttulo1"/>
       </w:pPr>
-      <w:bookmarkStart w:id="4" w:name="_Toc242205103"/>
+      <w:bookmarkStart w:id="4" w:name="_Toc242264012"/>
       <w:r>
         <w:t>4. Análisis estadístico descriptivo</w:t>
       </w:r>
@@ -5717,6 +5952,12 @@
         <w:gridCol w:w="2000"/>
       </w:tblGrid>
       <w:tr>
+        <w:tblPrEx>
+          <w:tblCellMar>
+            <w:top w:w="0" w:type="dxa"/>
+            <w:bottom w:w="0" w:type="dxa"/>
+          </w:tblCellMar>
+        </w:tblPrEx>
         <w:trPr>
           <w:tblHeader/>
           <w:jc w:val="center"/>
@@ -5859,6 +6100,12 @@
         </w:tc>
       </w:tr>
       <w:tr>
+        <w:tblPrEx>
+          <w:tblCellMar>
+            <w:top w:w="0" w:type="dxa"/>
+            <w:bottom w:w="0" w:type="dxa"/>
+          </w:tblCellMar>
+        </w:tblPrEx>
         <w:trPr>
           <w:cantSplit/>
           <w:jc w:val="center"/>
@@ -5992,6 +6239,12 @@
         </w:tc>
       </w:tr>
       <w:tr>
+        <w:tblPrEx>
+          <w:tblCellMar>
+            <w:top w:w="0" w:type="dxa"/>
+            <w:bottom w:w="0" w:type="dxa"/>
+          </w:tblCellMar>
+        </w:tblPrEx>
         <w:trPr>
           <w:cantSplit/>
           <w:jc w:val="center"/>
@@ -6125,6 +6378,12 @@
         </w:tc>
       </w:tr>
       <w:tr>
+        <w:tblPrEx>
+          <w:tblCellMar>
+            <w:top w:w="0" w:type="dxa"/>
+            <w:bottom w:w="0" w:type="dxa"/>
+          </w:tblCellMar>
+        </w:tblPrEx>
         <w:trPr>
           <w:cantSplit/>
           <w:jc w:val="center"/>
@@ -6258,6 +6517,12 @@
         </w:tc>
       </w:tr>
       <w:tr>
+        <w:tblPrEx>
+          <w:tblCellMar>
+            <w:top w:w="0" w:type="dxa"/>
+            <w:bottom w:w="0" w:type="dxa"/>
+          </w:tblCellMar>
+        </w:tblPrEx>
         <w:trPr>
           <w:cantSplit/>
           <w:jc w:val="center"/>
@@ -6391,6 +6656,12 @@
         </w:tc>
       </w:tr>
       <w:tr>
+        <w:tblPrEx>
+          <w:tblCellMar>
+            <w:top w:w="0" w:type="dxa"/>
+            <w:bottom w:w="0" w:type="dxa"/>
+          </w:tblCellMar>
+        </w:tblPrEx>
         <w:trPr>
           <w:cantSplit/>
           <w:jc w:val="center"/>
@@ -6524,6 +6795,12 @@
         </w:tc>
       </w:tr>
       <w:tr>
+        <w:tblPrEx>
+          <w:tblCellMar>
+            <w:top w:w="0" w:type="dxa"/>
+            <w:bottom w:w="0" w:type="dxa"/>
+          </w:tblCellMar>
+        </w:tblPrEx>
         <w:trPr>
           <w:cantSplit/>
           <w:jc w:val="center"/>
@@ -6657,6 +6934,12 @@
         </w:tc>
       </w:tr>
       <w:tr>
+        <w:tblPrEx>
+          <w:tblCellMar>
+            <w:top w:w="0" w:type="dxa"/>
+            <w:bottom w:w="0" w:type="dxa"/>
+          </w:tblCellMar>
+        </w:tblPrEx>
         <w:trPr>
           <w:cantSplit/>
           <w:jc w:val="center"/>
@@ -6790,6 +7073,12 @@
         </w:tc>
       </w:tr>
       <w:tr>
+        <w:tblPrEx>
+          <w:tblCellMar>
+            <w:top w:w="0" w:type="dxa"/>
+            <w:bottom w:w="0" w:type="dxa"/>
+          </w:tblCellMar>
+        </w:tblPrEx>
         <w:trPr>
           <w:cantSplit/>
           <w:jc w:val="center"/>
@@ -6923,6 +7212,12 @@
         </w:tc>
       </w:tr>
       <w:tr>
+        <w:tblPrEx>
+          <w:tblCellMar>
+            <w:top w:w="0" w:type="dxa"/>
+            <w:bottom w:w="0" w:type="dxa"/>
+          </w:tblCellMar>
+        </w:tblPrEx>
         <w:trPr>
           <w:cantSplit/>
           <w:jc w:val="center"/>
@@ -7056,6 +7351,12 @@
         </w:tc>
       </w:tr>
       <w:tr>
+        <w:tblPrEx>
+          <w:tblCellMar>
+            <w:top w:w="0" w:type="dxa"/>
+            <w:bottom w:w="0" w:type="dxa"/>
+          </w:tblCellMar>
+        </w:tblPrEx>
         <w:trPr>
           <w:cantSplit/>
           <w:jc w:val="center"/>
@@ -7189,6 +7490,12 @@
         </w:tc>
       </w:tr>
       <w:tr>
+        <w:tblPrEx>
+          <w:tblCellMar>
+            <w:top w:w="0" w:type="dxa"/>
+            <w:bottom w:w="0" w:type="dxa"/>
+          </w:tblCellMar>
+        </w:tblPrEx>
         <w:trPr>
           <w:cantSplit/>
           <w:jc w:val="center"/>
@@ -7322,6 +7629,12 @@
         </w:tc>
       </w:tr>
       <w:tr>
+        <w:tblPrEx>
+          <w:tblCellMar>
+            <w:top w:w="0" w:type="dxa"/>
+            <w:bottom w:w="0" w:type="dxa"/>
+          </w:tblCellMar>
+        </w:tblPrEx>
         <w:trPr>
           <w:cantSplit/>
           <w:jc w:val="center"/>
@@ -7455,6 +7768,12 @@
         </w:tc>
       </w:tr>
       <w:tr>
+        <w:tblPrEx>
+          <w:tblCellMar>
+            <w:top w:w="0" w:type="dxa"/>
+            <w:bottom w:w="0" w:type="dxa"/>
+          </w:tblCellMar>
+        </w:tblPrEx>
         <w:trPr>
           <w:cantSplit/>
           <w:jc w:val="center"/>
@@ -7588,6 +7907,12 @@
         </w:tc>
       </w:tr>
       <w:tr>
+        <w:tblPrEx>
+          <w:tblCellMar>
+            <w:top w:w="0" w:type="dxa"/>
+            <w:bottom w:w="0" w:type="dxa"/>
+          </w:tblCellMar>
+        </w:tblPrEx>
         <w:trPr>
           <w:cantSplit/>
           <w:jc w:val="center"/>
@@ -7733,14 +8058,14 @@
           <w:sz w:val="18"/>
           <w:szCs w:val="18"/>
         </w:rPr>
-        <w:t>Fuente: Elaboración propia con datos de Online Retail (Kaggle).</w:t>
+        <w:t>Fuente: Elaboración propia con datos de Online Retail II (UCI), publicados en Kaggle.</w:t>
       </w:r>
     </w:p>
     <w:p>
       <w:pPr>
         <w:pStyle w:val="Ttulo2"/>
       </w:pPr>
-      <w:bookmarkStart w:id="5" w:name="_Toc242205104"/>
+      <w:bookmarkStart w:id="5" w:name="_Toc242264013"/>
       <w:r>
         <w:t>4.1 Tendencia central</w:t>
       </w:r>
@@ -7822,7 +8147,7 @@
       <w:pPr>
         <w:pStyle w:val="Ttulo2"/>
       </w:pPr>
-      <w:bookmarkStart w:id="6" w:name="_Toc242205105"/>
+      <w:bookmarkStart w:id="6" w:name="_Toc242264014"/>
       <w:r>
         <w:t>4.2 Dispersión</w:t>
       </w:r>
@@ -7896,6 +8221,12 @@
         <w:gridCol w:w="1400"/>
       </w:tblGrid>
       <w:tr>
+        <w:tblPrEx>
+          <w:tblCellMar>
+            <w:top w:w="0" w:type="dxa"/>
+            <w:bottom w:w="0" w:type="dxa"/>
+          </w:tblCellMar>
+        </w:tblPrEx>
         <w:trPr>
           <w:tblHeader/>
           <w:jc w:val="center"/>
@@ -8140,6 +8471,12 @@
         </w:tc>
       </w:tr>
       <w:tr>
+        <w:tblPrEx>
+          <w:tblCellMar>
+            <w:top w:w="0" w:type="dxa"/>
+            <w:bottom w:w="0" w:type="dxa"/>
+          </w:tblCellMar>
+        </w:tblPrEx>
         <w:trPr>
           <w:cantSplit/>
           <w:jc w:val="center"/>
@@ -8369,6 +8706,12 @@
         </w:tc>
       </w:tr>
       <w:tr>
+        <w:tblPrEx>
+          <w:tblCellMar>
+            <w:top w:w="0" w:type="dxa"/>
+            <w:bottom w:w="0" w:type="dxa"/>
+          </w:tblCellMar>
+        </w:tblPrEx>
         <w:trPr>
           <w:cantSplit/>
           <w:jc w:val="center"/>
@@ -8598,6 +8941,12 @@
         </w:tc>
       </w:tr>
       <w:tr>
+        <w:tblPrEx>
+          <w:tblCellMar>
+            <w:top w:w="0" w:type="dxa"/>
+            <w:bottom w:w="0" w:type="dxa"/>
+          </w:tblCellMar>
+        </w:tblPrEx>
         <w:trPr>
           <w:cantSplit/>
           <w:jc w:val="center"/>
@@ -8839,7 +9188,7 @@
           <w:sz w:val="18"/>
           <w:szCs w:val="18"/>
         </w:rPr>
-        <w:t>Fuente: Elaboración propia con datos de Online Retail (Kaggle).</w:t>
+        <w:t>Fuente: Elaboración propia con datos de Online Retail II (UCI), publicados en Kaggle.</w:t>
       </w:r>
     </w:p>
     <w:p>
@@ -8855,7 +9204,7 @@
       <w:pPr>
         <w:pStyle w:val="Ttulo2"/>
       </w:pPr>
-      <w:bookmarkStart w:id="7" w:name="_Toc242205106"/>
+      <w:bookmarkStart w:id="7" w:name="_Toc242264015"/>
       <w:r>
         <w:t>4.3 Covarianza y correlación</w:t>
       </w:r>
@@ -8927,6 +9276,12 @@
         <w:gridCol w:w="2400"/>
       </w:tblGrid>
       <w:tr>
+        <w:tblPrEx>
+          <w:tblCellMar>
+            <w:top w:w="0" w:type="dxa"/>
+            <w:bottom w:w="0" w:type="dxa"/>
+          </w:tblCellMar>
+        </w:tblPrEx>
         <w:trPr>
           <w:tblHeader/>
           <w:jc w:val="center"/>
@@ -9060,6 +9415,12 @@
         </w:tc>
       </w:tr>
       <w:tr>
+        <w:tblPrEx>
+          <w:tblCellMar>
+            <w:top w:w="0" w:type="dxa"/>
+            <w:bottom w:w="0" w:type="dxa"/>
+          </w:tblCellMar>
+        </w:tblPrEx>
         <w:trPr>
           <w:cantSplit/>
           <w:jc w:val="center"/>
@@ -9193,6 +9554,12 @@
         </w:tc>
       </w:tr>
       <w:tr>
+        <w:tblPrEx>
+          <w:tblCellMar>
+            <w:top w:w="0" w:type="dxa"/>
+            <w:bottom w:w="0" w:type="dxa"/>
+          </w:tblCellMar>
+        </w:tblPrEx>
         <w:trPr>
           <w:cantSplit/>
           <w:jc w:val="center"/>
@@ -9326,6 +9693,12 @@
         </w:tc>
       </w:tr>
       <w:tr>
+        <w:tblPrEx>
+          <w:tblCellMar>
+            <w:top w:w="0" w:type="dxa"/>
+            <w:bottom w:w="0" w:type="dxa"/>
+          </w:tblCellMar>
+        </w:tblPrEx>
         <w:trPr>
           <w:cantSplit/>
           <w:jc w:val="center"/>
@@ -9471,7 +9844,7 @@
           <w:sz w:val="18"/>
           <w:szCs w:val="18"/>
         </w:rPr>
-        <w:t>Fuente: Elaboración propia con datos de Online Retail (Kaggle).</w:t>
+        <w:t>Fuente: Elaboración propia con datos de Online Retail II (UCI), publicados en Kaggle.</w:t>
       </w:r>
     </w:p>
     <w:p>
@@ -9521,6 +9894,12 @@
         <w:gridCol w:w="2000"/>
       </w:tblGrid>
       <w:tr>
+        <w:tblPrEx>
+          <w:tblCellMar>
+            <w:top w:w="0" w:type="dxa"/>
+            <w:bottom w:w="0" w:type="dxa"/>
+          </w:tblCellMar>
+        </w:tblPrEx>
         <w:trPr>
           <w:tblHeader/>
           <w:jc w:val="center"/>
@@ -9663,6 +10042,12 @@
         </w:tc>
       </w:tr>
       <w:tr>
+        <w:tblPrEx>
+          <w:tblCellMar>
+            <w:top w:w="0" w:type="dxa"/>
+            <w:bottom w:w="0" w:type="dxa"/>
+          </w:tblCellMar>
+        </w:tblPrEx>
         <w:trPr>
           <w:cantSplit/>
           <w:jc w:val="center"/>
@@ -9796,6 +10181,12 @@
         </w:tc>
       </w:tr>
       <w:tr>
+        <w:tblPrEx>
+          <w:tblCellMar>
+            <w:top w:w="0" w:type="dxa"/>
+            <w:bottom w:w="0" w:type="dxa"/>
+          </w:tblCellMar>
+        </w:tblPrEx>
         <w:trPr>
           <w:cantSplit/>
           <w:jc w:val="center"/>
@@ -9929,6 +10320,12 @@
         </w:tc>
       </w:tr>
       <w:tr>
+        <w:tblPrEx>
+          <w:tblCellMar>
+            <w:top w:w="0" w:type="dxa"/>
+            <w:bottom w:w="0" w:type="dxa"/>
+          </w:tblCellMar>
+        </w:tblPrEx>
         <w:trPr>
           <w:cantSplit/>
           <w:jc w:val="center"/>
@@ -10074,7 +10471,7 @@
           <w:sz w:val="18"/>
           <w:szCs w:val="18"/>
         </w:rPr>
-        <w:t>Fuente: Elaboración propia con datos de Online Retail (Kaggle).</w:t>
+        <w:t>Fuente: Elaboración propia con datos de Online Retail II (UCI), publicados en Kaggle.</w:t>
       </w:r>
     </w:p>
     <w:p>
@@ -10120,7 +10517,7 @@
       <w:pPr>
         <w:pStyle w:val="Ttulo2"/>
       </w:pPr>
-      <w:bookmarkStart w:id="8" w:name="_Toc242205107"/>
+      <w:bookmarkStart w:id="8" w:name="_Toc242264016"/>
       <w:r>
         <w:t>4.4 Análisis por producto</w:t>
       </w:r>
@@ -10183,6 +10580,12 @@
         <w:gridCol w:w="1800"/>
       </w:tblGrid>
       <w:tr>
+        <w:tblPrEx>
+          <w:tblCellMar>
+            <w:top w:w="0" w:type="dxa"/>
+            <w:bottom w:w="0" w:type="dxa"/>
+          </w:tblCellMar>
+        </w:tblPrEx>
         <w:trPr>
           <w:tblHeader/>
           <w:jc w:val="center"/>
@@ -10359,6 +10762,12 @@
         </w:tc>
       </w:tr>
       <w:tr>
+        <w:tblPrEx>
+          <w:tblCellMar>
+            <w:top w:w="0" w:type="dxa"/>
+            <w:bottom w:w="0" w:type="dxa"/>
+          </w:tblCellMar>
+        </w:tblPrEx>
         <w:trPr>
           <w:cantSplit/>
           <w:jc w:val="center"/>
@@ -10524,6 +10933,12 @@
         </w:tc>
       </w:tr>
       <w:tr>
+        <w:tblPrEx>
+          <w:tblCellMar>
+            <w:top w:w="0" w:type="dxa"/>
+            <w:bottom w:w="0" w:type="dxa"/>
+          </w:tblCellMar>
+        </w:tblPrEx>
         <w:trPr>
           <w:cantSplit/>
           <w:jc w:val="center"/>
@@ -10689,6 +11104,12 @@
         </w:tc>
       </w:tr>
       <w:tr>
+        <w:tblPrEx>
+          <w:tblCellMar>
+            <w:top w:w="0" w:type="dxa"/>
+            <w:bottom w:w="0" w:type="dxa"/>
+          </w:tblCellMar>
+        </w:tblPrEx>
         <w:trPr>
           <w:cantSplit/>
           <w:jc w:val="center"/>
@@ -10854,6 +11275,12 @@
         </w:tc>
       </w:tr>
       <w:tr>
+        <w:tblPrEx>
+          <w:tblCellMar>
+            <w:top w:w="0" w:type="dxa"/>
+            <w:bottom w:w="0" w:type="dxa"/>
+          </w:tblCellMar>
+        </w:tblPrEx>
         <w:trPr>
           <w:cantSplit/>
           <w:jc w:val="center"/>
@@ -11019,6 +11446,12 @@
         </w:tc>
       </w:tr>
       <w:tr>
+        <w:tblPrEx>
+          <w:tblCellMar>
+            <w:top w:w="0" w:type="dxa"/>
+            <w:bottom w:w="0" w:type="dxa"/>
+          </w:tblCellMar>
+        </w:tblPrEx>
         <w:trPr>
           <w:cantSplit/>
           <w:jc w:val="center"/>
@@ -11184,6 +11617,12 @@
         </w:tc>
       </w:tr>
       <w:tr>
+        <w:tblPrEx>
+          <w:tblCellMar>
+            <w:top w:w="0" w:type="dxa"/>
+            <w:bottom w:w="0" w:type="dxa"/>
+          </w:tblCellMar>
+        </w:tblPrEx>
         <w:trPr>
           <w:cantSplit/>
           <w:jc w:val="center"/>
@@ -11349,6 +11788,12 @@
         </w:tc>
       </w:tr>
       <w:tr>
+        <w:tblPrEx>
+          <w:tblCellMar>
+            <w:top w:w="0" w:type="dxa"/>
+            <w:bottom w:w="0" w:type="dxa"/>
+          </w:tblCellMar>
+        </w:tblPrEx>
         <w:trPr>
           <w:cantSplit/>
           <w:jc w:val="center"/>
@@ -11514,6 +11959,12 @@
         </w:tc>
       </w:tr>
       <w:tr>
+        <w:tblPrEx>
+          <w:tblCellMar>
+            <w:top w:w="0" w:type="dxa"/>
+            <w:bottom w:w="0" w:type="dxa"/>
+          </w:tblCellMar>
+        </w:tblPrEx>
         <w:trPr>
           <w:cantSplit/>
           <w:jc w:val="center"/>
@@ -11679,6 +12130,12 @@
         </w:tc>
       </w:tr>
       <w:tr>
+        <w:tblPrEx>
+          <w:tblCellMar>
+            <w:top w:w="0" w:type="dxa"/>
+            <w:bottom w:w="0" w:type="dxa"/>
+          </w:tblCellMar>
+        </w:tblPrEx>
         <w:trPr>
           <w:cantSplit/>
           <w:jc w:val="center"/>
@@ -11844,6 +12301,12 @@
         </w:tc>
       </w:tr>
       <w:tr>
+        <w:tblPrEx>
+          <w:tblCellMar>
+            <w:top w:w="0" w:type="dxa"/>
+            <w:bottom w:w="0" w:type="dxa"/>
+          </w:tblCellMar>
+        </w:tblPrEx>
         <w:trPr>
           <w:cantSplit/>
           <w:jc w:val="center"/>
@@ -12009,6 +12472,12 @@
         </w:tc>
       </w:tr>
       <w:tr>
+        <w:tblPrEx>
+          <w:tblCellMar>
+            <w:top w:w="0" w:type="dxa"/>
+            <w:bottom w:w="0" w:type="dxa"/>
+          </w:tblCellMar>
+        </w:tblPrEx>
         <w:trPr>
           <w:cantSplit/>
           <w:jc w:val="center"/>
@@ -12174,6 +12643,12 @@
         </w:tc>
       </w:tr>
       <w:tr>
+        <w:tblPrEx>
+          <w:tblCellMar>
+            <w:top w:w="0" w:type="dxa"/>
+            <w:bottom w:w="0" w:type="dxa"/>
+          </w:tblCellMar>
+        </w:tblPrEx>
         <w:trPr>
           <w:cantSplit/>
           <w:jc w:val="center"/>
@@ -12339,6 +12814,12 @@
         </w:tc>
       </w:tr>
       <w:tr>
+        <w:tblPrEx>
+          <w:tblCellMar>
+            <w:top w:w="0" w:type="dxa"/>
+            <w:bottom w:w="0" w:type="dxa"/>
+          </w:tblCellMar>
+        </w:tblPrEx>
         <w:trPr>
           <w:cantSplit/>
           <w:jc w:val="center"/>
@@ -12516,7 +12997,7 @@
           <w:sz w:val="18"/>
           <w:szCs w:val="18"/>
         </w:rPr>
-        <w:t>Fuente: Elaboración propia con datos de Online Retail (Kaggle).</w:t>
+        <w:t>Fuente: Elaboración propia con datos de Online Retail II (UCI), publicados en Kaggle.</w:t>
       </w:r>
     </w:p>
     <w:p>
@@ -12532,7 +13013,7 @@
       <w:pPr>
         <w:pStyle w:val="Ttulo1"/>
       </w:pPr>
-      <w:bookmarkStart w:id="9" w:name="_Toc242205108"/>
+      <w:bookmarkStart w:id="9" w:name="_Toc242264017"/>
       <w:r>
         <w:t>5. Visualización de datos</w:t>
       </w:r>
@@ -12558,7 +13039,7 @@
           <w:noProof/>
         </w:rPr>
         <w:drawing>
-          <wp:inline distT="0" distB="0" distL="0" distR="0" wp14:anchorId="550BE50D" wp14:editId="445F0EDF">
+          <wp:inline distT="0" distB="0" distL="0" distR="0" wp14:anchorId="3CD7C35B" wp14:editId="3C6E5D0A">
             <wp:extent cx="5715000" cy="3438525"/>
             <wp:effectExtent l="0" t="0" r="0" b="0"/>
             <wp:docPr id="1" name="fig01_histograma_quantity.png" descr="Histograma de frecuencias de las unidades por línea de venta" title="Histograma de frecuencias de las unidades por línea de venta"/>
@@ -12639,7 +13120,7 @@
           <w:noProof/>
         </w:rPr>
         <w:drawing>
-          <wp:inline distT="0" distB="0" distL="0" distR="0" wp14:anchorId="0DCA511D" wp14:editId="25967FAE">
+          <wp:inline distT="0" distB="0" distL="0" distR="0" wp14:anchorId="70F42072" wp14:editId="608DB11E">
             <wp:extent cx="5715000" cy="3590925"/>
             <wp:effectExtent l="0" t="0" r="0" b="0"/>
             <wp:docPr id="2" name="fig02_densidad_price.png" descr="Histograma y curva de densidad del precio unitario" title="Histograma y curva de densidad del precio unitario"/>
@@ -12720,7 +13201,7 @@
           <w:noProof/>
         </w:rPr>
         <w:drawing>
-          <wp:inline distT="0" distB="0" distL="0" distR="0" wp14:anchorId="19AD0E41" wp14:editId="1F089780">
+          <wp:inline distT="0" distB="0" distL="0" distR="0" wp14:anchorId="36D0C7E8" wp14:editId="0291DA5D">
             <wp:extent cx="5715000" cy="3600450"/>
             <wp:effectExtent l="0" t="0" r="0" b="0"/>
             <wp:docPr id="3" name="fig03_densidad_total.png" descr="Curva de densidad del importe por línea en escala logarítmica" title="Curva de densidad del importe por línea en escala logarítmica"/>
@@ -12801,7 +13282,7 @@
           <w:noProof/>
         </w:rPr>
         <w:drawing>
-          <wp:inline distT="0" distB="0" distL="0" distR="0" wp14:anchorId="27A8D2B5" wp14:editId="12A82EFE">
+          <wp:inline distT="0" distB="0" distL="0" distR="0" wp14:anchorId="3072D569" wp14:editId="4071FCC1">
             <wp:extent cx="5715000" cy="3905250"/>
             <wp:effectExtent l="0" t="0" r="0" b="0"/>
             <wp:docPr id="4" name="fig04_boxplots.png" descr="Diagramas de caja y bigotes de Quantity, Price y Total" title="Diagramas de caja y bigotes de Quantity, Price y Total"/>
@@ -12882,7 +13363,7 @@
           <w:noProof/>
         </w:rPr>
         <w:drawing>
-          <wp:inline distT="0" distB="0" distL="0" distR="0" wp14:anchorId="591F7374" wp14:editId="269D1749">
+          <wp:inline distT="0" distB="0" distL="0" distR="0" wp14:anchorId="6FFA6043" wp14:editId="734BD69C">
             <wp:extent cx="5715000" cy="3867150"/>
             <wp:effectExtent l="0" t="0" r="0" b="0"/>
             <wp:docPr id="5" name="fig05_dispersion_unidades_ingreso.png" descr="Gráfico de dispersión entre unidades vendidas e ingreso por producto" title="Gráfico de dispersión entre unidades vendidas e ingreso por producto"/>
@@ -12963,7 +13444,7 @@
           <w:noProof/>
         </w:rPr>
         <w:drawing>
-          <wp:inline distT="0" distB="0" distL="0" distR="0" wp14:anchorId="739325CE" wp14:editId="6F1E4B51">
+          <wp:inline distT="0" distB="0" distL="0" distR="0" wp14:anchorId="3F750AA5" wp14:editId="08262C0B">
             <wp:extent cx="5715000" cy="3171825"/>
             <wp:effectExtent l="0" t="0" r="0" b="0"/>
             <wp:docPr id="6" name="fig06_ingreso_mensual.png" descr="Ingreso mensual por venta de productos" title="Ingreso mensual por venta de productos"/>
@@ -13044,7 +13525,7 @@
           <w:noProof/>
         </w:rPr>
         <w:drawing>
-          <wp:inline distT="0" distB="0" distL="0" distR="0" wp14:anchorId="783C4973" wp14:editId="3BDAB7B0">
+          <wp:inline distT="0" distB="0" distL="0" distR="0" wp14:anchorId="3B745C24" wp14:editId="79FFA91E">
             <wp:extent cx="5715000" cy="3152775"/>
             <wp:effectExtent l="0" t="0" r="0" b="0"/>
             <wp:docPr id="7" name="fig07_top10_productos.png" descr="Diez productos con mayor ingreso" title="Diez productos con mayor ingreso"/>
@@ -13125,7 +13606,7 @@
           <w:noProof/>
         </w:rPr>
         <w:drawing>
-          <wp:inline distT="0" distB="0" distL="0" distR="0" wp14:anchorId="50C5BEF7" wp14:editId="4D3BF660">
+          <wp:inline distT="0" distB="0" distL="0" distR="0" wp14:anchorId="6007CE25" wp14:editId="267C5129">
             <wp:extent cx="5715000" cy="3657600"/>
             <wp:effectExtent l="0" t="0" r="0" b="0"/>
             <wp:docPr id="8" name="fig08_ingreso_por_pais.png" descr="Diez países con mayor ingreso, sin contar al Reino Unido" title="Diez países con mayor ingreso, sin contar al Reino Unido"/>
@@ -13206,7 +13687,7 @@
           <w:noProof/>
         </w:rPr>
         <w:drawing>
-          <wp:inline distT="0" distB="0" distL="0" distR="0" wp14:anchorId="1067A941" wp14:editId="73D4D70F">
+          <wp:inline distT="0" distB="0" distL="0" distR="0" wp14:anchorId="0A426512" wp14:editId="302C087B">
             <wp:extent cx="4762500" cy="3771900"/>
             <wp:effectExtent l="0" t="0" r="0" b="0"/>
             <wp:docPr id="9" name="fig09_correlacion_productos.png" descr="Mapa de calor de la correlación de Spearman entre variables de producto" title="Mapa de calor de la correlación de Spearman entre variables de producto"/>
@@ -13297,7 +13778,7 @@
           <w:noProof/>
         </w:rPr>
         <w:drawing>
-          <wp:inline distT="0" distB="0" distL="0" distR="0" wp14:anchorId="474B6059" wp14:editId="31BC0096">
+          <wp:inline distT="0" distB="0" distL="0" distR="0" wp14:anchorId="244E1F37" wp14:editId="64105439">
             <wp:extent cx="5715000" cy="3533775"/>
             <wp:effectExtent l="0" t="0" r="0" b="0"/>
             <wp:docPr id="10" name="fig10_pareto_ingreso.png" descr="Curva de concentración del ingreso por producto" title="Curva de concentración del ingreso por producto"/>
@@ -13371,7 +13852,7 @@
       <w:pPr>
         <w:pStyle w:val="Ttulo1"/>
       </w:pPr>
-      <w:bookmarkStart w:id="10" w:name="_Toc242205109"/>
+      <w:bookmarkStart w:id="10" w:name="_Toc242264018"/>
       <w:r>
         <w:t>6. Conclusiones</w:t>
       </w:r>
@@ -13426,7 +13907,7 @@
         <w:t>0</w:t>
       </w:r>
       <w:r>
-        <w:t>.406): los productos baratos se compran en mayores cantidades. El importe de una línea depende más de la cantidad (Spearman 0.684) que del precio (0.329).</w:t>
+        <w:t>.406): los productos baratos se compran en mayores cantidades. El importe de una línea se relaciona más con la cantidad (Spearman 0.684) que con el precio (0.329), en parte porque el importe se calcula como cantidad por precio.</w:t>
       </w:r>
     </w:p>
     <w:p>
@@ -13489,7 +13970,7 @@
       <w:pPr>
         <w:pStyle w:val="Ttulo1"/>
       </w:pPr>
-      <w:bookmarkStart w:id="11" w:name="_Toc242205110"/>
+      <w:bookmarkStart w:id="11" w:name="_Toc242264019"/>
       <w:r>
         <w:t>Referencias</w:t>
       </w:r>
@@ -13617,10 +14098,10 @@
 <file path=word/numbering.xml><?xml version="1.0" encoding="utf-8"?>
 <w:numbering xmlns:wpc="http://schemas.microsoft.com/office/word/2010/wordprocessingCanvas" xmlns:cx="http://schemas.microsoft.com/office/drawing/2014/chartex" xmlns:cx1="http://schemas.microsoft.com/office/drawing/2015/9/8/chartex" xmlns:cx2="http://schemas.microsoft.com/office/drawing/2015/10/21/chartex" xmlns:cx3="http://schemas.microsoft.com/office/drawing/2016/5/9/chartex" xmlns:cx4="http://schemas.microsoft.com/office/drawing/2016/5/10/chartex" xmlns:cx5="http://schemas.microsoft.com/office/drawing/2016/5/11/chartex" xmlns:cx6="http://schemas.microsoft.com/office/drawing/2016/5/12/chartex" xmlns:cx7="http://schemas.microsoft.com/office/drawing/2016/5/13/chartex" xmlns:cx8="http://schemas.microsoft.com/office/drawing/2016/5/14/chartex" xmlns:mc="http://schemas.openxmlformats.org/markup-compatibility/2006" xmlns:aink="http://schemas.microsoft.com/office/drawing/2016/ink" xmlns:am3d="http://schemas.microsoft.com/office/drawing/2017/model3d" xmlns:o="urn:schemas-microsoft-com:office:office" xmlns:oel="http://schemas.microsoft.com/office/2019/extlst" xmlns:r="http://schemas.openxmlformats.org/officeDocument/2006/relationships" xmlns:m="http://schemas.openxmlformats.org/officeDocument/2006/math" xmlns:v="urn:schemas-microsoft-com:vml" xmlns:wp14="http://schemas.microsoft.com/office/word/2010/wordprocessingDrawing" xmlns:wp="http://schemas.openxmlformats.org/drawingml/2006/wordprocessingDrawing" xmlns:w10="urn:schemas-microsoft-com:office:word" xmlns:w="http://schemas.openxmlformats.org/wordprocessingml/2006/main" xmlns:w14="http://schemas.microsoft.com/office/word/2010/wordml" xmlns:w15="http://schemas.microsoft.com/office/word/2012/wordml" xmlns:w16cex="http://schemas.microsoft.com/office/word/2018/wordml/cex" xmlns:w16cid="http://schemas.microsoft.com/office/word/2016/wordml/cid" xmlns:w16="http://schemas.microsoft.com/office/word/2018/wordml" xmlns:w16du="http://schemas.microsoft.com/office/word/2023/wordml/word16du" xmlns:w16sdtdh="http://schemas.microsoft.com/office/word/2020/wordml/sdtdatahash" xmlns:w16sdtfl="http://schemas.microsoft.com/office/word/2024/wordml/sdtformatlock" xmlns:w16se="http://schemas.microsoft.com/office/word/2015/wordml/symex" xmlns:wpg="http://schemas.microsoft.com/office/word/2010/wordprocessingGroup" xmlns:wpi="http://schemas.microsoft.com/office/word/2010/wordprocessingInk" xmlns:wne="http://schemas.microsoft.com/office/word/2006/wordml" xmlns:wps="http://schemas.microsoft.com/office/word/2010/wordprocessingShape" mc:Ignorable="w14 w15 w16se w16cid w16 w16cex w16sdtdh w16sdtfl w16du wp14">
   <w:abstractNum w:abstractNumId="0" w15:restartNumberingAfterBreak="0">
-    <w:nsid w:val="3F487497"/>
+    <w:nsid w:val="2E3C7A08"/>
     <w:multiLevelType w:val="hybridMultilevel"/>
-    <w:tmpl w:val="081C972C"/>
-    <w:lvl w:ilvl="0" w:tplc="FD647FD6" w:tentative="1">
+    <w:tmpl w:val="7DB62544"/>
+    <w:lvl w:ilvl="0" w:tplc="FE20D122" w:tentative="1">
       <w:start w:val="1"/>
       <w:numFmt w:val="bullet"/>
       <w:lvlText w:val="●"/>
@@ -13629,7 +14110,7 @@
         <w:ind w:left="720" w:hanging="360"/>
       </w:pPr>
     </w:lvl>
-    <w:lvl w:ilvl="1" w:tplc="A56CCD82" w:tentative="1">
+    <w:lvl w:ilvl="1" w:tplc="7FB6DA70" w:tentative="1">
       <w:start w:val="1"/>
       <w:numFmt w:val="bullet"/>
       <w:lvlText w:val="○"/>
@@ -13638,7 +14119,7 @@
         <w:ind w:left="1440" w:hanging="360"/>
       </w:pPr>
     </w:lvl>
-    <w:lvl w:ilvl="2" w:tplc="AA5E700E" w:tentative="1">
+    <w:lvl w:ilvl="2" w:tplc="916A13D6" w:tentative="1">
       <w:start w:val="1"/>
       <w:numFmt w:val="bullet"/>
       <w:lvlText w:val="■"/>
@@ -13647,7 +14128,7 @@
         <w:ind w:left="2160" w:hanging="360"/>
       </w:pPr>
     </w:lvl>
-    <w:lvl w:ilvl="3" w:tplc="51B034A4" w:tentative="1">
+    <w:lvl w:ilvl="3" w:tplc="54B049A2" w:tentative="1">
       <w:start w:val="1"/>
       <w:numFmt w:val="bullet"/>
       <w:lvlText w:val="●"/>
@@ -13656,7 +14137,7 @@
         <w:ind w:left="2880" w:hanging="360"/>
       </w:pPr>
     </w:lvl>
-    <w:lvl w:ilvl="4" w:tplc="E62CC564" w:tentative="1">
+    <w:lvl w:ilvl="4" w:tplc="37564618" w:tentative="1">
       <w:start w:val="1"/>
       <w:numFmt w:val="bullet"/>
       <w:lvlText w:val="○"/>
@@ -13665,7 +14146,7 @@
         <w:ind w:left="3600" w:hanging="360"/>
       </w:pPr>
     </w:lvl>
-    <w:lvl w:ilvl="5" w:tplc="15A81350" w:tentative="1">
+    <w:lvl w:ilvl="5" w:tplc="5AF255FA" w:tentative="1">
       <w:start w:val="1"/>
       <w:numFmt w:val="bullet"/>
       <w:lvlText w:val="■"/>
@@ -13674,7 +14155,7 @@
         <w:ind w:left="4320" w:hanging="360"/>
       </w:pPr>
     </w:lvl>
-    <w:lvl w:ilvl="6" w:tplc="27425EBA" w:tentative="1">
+    <w:lvl w:ilvl="6" w:tplc="BC685122" w:tentative="1">
       <w:start w:val="1"/>
       <w:numFmt w:val="bullet"/>
       <w:lvlText w:val="●"/>
@@ -13683,7 +14164,7 @@
         <w:ind w:left="5040" w:hanging="360"/>
       </w:pPr>
     </w:lvl>
-    <w:lvl w:ilvl="7" w:tplc="89BEB0A6" w:tentative="1">
+    <w:lvl w:ilvl="7" w:tplc="F71EDD76" w:tentative="1">
       <w:start w:val="1"/>
       <w:numFmt w:val="bullet"/>
       <w:lvlText w:val="●"/>
@@ -13692,7 +14173,7 @@
         <w:ind w:left="5760" w:hanging="360"/>
       </w:pPr>
     </w:lvl>
-    <w:lvl w:ilvl="8" w:tplc="49EC606E" w:tentative="1">
+    <w:lvl w:ilvl="8" w:tplc="A8A665FA" w:tentative="1">
       <w:start w:val="1"/>
       <w:numFmt w:val="bullet"/>
       <w:lvlText w:val="●"/>
@@ -13703,10 +14184,10 @@
     </w:lvl>
   </w:abstractNum>
   <w:abstractNum w:abstractNumId="1" w15:restartNumberingAfterBreak="0">
-    <w:nsid w:val="68821460"/>
+    <w:nsid w:val="55EE63F2"/>
     <w:multiLevelType w:val="hybridMultilevel"/>
-    <w:tmpl w:val="A2D8C374"/>
-    <w:lvl w:ilvl="0" w:tplc="ACFCEB62">
+    <w:tmpl w:val="079E9A60"/>
+    <w:lvl w:ilvl="0" w:tplc="C2306280">
       <w:start w:val="1"/>
       <w:numFmt w:val="decimal"/>
       <w:lvlText w:val="%1."/>
@@ -13715,52 +14196,52 @@
         <w:ind w:left="720" w:hanging="360"/>
       </w:pPr>
     </w:lvl>
-    <w:lvl w:ilvl="1" w:tplc="A84C1E38">
+    <w:lvl w:ilvl="1" w:tplc="5CCC6CEA">
       <w:numFmt w:val="decimal"/>
       <w:lvlText w:val=""/>
       <w:lvlJc w:val="left"/>
     </w:lvl>
-    <w:lvl w:ilvl="2" w:tplc="A2E82CA0">
+    <w:lvl w:ilvl="2" w:tplc="C722D77A">
       <w:numFmt w:val="decimal"/>
       <w:lvlText w:val=""/>
       <w:lvlJc w:val="left"/>
     </w:lvl>
-    <w:lvl w:ilvl="3" w:tplc="49F251A6">
+    <w:lvl w:ilvl="3" w:tplc="1444F192">
       <w:numFmt w:val="decimal"/>
       <w:lvlText w:val=""/>
       <w:lvlJc w:val="left"/>
     </w:lvl>
-    <w:lvl w:ilvl="4" w:tplc="CBBA2BA0">
+    <w:lvl w:ilvl="4" w:tplc="31B8D818">
       <w:numFmt w:val="decimal"/>
       <w:lvlText w:val=""/>
       <w:lvlJc w:val="left"/>
     </w:lvl>
-    <w:lvl w:ilvl="5" w:tplc="083C55A0">
+    <w:lvl w:ilvl="5" w:tplc="CE1483A2">
       <w:numFmt w:val="decimal"/>
       <w:lvlText w:val=""/>
       <w:lvlJc w:val="left"/>
     </w:lvl>
-    <w:lvl w:ilvl="6" w:tplc="65B8B9D2">
+    <w:lvl w:ilvl="6" w:tplc="7D84A1D6">
       <w:numFmt w:val="decimal"/>
       <w:lvlText w:val=""/>
       <w:lvlJc w:val="left"/>
     </w:lvl>
-    <w:lvl w:ilvl="7" w:tplc="62DADBC8">
+    <w:lvl w:ilvl="7" w:tplc="FFAAAB24">
       <w:numFmt w:val="decimal"/>
       <w:lvlText w:val=""/>
       <w:lvlJc w:val="left"/>
     </w:lvl>
-    <w:lvl w:ilvl="8" w:tplc="40765554">
+    <w:lvl w:ilvl="8" w:tplc="2BF6C9FA">
       <w:numFmt w:val="decimal"/>
       <w:lvlText w:val=""/>
       <w:lvlJc w:val="left"/>
     </w:lvl>
   </w:abstractNum>
   <w:abstractNum w:abstractNumId="2" w15:restartNumberingAfterBreak="0">
-    <w:nsid w:val="7FD85599"/>
+    <w:nsid w:val="712C6857"/>
     <w:multiLevelType w:val="hybridMultilevel"/>
-    <w:tmpl w:val="0E7E3A58"/>
-    <w:lvl w:ilvl="0" w:tplc="A32A318E">
+    <w:tmpl w:val="23108394"/>
+    <w:lvl w:ilvl="0" w:tplc="50F67608">
       <w:start w:val="1"/>
       <w:numFmt w:val="bullet"/>
       <w:lvlText w:val="•"/>
@@ -13769,60 +14250,60 @@
         <w:ind w:left="720" w:hanging="360"/>
       </w:pPr>
     </w:lvl>
-    <w:lvl w:ilvl="1" w:tplc="9AF4F766">
+    <w:lvl w:ilvl="1" w:tplc="9692D89C">
       <w:numFmt w:val="decimal"/>
       <w:lvlText w:val=""/>
       <w:lvlJc w:val="left"/>
     </w:lvl>
-    <w:lvl w:ilvl="2" w:tplc="C658A898">
+    <w:lvl w:ilvl="2" w:tplc="5FFE269A">
       <w:numFmt w:val="decimal"/>
       <w:lvlText w:val=""/>
       <w:lvlJc w:val="left"/>
     </w:lvl>
-    <w:lvl w:ilvl="3" w:tplc="3B28D24E">
+    <w:lvl w:ilvl="3" w:tplc="307EAF0E">
       <w:numFmt w:val="decimal"/>
       <w:lvlText w:val=""/>
       <w:lvlJc w:val="left"/>
     </w:lvl>
-    <w:lvl w:ilvl="4" w:tplc="85244170">
+    <w:lvl w:ilvl="4" w:tplc="52BC6336">
       <w:numFmt w:val="decimal"/>
       <w:lvlText w:val=""/>
       <w:lvlJc w:val="left"/>
     </w:lvl>
-    <w:lvl w:ilvl="5" w:tplc="C82E1576">
+    <w:lvl w:ilvl="5" w:tplc="8356F32A">
       <w:numFmt w:val="decimal"/>
       <w:lvlText w:val=""/>
       <w:lvlJc w:val="left"/>
     </w:lvl>
-    <w:lvl w:ilvl="6" w:tplc="AE1ABD5E">
+    <w:lvl w:ilvl="6" w:tplc="1F38EE64">
       <w:numFmt w:val="decimal"/>
       <w:lvlText w:val=""/>
       <w:lvlJc w:val="left"/>
     </w:lvl>
-    <w:lvl w:ilvl="7" w:tplc="5EB0E4AA">
+    <w:lvl w:ilvl="7" w:tplc="07A80424">
       <w:numFmt w:val="decimal"/>
       <w:lvlText w:val=""/>
       <w:lvlJc w:val="left"/>
     </w:lvl>
-    <w:lvl w:ilvl="8" w:tplc="D3BA142A">
+    <w:lvl w:ilvl="8" w:tplc="15D01C5A">
       <w:numFmt w:val="decimal"/>
       <w:lvlText w:val=""/>
       <w:lvlJc w:val="left"/>
     </w:lvl>
   </w:abstractNum>
-  <w:num w:numId="1" w16cid:durableId="997076014">
+  <w:num w:numId="1" w16cid:durableId="827786820">
     <w:abstractNumId w:val="0"/>
     <w:lvlOverride w:ilvl="0">
       <w:startOverride w:val="1"/>
     </w:lvlOverride>
   </w:num>
-  <w:num w:numId="2" w16cid:durableId="1966813839">
+  <w:num w:numId="2" w16cid:durableId="215512733">
     <w:abstractNumId w:val="2"/>
     <w:lvlOverride w:ilvl="0">
       <w:startOverride w:val="1"/>
     </w:lvlOverride>
   </w:num>
-  <w:num w:numId="3" w16cid:durableId="260456301">
+  <w:num w:numId="3" w16cid:durableId="629359685">
     <w:abstractNumId w:val="1"/>
     <w:lvlOverride w:ilvl="0">
       <w:startOverride w:val="1"/>
@@ -14462,7 +14943,7 @@
     <w:autoRedefine/>
     <w:uiPriority w:val="39"/>
     <w:unhideWhenUsed/>
-    <w:rsid w:val="00F74699"/>
+    <w:rsid w:val="007E4B26"/>
     <w:pPr>
       <w:spacing w:after="100"/>
     </w:pPr>
@@ -14474,7 +14955,7 @@
     <w:autoRedefine/>
     <w:uiPriority w:val="39"/>
     <w:unhideWhenUsed/>
-    <w:rsid w:val="00F74699"/>
+    <w:rsid w:val="007E4B26"/>
     <w:pPr>
       <w:spacing w:after="100"/>
       <w:ind w:left="220"/>

</xml_diff>

<commit_message>
Mejora la sección de conclusiones
Las conclusiones se centran en las variables y los hallazgos del análisis, y las recomendaciones para el inventario quedan en un párrafo aparte.
</commit_message>
<xml_diff>
--- a/deliverables/Equipo2_Inventario_Resultados.docx
+++ b/deliverables/Equipo2_Inventario_Resultados.docx
@@ -161,13 +161,14 @@
           <w:sz w:val="32"/>
           <w:szCs w:val="32"/>
         </w:rPr>
+        <w:lastRenderedPageBreak/>
         <w:t>Índice</w:t>
       </w:r>
     </w:p>
     <w:sdt>
       <w:sdtPr>
         <w:alias w:val="Índice"/>
-        <w:id w:val="-2132780299"/>
+        <w:id w:val="-2003878914"/>
       </w:sdtPr>
       <w:sdtEndPr/>
       <w:sdtContent>
@@ -195,7 +196,7 @@
           <w:r>
             <w:fldChar w:fldCharType="separate"/>
           </w:r>
-          <w:hyperlink w:anchor="_Toc242264008" w:history="1">
+          <w:hyperlink w:anchor="_Toc242264563" w:history="1">
             <w:r>
               <w:rPr>
                 <w:rStyle w:val="Hipervnculo"/>
@@ -219,7 +220,7 @@
               <w:rPr>
                 <w:noProof/>
               </w:rPr>
-              <w:instrText xml:space="preserve"> PAGEREF _Toc242264008 \h </w:instrText>
+              <w:instrText xml:space="preserve"> PAGEREF _Toc242264563 \h </w:instrText>
             </w:r>
             <w:r>
               <w:rPr>
@@ -261,7 +262,7 @@
               <w14:ligatures w14:val="standardContextual"/>
             </w:rPr>
           </w:pPr>
-          <w:hyperlink w:anchor="_Toc242264009" w:history="1">
+          <w:hyperlink w:anchor="_Toc242264564" w:history="1">
             <w:r>
               <w:rPr>
                 <w:rStyle w:val="Hipervnculo"/>
@@ -285,7 +286,7 @@
               <w:rPr>
                 <w:noProof/>
               </w:rPr>
-              <w:instrText xml:space="preserve"> PAGEREF _Toc242264009 \h </w:instrText>
+              <w:instrText xml:space="preserve"> PAGEREF _Toc242264564 \h </w:instrText>
             </w:r>
             <w:r>
               <w:rPr>
@@ -327,7 +328,7 @@
               <w14:ligatures w14:val="standardContextual"/>
             </w:rPr>
           </w:pPr>
-          <w:hyperlink w:anchor="_Toc242264010" w:history="1">
+          <w:hyperlink w:anchor="_Toc242264565" w:history="1">
             <w:r>
               <w:rPr>
                 <w:rStyle w:val="Hipervnculo"/>
@@ -351,7 +352,7 @@
               <w:rPr>
                 <w:noProof/>
               </w:rPr>
-              <w:instrText xml:space="preserve"> PAGEREF _Toc242264010 \h </w:instrText>
+              <w:instrText xml:space="preserve"> PAGEREF _Toc242264565 \h </w:instrText>
             </w:r>
             <w:r>
               <w:rPr>
@@ -393,7 +394,7 @@
               <w14:ligatures w14:val="standardContextual"/>
             </w:rPr>
           </w:pPr>
-          <w:hyperlink w:anchor="_Toc242264011" w:history="1">
+          <w:hyperlink w:anchor="_Toc242264566" w:history="1">
             <w:r>
               <w:rPr>
                 <w:rStyle w:val="Hipervnculo"/>
@@ -417,7 +418,7 @@
               <w:rPr>
                 <w:noProof/>
               </w:rPr>
-              <w:instrText xml:space="preserve"> PAGEREF _Toc242264011 \h </w:instrText>
+              <w:instrText xml:space="preserve"> PAGEREF _Toc242264566 \h </w:instrText>
             </w:r>
             <w:r>
               <w:rPr>
@@ -459,7 +460,7 @@
               <w14:ligatures w14:val="standardContextual"/>
             </w:rPr>
           </w:pPr>
-          <w:hyperlink w:anchor="_Toc242264012" w:history="1">
+          <w:hyperlink w:anchor="_Toc242264567" w:history="1">
             <w:r>
               <w:rPr>
                 <w:rStyle w:val="Hipervnculo"/>
@@ -483,7 +484,7 @@
               <w:rPr>
                 <w:noProof/>
               </w:rPr>
-              <w:instrText xml:space="preserve"> PAGEREF _Toc242264012 \h </w:instrText>
+              <w:instrText xml:space="preserve"> PAGEREF _Toc242264567 \h </w:instrText>
             </w:r>
             <w:r>
               <w:rPr>
@@ -525,7 +526,7 @@
               <w14:ligatures w14:val="standardContextual"/>
             </w:rPr>
           </w:pPr>
-          <w:hyperlink w:anchor="_Toc242264013" w:history="1">
+          <w:hyperlink w:anchor="_Toc242264568" w:history="1">
             <w:r>
               <w:rPr>
                 <w:rStyle w:val="Hipervnculo"/>
@@ -549,7 +550,7 @@
               <w:rPr>
                 <w:noProof/>
               </w:rPr>
-              <w:instrText xml:space="preserve"> PAGEREF _Toc242264013 \h </w:instrText>
+              <w:instrText xml:space="preserve"> PAGEREF _Toc242264568 \h </w:instrText>
             </w:r>
             <w:r>
               <w:rPr>
@@ -591,7 +592,7 @@
               <w14:ligatures w14:val="standardContextual"/>
             </w:rPr>
           </w:pPr>
-          <w:hyperlink w:anchor="_Toc242264014" w:history="1">
+          <w:hyperlink w:anchor="_Toc242264569" w:history="1">
             <w:r>
               <w:rPr>
                 <w:rStyle w:val="Hipervnculo"/>
@@ -615,7 +616,7 @@
               <w:rPr>
                 <w:noProof/>
               </w:rPr>
-              <w:instrText xml:space="preserve"> PAGEREF _Toc242264014 \h </w:instrText>
+              <w:instrText xml:space="preserve"> PAGEREF _Toc242264569 \h </w:instrText>
             </w:r>
             <w:r>
               <w:rPr>
@@ -657,7 +658,7 @@
               <w14:ligatures w14:val="standardContextual"/>
             </w:rPr>
           </w:pPr>
-          <w:hyperlink w:anchor="_Toc242264015" w:history="1">
+          <w:hyperlink w:anchor="_Toc242264570" w:history="1">
             <w:r>
               <w:rPr>
                 <w:rStyle w:val="Hipervnculo"/>
@@ -681,7 +682,7 @@
               <w:rPr>
                 <w:noProof/>
               </w:rPr>
-              <w:instrText xml:space="preserve"> PAGEREF _Toc242264015 \h </w:instrText>
+              <w:instrText xml:space="preserve"> PAGEREF _Toc242264570 \h </w:instrText>
             </w:r>
             <w:r>
               <w:rPr>
@@ -723,7 +724,7 @@
               <w14:ligatures w14:val="standardContextual"/>
             </w:rPr>
           </w:pPr>
-          <w:hyperlink w:anchor="_Toc242264016" w:history="1">
+          <w:hyperlink w:anchor="_Toc242264571" w:history="1">
             <w:r>
               <w:rPr>
                 <w:rStyle w:val="Hipervnculo"/>
@@ -747,7 +748,7 @@
               <w:rPr>
                 <w:noProof/>
               </w:rPr>
-              <w:instrText xml:space="preserve"> PAGEREF _Toc242264016 \h </w:instrText>
+              <w:instrText xml:space="preserve"> PAGEREF _Toc242264571 \h </w:instrText>
             </w:r>
             <w:r>
               <w:rPr>
@@ -789,7 +790,7 @@
               <w14:ligatures w14:val="standardContextual"/>
             </w:rPr>
           </w:pPr>
-          <w:hyperlink w:anchor="_Toc242264017" w:history="1">
+          <w:hyperlink w:anchor="_Toc242264572" w:history="1">
             <w:r>
               <w:rPr>
                 <w:rStyle w:val="Hipervnculo"/>
@@ -813,7 +814,7 @@
               <w:rPr>
                 <w:noProof/>
               </w:rPr>
-              <w:instrText xml:space="preserve"> PAGEREF _Toc242264017 \h </w:instrText>
+              <w:instrText xml:space="preserve"> PAGEREF _Toc242264572 \h </w:instrText>
             </w:r>
             <w:r>
               <w:rPr>
@@ -855,7 +856,7 @@
               <w14:ligatures w14:val="standardContextual"/>
             </w:rPr>
           </w:pPr>
-          <w:hyperlink w:anchor="_Toc242264018" w:history="1">
+          <w:hyperlink w:anchor="_Toc242264573" w:history="1">
             <w:r>
               <w:rPr>
                 <w:rStyle w:val="Hipervnculo"/>
@@ -879,7 +880,7 @@
               <w:rPr>
                 <w:noProof/>
               </w:rPr>
-              <w:instrText xml:space="preserve"> PAGEREF _Toc242264018 \h </w:instrText>
+              <w:instrText xml:space="preserve"> PAGEREF _Toc242264573 \h </w:instrText>
             </w:r>
             <w:r>
               <w:rPr>
@@ -921,7 +922,7 @@
               <w14:ligatures w14:val="standardContextual"/>
             </w:rPr>
           </w:pPr>
-          <w:hyperlink w:anchor="_Toc242264019" w:history="1">
+          <w:hyperlink w:anchor="_Toc242264574" w:history="1">
             <w:r>
               <w:rPr>
                 <w:rStyle w:val="Hipervnculo"/>
@@ -945,7 +946,7 @@
               <w:rPr>
                 <w:noProof/>
               </w:rPr>
-              <w:instrText xml:space="preserve"> PAGEREF _Toc242264019 \h </w:instrText>
+              <w:instrText xml:space="preserve"> PAGEREF _Toc242264574 \h </w:instrText>
             </w:r>
             <w:r>
               <w:rPr>
@@ -998,8 +999,9 @@
       <w:pPr>
         <w:pStyle w:val="Ttulo1"/>
       </w:pPr>
-      <w:bookmarkStart w:id="0" w:name="_Toc242264008"/>
-      <w:r>
+      <w:bookmarkStart w:id="0" w:name="_Toc242264563"/>
+      <w:r>
+        <w:lastRenderedPageBreak/>
         <w:t>1. Introducción</w:t>
       </w:r>
       <w:bookmarkEnd w:id="0"/>
@@ -1026,7 +1028,7 @@
       <w:pPr>
         <w:pStyle w:val="Ttulo1"/>
       </w:pPr>
-      <w:bookmarkStart w:id="1" w:name="_Toc242264009"/>
+      <w:bookmarkStart w:id="1" w:name="_Toc242264564"/>
       <w:r>
         <w:t>2. Descripción del conjunto de datos</w:t>
       </w:r>
@@ -1038,10 +1040,7 @@
         <w:jc w:val="both"/>
       </w:pPr>
       <w:r>
-        <w:t>Se utilizó el conjunto publicado en Kaggle como Supermarket Dataset (archivo supermarket_data.csv). Aunque el nombre sugiere un supermercado, su contenido es la hoja "Year 2010-2011" del conjunto Online Retail II de UCI (Chen, 2019), con las mismas columnas y las mismas 541,910 filas. Contiene las líneas de venta de una tienda en línea con sede en Reino Unido que vende principalmente artículos de regalo y decoración, muchos de ellos a clientes mayoristas. Cada fila corresponde a un producto dentro de una fa</w:t>
-      </w:r>
-      <w:r>
-        <w:t>ctura, por lo que una factura con diez productos distintos ocupa diez filas.</w:t>
+        <w:t>Se utilizó el conjunto publicado en Kaggle como Supermarket Dataset (archivo supermarket_data.csv). Aunque el nombre sugiere un supermercado, su contenido es la hoja "Year 2010-2011" del conjunto Online Retail II de UCI (Chen, 2019), con las mismas columnas y las mismas 541,910 filas. Contiene las líneas de venta de una tienda en línea con sede en Reino Unido que vende principalmente artículos de regalo y decoración, muchos de ellos a clientes mayoristas. Cada fila corresponde a un producto dentro de una factura, por lo que una factura con diez productos distintos ocupa diez filas.</w:t>
       </w:r>
     </w:p>
     <w:p>
@@ -1089,12 +1088,6 @@
         <w:gridCol w:w="5760"/>
       </w:tblGrid>
       <w:tr>
-        <w:tblPrEx>
-          <w:tblCellMar>
-            <w:top w:w="0" w:type="dxa"/>
-            <w:bottom w:w="0" w:type="dxa"/>
-          </w:tblCellMar>
-        </w:tblPrEx>
         <w:trPr>
           <w:tblHeader/>
           <w:jc w:val="center"/>
@@ -1169,12 +1162,6 @@
         </w:tc>
       </w:tr>
       <w:tr>
-        <w:tblPrEx>
-          <w:tblCellMar>
-            <w:top w:w="0" w:type="dxa"/>
-            <w:bottom w:w="0" w:type="dxa"/>
-          </w:tblCellMar>
-        </w:tblPrEx>
         <w:trPr>
           <w:cantSplit/>
           <w:jc w:val="center"/>
@@ -1243,12 +1230,6 @@
         </w:tc>
       </w:tr>
       <w:tr>
-        <w:tblPrEx>
-          <w:tblCellMar>
-            <w:top w:w="0" w:type="dxa"/>
-            <w:bottom w:w="0" w:type="dxa"/>
-          </w:tblCellMar>
-        </w:tblPrEx>
         <w:trPr>
           <w:cantSplit/>
           <w:jc w:val="center"/>
@@ -1317,12 +1298,6 @@
         </w:tc>
       </w:tr>
       <w:tr>
-        <w:tblPrEx>
-          <w:tblCellMar>
-            <w:top w:w="0" w:type="dxa"/>
-            <w:bottom w:w="0" w:type="dxa"/>
-          </w:tblCellMar>
-        </w:tblPrEx>
         <w:trPr>
           <w:cantSplit/>
           <w:jc w:val="center"/>
@@ -1391,12 +1366,6 @@
         </w:tc>
       </w:tr>
       <w:tr>
-        <w:tblPrEx>
-          <w:tblCellMar>
-            <w:top w:w="0" w:type="dxa"/>
-            <w:bottom w:w="0" w:type="dxa"/>
-          </w:tblCellMar>
-        </w:tblPrEx>
         <w:trPr>
           <w:cantSplit/>
           <w:jc w:val="center"/>
@@ -1465,12 +1434,6 @@
         </w:tc>
       </w:tr>
       <w:tr>
-        <w:tblPrEx>
-          <w:tblCellMar>
-            <w:top w:w="0" w:type="dxa"/>
-            <w:bottom w:w="0" w:type="dxa"/>
-          </w:tblCellMar>
-        </w:tblPrEx>
         <w:trPr>
           <w:cantSplit/>
           <w:jc w:val="center"/>
@@ -1539,12 +1502,6 @@
         </w:tc>
       </w:tr>
       <w:tr>
-        <w:tblPrEx>
-          <w:tblCellMar>
-            <w:top w:w="0" w:type="dxa"/>
-            <w:bottom w:w="0" w:type="dxa"/>
-          </w:tblCellMar>
-        </w:tblPrEx>
         <w:trPr>
           <w:cantSplit/>
           <w:jc w:val="center"/>
@@ -1640,6 +1597,7 @@
           <w:sz w:val="20"/>
           <w:szCs w:val="20"/>
         </w:rPr>
+        <w:lastRenderedPageBreak/>
         <w:t xml:space="preserve">Tabla 2. </w:t>
       </w:r>
       <w:r>
@@ -1674,12 +1632,6 @@
         <w:gridCol w:w="6160"/>
       </w:tblGrid>
       <w:tr>
-        <w:tblPrEx>
-          <w:tblCellMar>
-            <w:top w:w="0" w:type="dxa"/>
-            <w:bottom w:w="0" w:type="dxa"/>
-          </w:tblCellMar>
-        </w:tblPrEx>
         <w:trPr>
           <w:tblHeader/>
           <w:jc w:val="center"/>
@@ -1788,12 +1740,6 @@
         </w:tc>
       </w:tr>
       <w:tr>
-        <w:tblPrEx>
-          <w:tblCellMar>
-            <w:top w:w="0" w:type="dxa"/>
-            <w:bottom w:w="0" w:type="dxa"/>
-          </w:tblCellMar>
-        </w:tblPrEx>
         <w:trPr>
           <w:cantSplit/>
           <w:jc w:val="center"/>
@@ -1893,12 +1839,6 @@
         </w:tc>
       </w:tr>
       <w:tr>
-        <w:tblPrEx>
-          <w:tblCellMar>
-            <w:top w:w="0" w:type="dxa"/>
-            <w:bottom w:w="0" w:type="dxa"/>
-          </w:tblCellMar>
-        </w:tblPrEx>
         <w:trPr>
           <w:cantSplit/>
           <w:jc w:val="center"/>
@@ -1998,12 +1938,6 @@
         </w:tc>
       </w:tr>
       <w:tr>
-        <w:tblPrEx>
-          <w:tblCellMar>
-            <w:top w:w="0" w:type="dxa"/>
-            <w:bottom w:w="0" w:type="dxa"/>
-          </w:tblCellMar>
-        </w:tblPrEx>
         <w:trPr>
           <w:cantSplit/>
           <w:jc w:val="center"/>
@@ -2103,12 +2037,6 @@
         </w:tc>
       </w:tr>
       <w:tr>
-        <w:tblPrEx>
-          <w:tblCellMar>
-            <w:top w:w="0" w:type="dxa"/>
-            <w:bottom w:w="0" w:type="dxa"/>
-          </w:tblCellMar>
-        </w:tblPrEx>
         <w:trPr>
           <w:cantSplit/>
           <w:jc w:val="center"/>
@@ -2208,12 +2136,6 @@
         </w:tc>
       </w:tr>
       <w:tr>
-        <w:tblPrEx>
-          <w:tblCellMar>
-            <w:top w:w="0" w:type="dxa"/>
-            <w:bottom w:w="0" w:type="dxa"/>
-          </w:tblCellMar>
-        </w:tblPrEx>
         <w:trPr>
           <w:cantSplit/>
           <w:jc w:val="center"/>
@@ -2313,12 +2235,6 @@
         </w:tc>
       </w:tr>
       <w:tr>
-        <w:tblPrEx>
-          <w:tblCellMar>
-            <w:top w:w="0" w:type="dxa"/>
-            <w:bottom w:w="0" w:type="dxa"/>
-          </w:tblCellMar>
-        </w:tblPrEx>
         <w:trPr>
           <w:cantSplit/>
           <w:jc w:val="center"/>
@@ -2418,12 +2334,6 @@
         </w:tc>
       </w:tr>
       <w:tr>
-        <w:tblPrEx>
-          <w:tblCellMar>
-            <w:top w:w="0" w:type="dxa"/>
-            <w:bottom w:w="0" w:type="dxa"/>
-          </w:tblCellMar>
-        </w:tblPrEx>
         <w:trPr>
           <w:cantSplit/>
           <w:jc w:val="center"/>
@@ -2523,12 +2433,6 @@
         </w:tc>
       </w:tr>
       <w:tr>
-        <w:tblPrEx>
-          <w:tblCellMar>
-            <w:top w:w="0" w:type="dxa"/>
-            <w:bottom w:w="0" w:type="dxa"/>
-          </w:tblCellMar>
-        </w:tblPrEx>
         <w:trPr>
           <w:cantSplit/>
           <w:jc w:val="center"/>
@@ -2647,7 +2551,7 @@
       <w:pPr>
         <w:pStyle w:val="Ttulo1"/>
       </w:pPr>
-      <w:bookmarkStart w:id="2" w:name="_Toc242264010"/>
+      <w:bookmarkStart w:id="2" w:name="_Toc242264565"/>
       <w:r>
         <w:t>3. Limpieza de datos</w:t>
       </w:r>
@@ -2707,12 +2611,6 @@
         <w:gridCol w:w="2400"/>
       </w:tblGrid>
       <w:tr>
-        <w:tblPrEx>
-          <w:tblCellMar>
-            <w:top w:w="0" w:type="dxa"/>
-            <w:bottom w:w="0" w:type="dxa"/>
-          </w:tblCellMar>
-        </w:tblPrEx>
         <w:trPr>
           <w:tblHeader/>
           <w:jc w:val="center"/>
@@ -2787,12 +2685,6 @@
         </w:tc>
       </w:tr>
       <w:tr>
-        <w:tblPrEx>
-          <w:tblCellMar>
-            <w:top w:w="0" w:type="dxa"/>
-            <w:bottom w:w="0" w:type="dxa"/>
-          </w:tblCellMar>
-        </w:tblPrEx>
         <w:trPr>
           <w:cantSplit/>
           <w:jc w:val="center"/>
@@ -2862,12 +2754,6 @@
         </w:tc>
       </w:tr>
       <w:tr>
-        <w:tblPrEx>
-          <w:tblCellMar>
-            <w:top w:w="0" w:type="dxa"/>
-            <w:bottom w:w="0" w:type="dxa"/>
-          </w:tblCellMar>
-        </w:tblPrEx>
         <w:trPr>
           <w:cantSplit/>
           <w:jc w:val="center"/>
@@ -2937,12 +2823,6 @@
         </w:tc>
       </w:tr>
       <w:tr>
-        <w:tblPrEx>
-          <w:tblCellMar>
-            <w:top w:w="0" w:type="dxa"/>
-            <w:bottom w:w="0" w:type="dxa"/>
-          </w:tblCellMar>
-        </w:tblPrEx>
         <w:trPr>
           <w:cantSplit/>
           <w:jc w:val="center"/>
@@ -3012,12 +2892,6 @@
         </w:tc>
       </w:tr>
       <w:tr>
-        <w:tblPrEx>
-          <w:tblCellMar>
-            <w:top w:w="0" w:type="dxa"/>
-            <w:bottom w:w="0" w:type="dxa"/>
-          </w:tblCellMar>
-        </w:tblPrEx>
         <w:trPr>
           <w:cantSplit/>
           <w:jc w:val="center"/>
@@ -3087,12 +2961,6 @@
         </w:tc>
       </w:tr>
       <w:tr>
-        <w:tblPrEx>
-          <w:tblCellMar>
-            <w:top w:w="0" w:type="dxa"/>
-            <w:bottom w:w="0" w:type="dxa"/>
-          </w:tblCellMar>
-        </w:tblPrEx>
         <w:trPr>
           <w:cantSplit/>
           <w:jc w:val="center"/>
@@ -3162,12 +3030,6 @@
         </w:tc>
       </w:tr>
       <w:tr>
-        <w:tblPrEx>
-          <w:tblCellMar>
-            <w:top w:w="0" w:type="dxa"/>
-            <w:bottom w:w="0" w:type="dxa"/>
-          </w:tblCellMar>
-        </w:tblPrEx>
         <w:trPr>
           <w:cantSplit/>
           <w:jc w:val="center"/>
@@ -3237,12 +3099,6 @@
         </w:tc>
       </w:tr>
       <w:tr>
-        <w:tblPrEx>
-          <w:tblCellMar>
-            <w:top w:w="0" w:type="dxa"/>
-            <w:bottom w:w="0" w:type="dxa"/>
-          </w:tblCellMar>
-        </w:tblPrEx>
         <w:trPr>
           <w:cantSplit/>
           <w:jc w:val="center"/>
@@ -3312,12 +3168,6 @@
         </w:tc>
       </w:tr>
       <w:tr>
-        <w:tblPrEx>
-          <w:tblCellMar>
-            <w:top w:w="0" w:type="dxa"/>
-            <w:bottom w:w="0" w:type="dxa"/>
-          </w:tblCellMar>
-        </w:tblPrEx>
         <w:trPr>
           <w:cantSplit/>
           <w:jc w:val="center"/>
@@ -3387,12 +3237,6 @@
         </w:tc>
       </w:tr>
       <w:tr>
-        <w:tblPrEx>
-          <w:tblCellMar>
-            <w:top w:w="0" w:type="dxa"/>
-            <w:bottom w:w="0" w:type="dxa"/>
-          </w:tblCellMar>
-        </w:tblPrEx>
         <w:trPr>
           <w:cantSplit/>
           <w:jc w:val="center"/>
@@ -3462,12 +3306,6 @@
         </w:tc>
       </w:tr>
       <w:tr>
-        <w:tblPrEx>
-          <w:tblCellMar>
-            <w:top w:w="0" w:type="dxa"/>
-            <w:bottom w:w="0" w:type="dxa"/>
-          </w:tblCellMar>
-        </w:tblPrEx>
         <w:trPr>
           <w:cantSplit/>
           <w:jc w:val="center"/>
@@ -3573,6 +3411,7 @@
           <w:sz w:val="20"/>
           <w:szCs w:val="20"/>
         </w:rPr>
+        <w:lastRenderedPageBreak/>
         <w:t xml:space="preserve">Tabla 4. </w:t>
       </w:r>
       <w:r>
@@ -3609,12 +3448,6 @@
         <w:gridCol w:w="1520"/>
       </w:tblGrid>
       <w:tr>
-        <w:tblPrEx>
-          <w:tblCellMar>
-            <w:top w:w="0" w:type="dxa"/>
-            <w:bottom w:w="0" w:type="dxa"/>
-          </w:tblCellMar>
-        </w:tblPrEx>
         <w:trPr>
           <w:tblHeader/>
           <w:jc w:val="center"/>
@@ -3791,12 +3624,6 @@
         </w:tc>
       </w:tr>
       <w:tr>
-        <w:tblPrEx>
-          <w:tblCellMar>
-            <w:top w:w="0" w:type="dxa"/>
-            <w:bottom w:w="0" w:type="dxa"/>
-          </w:tblCellMar>
-        </w:tblPrEx>
         <w:trPr>
           <w:cantSplit/>
           <w:jc w:val="center"/>
@@ -3961,12 +3788,6 @@
         </w:tc>
       </w:tr>
       <w:tr>
-        <w:tblPrEx>
-          <w:tblCellMar>
-            <w:top w:w="0" w:type="dxa"/>
-            <w:bottom w:w="0" w:type="dxa"/>
-          </w:tblCellMar>
-        </w:tblPrEx>
         <w:trPr>
           <w:cantSplit/>
           <w:jc w:val="center"/>
@@ -4131,12 +3952,6 @@
         </w:tc>
       </w:tr>
       <w:tr>
-        <w:tblPrEx>
-          <w:tblCellMar>
-            <w:top w:w="0" w:type="dxa"/>
-            <w:bottom w:w="0" w:type="dxa"/>
-          </w:tblCellMar>
-        </w:tblPrEx>
         <w:trPr>
           <w:cantSplit/>
           <w:jc w:val="center"/>
@@ -4301,12 +4116,6 @@
         </w:tc>
       </w:tr>
       <w:tr>
-        <w:tblPrEx>
-          <w:tblCellMar>
-            <w:top w:w="0" w:type="dxa"/>
-            <w:bottom w:w="0" w:type="dxa"/>
-          </w:tblCellMar>
-        </w:tblPrEx>
         <w:trPr>
           <w:cantSplit/>
           <w:jc w:val="center"/>
@@ -4471,12 +4280,6 @@
         </w:tc>
       </w:tr>
       <w:tr>
-        <w:tblPrEx>
-          <w:tblCellMar>
-            <w:top w:w="0" w:type="dxa"/>
-            <w:bottom w:w="0" w:type="dxa"/>
-          </w:tblCellMar>
-        </w:tblPrEx>
         <w:trPr>
           <w:cantSplit/>
           <w:jc w:val="center"/>
@@ -4641,12 +4444,6 @@
         </w:tc>
       </w:tr>
       <w:tr>
-        <w:tblPrEx>
-          <w:tblCellMar>
-            <w:top w:w="0" w:type="dxa"/>
-            <w:bottom w:w="0" w:type="dxa"/>
-          </w:tblCellMar>
-        </w:tblPrEx>
         <w:trPr>
           <w:cantSplit/>
           <w:jc w:val="center"/>
@@ -4811,12 +4608,6 @@
         </w:tc>
       </w:tr>
       <w:tr>
-        <w:tblPrEx>
-          <w:tblCellMar>
-            <w:top w:w="0" w:type="dxa"/>
-            <w:bottom w:w="0" w:type="dxa"/>
-          </w:tblCellMar>
-        </w:tblPrEx>
         <w:trPr>
           <w:cantSplit/>
           <w:jc w:val="center"/>
@@ -4981,12 +4772,6 @@
         </w:tc>
       </w:tr>
       <w:tr>
-        <w:tblPrEx>
-          <w:tblCellMar>
-            <w:top w:w="0" w:type="dxa"/>
-            <w:bottom w:w="0" w:type="dxa"/>
-          </w:tblCellMar>
-        </w:tblPrEx>
         <w:trPr>
           <w:cantSplit/>
           <w:jc w:val="center"/>
@@ -5151,12 +4936,6 @@
         </w:tc>
       </w:tr>
       <w:tr>
-        <w:tblPrEx>
-          <w:tblCellMar>
-            <w:top w:w="0" w:type="dxa"/>
-            <w:bottom w:w="0" w:type="dxa"/>
-          </w:tblCellMar>
-        </w:tblPrEx>
         <w:trPr>
           <w:cantSplit/>
           <w:jc w:val="center"/>
@@ -5321,12 +5100,6 @@
         </w:tc>
       </w:tr>
       <w:tr>
-        <w:tblPrEx>
-          <w:tblCellMar>
-            <w:top w:w="0" w:type="dxa"/>
-            <w:bottom w:w="0" w:type="dxa"/>
-          </w:tblCellMar>
-        </w:tblPrEx>
         <w:trPr>
           <w:cantSplit/>
           <w:jc w:val="center"/>
@@ -5491,12 +5264,6 @@
         </w:tc>
       </w:tr>
       <w:tr>
-        <w:tblPrEx>
-          <w:tblCellMar>
-            <w:top w:w="0" w:type="dxa"/>
-            <w:bottom w:w="0" w:type="dxa"/>
-          </w:tblCellMar>
-        </w:tblPrEx>
         <w:trPr>
           <w:cantSplit/>
           <w:jc w:val="center"/>
@@ -5690,7 +5457,7 @@
       <w:pPr>
         <w:pStyle w:val="Ttulo2"/>
       </w:pPr>
-      <w:bookmarkStart w:id="3" w:name="_Toc242264011"/>
+      <w:bookmarkStart w:id="3" w:name="_Toc242264566"/>
       <w:r>
         <w:t>3.1 Justificación de las reglas</w:t>
       </w:r>
@@ -5795,6 +5562,7 @@
           <w:b/>
           <w:bCs/>
         </w:rPr>
+        <w:lastRenderedPageBreak/>
         <w:t xml:space="preserve">Cantidad o precio menor o igual a cero. </w:t>
       </w:r>
       <w:r>
@@ -5880,17 +5648,14 @@
         <w:t>519,231 líneas de venta</w:t>
       </w:r>
       <w:r>
-        <w:t xml:space="preserve"> (95.81 % del original), con 3,790 productos distintos, 19,627 facturas, 4,322 clientes registrados y 38 países. El ingreso total por venta de productos es de £9,798,951.95. Se agregó la columna Total, que es el importe de cada línea (Quantity × Price). Al final del proceso, el notebook comprueba que no queden duplicados, cancelaciones, cantidades o precios menores o iguales a cero, ni códigos de servicio. De los 4,070 códigos originales, 112 eran el mismo código escrito con minúsculas, 19 eran códigos de s</w:t>
-      </w:r>
-      <w:r>
-        <w:t>ervicio o vales de regalo y 149 no tenían ninguna venta válida, por lo que quedan 3,790 productos, muchos más que los 150 que pide el proyecto.</w:t>
+        <w:t xml:space="preserve"> (95.81 % del original), con 3,790 productos distintos, 19,627 facturas, 4,322 clientes registrados y 38 países. El ingreso total por venta de productos es de £9,798,951.95. Se agregó la columna Total, que es el importe de cada línea (Quantity × Price). Al final del proceso, el notebook comprueba que no queden duplicados, cancelaciones, cantidades o precios menores o iguales a cero, ni códigos de servicio. De los 4,070 códigos originales, 112 eran el mismo código escrito con minúsculas, 19 eran códigos de servicio o vales de regalo y 149 no tenían ninguna venta válida, por lo que quedan 3,790 productos, muchos más que los 150 que pide el proyecto.</w:t>
       </w:r>
     </w:p>
     <w:p>
       <w:pPr>
         <w:pStyle w:val="Ttulo1"/>
       </w:pPr>
-      <w:bookmarkStart w:id="4" w:name="_Toc242264012"/>
+      <w:bookmarkStart w:id="4" w:name="_Toc242264567"/>
       <w:r>
         <w:t>4. Análisis estadístico descriptivo</w:t>
       </w:r>
@@ -5952,12 +5717,6 @@
         <w:gridCol w:w="2000"/>
       </w:tblGrid>
       <w:tr>
-        <w:tblPrEx>
-          <w:tblCellMar>
-            <w:top w:w="0" w:type="dxa"/>
-            <w:bottom w:w="0" w:type="dxa"/>
-          </w:tblCellMar>
-        </w:tblPrEx>
         <w:trPr>
           <w:tblHeader/>
           <w:jc w:val="center"/>
@@ -6100,12 +5859,6 @@
         </w:tc>
       </w:tr>
       <w:tr>
-        <w:tblPrEx>
-          <w:tblCellMar>
-            <w:top w:w="0" w:type="dxa"/>
-            <w:bottom w:w="0" w:type="dxa"/>
-          </w:tblCellMar>
-        </w:tblPrEx>
         <w:trPr>
           <w:cantSplit/>
           <w:jc w:val="center"/>
@@ -6239,12 +5992,6 @@
         </w:tc>
       </w:tr>
       <w:tr>
-        <w:tblPrEx>
-          <w:tblCellMar>
-            <w:top w:w="0" w:type="dxa"/>
-            <w:bottom w:w="0" w:type="dxa"/>
-          </w:tblCellMar>
-        </w:tblPrEx>
         <w:trPr>
           <w:cantSplit/>
           <w:jc w:val="center"/>
@@ -6378,12 +6125,6 @@
         </w:tc>
       </w:tr>
       <w:tr>
-        <w:tblPrEx>
-          <w:tblCellMar>
-            <w:top w:w="0" w:type="dxa"/>
-            <w:bottom w:w="0" w:type="dxa"/>
-          </w:tblCellMar>
-        </w:tblPrEx>
         <w:trPr>
           <w:cantSplit/>
           <w:jc w:val="center"/>
@@ -6517,12 +6258,6 @@
         </w:tc>
       </w:tr>
       <w:tr>
-        <w:tblPrEx>
-          <w:tblCellMar>
-            <w:top w:w="0" w:type="dxa"/>
-            <w:bottom w:w="0" w:type="dxa"/>
-          </w:tblCellMar>
-        </w:tblPrEx>
         <w:trPr>
           <w:cantSplit/>
           <w:jc w:val="center"/>
@@ -6656,12 +6391,6 @@
         </w:tc>
       </w:tr>
       <w:tr>
-        <w:tblPrEx>
-          <w:tblCellMar>
-            <w:top w:w="0" w:type="dxa"/>
-            <w:bottom w:w="0" w:type="dxa"/>
-          </w:tblCellMar>
-        </w:tblPrEx>
         <w:trPr>
           <w:cantSplit/>
           <w:jc w:val="center"/>
@@ -6795,12 +6524,6 @@
         </w:tc>
       </w:tr>
       <w:tr>
-        <w:tblPrEx>
-          <w:tblCellMar>
-            <w:top w:w="0" w:type="dxa"/>
-            <w:bottom w:w="0" w:type="dxa"/>
-          </w:tblCellMar>
-        </w:tblPrEx>
         <w:trPr>
           <w:cantSplit/>
           <w:jc w:val="center"/>
@@ -6934,12 +6657,6 @@
         </w:tc>
       </w:tr>
       <w:tr>
-        <w:tblPrEx>
-          <w:tblCellMar>
-            <w:top w:w="0" w:type="dxa"/>
-            <w:bottom w:w="0" w:type="dxa"/>
-          </w:tblCellMar>
-        </w:tblPrEx>
         <w:trPr>
           <w:cantSplit/>
           <w:jc w:val="center"/>
@@ -7073,12 +6790,6 @@
         </w:tc>
       </w:tr>
       <w:tr>
-        <w:tblPrEx>
-          <w:tblCellMar>
-            <w:top w:w="0" w:type="dxa"/>
-            <w:bottom w:w="0" w:type="dxa"/>
-          </w:tblCellMar>
-        </w:tblPrEx>
         <w:trPr>
           <w:cantSplit/>
           <w:jc w:val="center"/>
@@ -7212,12 +6923,6 @@
         </w:tc>
       </w:tr>
       <w:tr>
-        <w:tblPrEx>
-          <w:tblCellMar>
-            <w:top w:w="0" w:type="dxa"/>
-            <w:bottom w:w="0" w:type="dxa"/>
-          </w:tblCellMar>
-        </w:tblPrEx>
         <w:trPr>
           <w:cantSplit/>
           <w:jc w:val="center"/>
@@ -7351,12 +7056,6 @@
         </w:tc>
       </w:tr>
       <w:tr>
-        <w:tblPrEx>
-          <w:tblCellMar>
-            <w:top w:w="0" w:type="dxa"/>
-            <w:bottom w:w="0" w:type="dxa"/>
-          </w:tblCellMar>
-        </w:tblPrEx>
         <w:trPr>
           <w:cantSplit/>
           <w:jc w:val="center"/>
@@ -7490,12 +7189,6 @@
         </w:tc>
       </w:tr>
       <w:tr>
-        <w:tblPrEx>
-          <w:tblCellMar>
-            <w:top w:w="0" w:type="dxa"/>
-            <w:bottom w:w="0" w:type="dxa"/>
-          </w:tblCellMar>
-        </w:tblPrEx>
         <w:trPr>
           <w:cantSplit/>
           <w:jc w:val="center"/>
@@ -7629,12 +7322,6 @@
         </w:tc>
       </w:tr>
       <w:tr>
-        <w:tblPrEx>
-          <w:tblCellMar>
-            <w:top w:w="0" w:type="dxa"/>
-            <w:bottom w:w="0" w:type="dxa"/>
-          </w:tblCellMar>
-        </w:tblPrEx>
         <w:trPr>
           <w:cantSplit/>
           <w:jc w:val="center"/>
@@ -7768,12 +7455,6 @@
         </w:tc>
       </w:tr>
       <w:tr>
-        <w:tblPrEx>
-          <w:tblCellMar>
-            <w:top w:w="0" w:type="dxa"/>
-            <w:bottom w:w="0" w:type="dxa"/>
-          </w:tblCellMar>
-        </w:tblPrEx>
         <w:trPr>
           <w:cantSplit/>
           <w:jc w:val="center"/>
@@ -7907,12 +7588,6 @@
         </w:tc>
       </w:tr>
       <w:tr>
-        <w:tblPrEx>
-          <w:tblCellMar>
-            <w:top w:w="0" w:type="dxa"/>
-            <w:bottom w:w="0" w:type="dxa"/>
-          </w:tblCellMar>
-        </w:tblPrEx>
         <w:trPr>
           <w:cantSplit/>
           <w:jc w:val="center"/>
@@ -8065,7 +7740,7 @@
       <w:pPr>
         <w:pStyle w:val="Ttulo2"/>
       </w:pPr>
-      <w:bookmarkStart w:id="5" w:name="_Toc242264013"/>
+      <w:bookmarkStart w:id="5" w:name="_Toc242264568"/>
       <w:r>
         <w:t>4.1 Tendencia central</w:t>
       </w:r>
@@ -8147,7 +7822,7 @@
       <w:pPr>
         <w:pStyle w:val="Ttulo2"/>
       </w:pPr>
-      <w:bookmarkStart w:id="6" w:name="_Toc242264014"/>
+      <w:bookmarkStart w:id="6" w:name="_Toc242264569"/>
       <w:r>
         <w:t>4.2 Dispersión</w:t>
       </w:r>
@@ -8221,12 +7896,6 @@
         <w:gridCol w:w="1400"/>
       </w:tblGrid>
       <w:tr>
-        <w:tblPrEx>
-          <w:tblCellMar>
-            <w:top w:w="0" w:type="dxa"/>
-            <w:bottom w:w="0" w:type="dxa"/>
-          </w:tblCellMar>
-        </w:tblPrEx>
         <w:trPr>
           <w:tblHeader/>
           <w:jc w:val="center"/>
@@ -8471,12 +8140,6 @@
         </w:tc>
       </w:tr>
       <w:tr>
-        <w:tblPrEx>
-          <w:tblCellMar>
-            <w:top w:w="0" w:type="dxa"/>
-            <w:bottom w:w="0" w:type="dxa"/>
-          </w:tblCellMar>
-        </w:tblPrEx>
         <w:trPr>
           <w:cantSplit/>
           <w:jc w:val="center"/>
@@ -8706,12 +8369,6 @@
         </w:tc>
       </w:tr>
       <w:tr>
-        <w:tblPrEx>
-          <w:tblCellMar>
-            <w:top w:w="0" w:type="dxa"/>
-            <w:bottom w:w="0" w:type="dxa"/>
-          </w:tblCellMar>
-        </w:tblPrEx>
         <w:trPr>
           <w:cantSplit/>
           <w:jc w:val="center"/>
@@ -8941,12 +8598,6 @@
         </w:tc>
       </w:tr>
       <w:tr>
-        <w:tblPrEx>
-          <w:tblCellMar>
-            <w:top w:w="0" w:type="dxa"/>
-            <w:bottom w:w="0" w:type="dxa"/>
-          </w:tblCellMar>
-        </w:tblPrEx>
         <w:trPr>
           <w:cantSplit/>
           <w:jc w:val="center"/>
@@ -9204,7 +8855,7 @@
       <w:pPr>
         <w:pStyle w:val="Ttulo2"/>
       </w:pPr>
-      <w:bookmarkStart w:id="7" w:name="_Toc242264015"/>
+      <w:bookmarkStart w:id="7" w:name="_Toc242264570"/>
       <w:r>
         <w:t>4.3 Covarianza y correlación</w:t>
       </w:r>
@@ -9276,12 +8927,6 @@
         <w:gridCol w:w="2400"/>
       </w:tblGrid>
       <w:tr>
-        <w:tblPrEx>
-          <w:tblCellMar>
-            <w:top w:w="0" w:type="dxa"/>
-            <w:bottom w:w="0" w:type="dxa"/>
-          </w:tblCellMar>
-        </w:tblPrEx>
         <w:trPr>
           <w:tblHeader/>
           <w:jc w:val="center"/>
@@ -9415,12 +9060,6 @@
         </w:tc>
       </w:tr>
       <w:tr>
-        <w:tblPrEx>
-          <w:tblCellMar>
-            <w:top w:w="0" w:type="dxa"/>
-            <w:bottom w:w="0" w:type="dxa"/>
-          </w:tblCellMar>
-        </w:tblPrEx>
         <w:trPr>
           <w:cantSplit/>
           <w:jc w:val="center"/>
@@ -9554,12 +9193,6 @@
         </w:tc>
       </w:tr>
       <w:tr>
-        <w:tblPrEx>
-          <w:tblCellMar>
-            <w:top w:w="0" w:type="dxa"/>
-            <w:bottom w:w="0" w:type="dxa"/>
-          </w:tblCellMar>
-        </w:tblPrEx>
         <w:trPr>
           <w:cantSplit/>
           <w:jc w:val="center"/>
@@ -9693,12 +9326,6 @@
         </w:tc>
       </w:tr>
       <w:tr>
-        <w:tblPrEx>
-          <w:tblCellMar>
-            <w:top w:w="0" w:type="dxa"/>
-            <w:bottom w:w="0" w:type="dxa"/>
-          </w:tblCellMar>
-        </w:tblPrEx>
         <w:trPr>
           <w:cantSplit/>
           <w:jc w:val="center"/>
@@ -9894,12 +9521,6 @@
         <w:gridCol w:w="2000"/>
       </w:tblGrid>
       <w:tr>
-        <w:tblPrEx>
-          <w:tblCellMar>
-            <w:top w:w="0" w:type="dxa"/>
-            <w:bottom w:w="0" w:type="dxa"/>
-          </w:tblCellMar>
-        </w:tblPrEx>
         <w:trPr>
           <w:tblHeader/>
           <w:jc w:val="center"/>
@@ -10042,12 +9663,6 @@
         </w:tc>
       </w:tr>
       <w:tr>
-        <w:tblPrEx>
-          <w:tblCellMar>
-            <w:top w:w="0" w:type="dxa"/>
-            <w:bottom w:w="0" w:type="dxa"/>
-          </w:tblCellMar>
-        </w:tblPrEx>
         <w:trPr>
           <w:cantSplit/>
           <w:jc w:val="center"/>
@@ -10181,12 +9796,6 @@
         </w:tc>
       </w:tr>
       <w:tr>
-        <w:tblPrEx>
-          <w:tblCellMar>
-            <w:top w:w="0" w:type="dxa"/>
-            <w:bottom w:w="0" w:type="dxa"/>
-          </w:tblCellMar>
-        </w:tblPrEx>
         <w:trPr>
           <w:cantSplit/>
           <w:jc w:val="center"/>
@@ -10320,12 +9929,6 @@
         </w:tc>
       </w:tr>
       <w:tr>
-        <w:tblPrEx>
-          <w:tblCellMar>
-            <w:top w:w="0" w:type="dxa"/>
-            <w:bottom w:w="0" w:type="dxa"/>
-          </w:tblCellMar>
-        </w:tblPrEx>
         <w:trPr>
           <w:cantSplit/>
           <w:jc w:val="center"/>
@@ -10517,7 +10120,7 @@
       <w:pPr>
         <w:pStyle w:val="Ttulo2"/>
       </w:pPr>
-      <w:bookmarkStart w:id="8" w:name="_Toc242264016"/>
+      <w:bookmarkStart w:id="8" w:name="_Toc242264571"/>
       <w:r>
         <w:t>4.4 Análisis por producto</w:t>
       </w:r>
@@ -10580,12 +10183,6 @@
         <w:gridCol w:w="1800"/>
       </w:tblGrid>
       <w:tr>
-        <w:tblPrEx>
-          <w:tblCellMar>
-            <w:top w:w="0" w:type="dxa"/>
-            <w:bottom w:w="0" w:type="dxa"/>
-          </w:tblCellMar>
-        </w:tblPrEx>
         <w:trPr>
           <w:tblHeader/>
           <w:jc w:val="center"/>
@@ -10762,12 +10359,6 @@
         </w:tc>
       </w:tr>
       <w:tr>
-        <w:tblPrEx>
-          <w:tblCellMar>
-            <w:top w:w="0" w:type="dxa"/>
-            <w:bottom w:w="0" w:type="dxa"/>
-          </w:tblCellMar>
-        </w:tblPrEx>
         <w:trPr>
           <w:cantSplit/>
           <w:jc w:val="center"/>
@@ -10933,12 +10524,6 @@
         </w:tc>
       </w:tr>
       <w:tr>
-        <w:tblPrEx>
-          <w:tblCellMar>
-            <w:top w:w="0" w:type="dxa"/>
-            <w:bottom w:w="0" w:type="dxa"/>
-          </w:tblCellMar>
-        </w:tblPrEx>
         <w:trPr>
           <w:cantSplit/>
           <w:jc w:val="center"/>
@@ -11104,12 +10689,6 @@
         </w:tc>
       </w:tr>
       <w:tr>
-        <w:tblPrEx>
-          <w:tblCellMar>
-            <w:top w:w="0" w:type="dxa"/>
-            <w:bottom w:w="0" w:type="dxa"/>
-          </w:tblCellMar>
-        </w:tblPrEx>
         <w:trPr>
           <w:cantSplit/>
           <w:jc w:val="center"/>
@@ -11275,12 +10854,6 @@
         </w:tc>
       </w:tr>
       <w:tr>
-        <w:tblPrEx>
-          <w:tblCellMar>
-            <w:top w:w="0" w:type="dxa"/>
-            <w:bottom w:w="0" w:type="dxa"/>
-          </w:tblCellMar>
-        </w:tblPrEx>
         <w:trPr>
           <w:cantSplit/>
           <w:jc w:val="center"/>
@@ -11446,12 +11019,6 @@
         </w:tc>
       </w:tr>
       <w:tr>
-        <w:tblPrEx>
-          <w:tblCellMar>
-            <w:top w:w="0" w:type="dxa"/>
-            <w:bottom w:w="0" w:type="dxa"/>
-          </w:tblCellMar>
-        </w:tblPrEx>
         <w:trPr>
           <w:cantSplit/>
           <w:jc w:val="center"/>
@@ -11617,12 +11184,6 @@
         </w:tc>
       </w:tr>
       <w:tr>
-        <w:tblPrEx>
-          <w:tblCellMar>
-            <w:top w:w="0" w:type="dxa"/>
-            <w:bottom w:w="0" w:type="dxa"/>
-          </w:tblCellMar>
-        </w:tblPrEx>
         <w:trPr>
           <w:cantSplit/>
           <w:jc w:val="center"/>
@@ -11788,12 +11349,6 @@
         </w:tc>
       </w:tr>
       <w:tr>
-        <w:tblPrEx>
-          <w:tblCellMar>
-            <w:top w:w="0" w:type="dxa"/>
-            <w:bottom w:w="0" w:type="dxa"/>
-          </w:tblCellMar>
-        </w:tblPrEx>
         <w:trPr>
           <w:cantSplit/>
           <w:jc w:val="center"/>
@@ -11959,12 +11514,6 @@
         </w:tc>
       </w:tr>
       <w:tr>
-        <w:tblPrEx>
-          <w:tblCellMar>
-            <w:top w:w="0" w:type="dxa"/>
-            <w:bottom w:w="0" w:type="dxa"/>
-          </w:tblCellMar>
-        </w:tblPrEx>
         <w:trPr>
           <w:cantSplit/>
           <w:jc w:val="center"/>
@@ -12130,12 +11679,6 @@
         </w:tc>
       </w:tr>
       <w:tr>
-        <w:tblPrEx>
-          <w:tblCellMar>
-            <w:top w:w="0" w:type="dxa"/>
-            <w:bottom w:w="0" w:type="dxa"/>
-          </w:tblCellMar>
-        </w:tblPrEx>
         <w:trPr>
           <w:cantSplit/>
           <w:jc w:val="center"/>
@@ -12301,12 +11844,6 @@
         </w:tc>
       </w:tr>
       <w:tr>
-        <w:tblPrEx>
-          <w:tblCellMar>
-            <w:top w:w="0" w:type="dxa"/>
-            <w:bottom w:w="0" w:type="dxa"/>
-          </w:tblCellMar>
-        </w:tblPrEx>
         <w:trPr>
           <w:cantSplit/>
           <w:jc w:val="center"/>
@@ -12472,12 +12009,6 @@
         </w:tc>
       </w:tr>
       <w:tr>
-        <w:tblPrEx>
-          <w:tblCellMar>
-            <w:top w:w="0" w:type="dxa"/>
-            <w:bottom w:w="0" w:type="dxa"/>
-          </w:tblCellMar>
-        </w:tblPrEx>
         <w:trPr>
           <w:cantSplit/>
           <w:jc w:val="center"/>
@@ -12643,12 +12174,6 @@
         </w:tc>
       </w:tr>
       <w:tr>
-        <w:tblPrEx>
-          <w:tblCellMar>
-            <w:top w:w="0" w:type="dxa"/>
-            <w:bottom w:w="0" w:type="dxa"/>
-          </w:tblCellMar>
-        </w:tblPrEx>
         <w:trPr>
           <w:cantSplit/>
           <w:jc w:val="center"/>
@@ -12814,12 +12339,6 @@
         </w:tc>
       </w:tr>
       <w:tr>
-        <w:tblPrEx>
-          <w:tblCellMar>
-            <w:top w:w="0" w:type="dxa"/>
-            <w:bottom w:w="0" w:type="dxa"/>
-          </w:tblCellMar>
-        </w:tblPrEx>
         <w:trPr>
           <w:cantSplit/>
           <w:jc w:val="center"/>
@@ -13013,7 +12532,7 @@
       <w:pPr>
         <w:pStyle w:val="Ttulo1"/>
       </w:pPr>
-      <w:bookmarkStart w:id="9" w:name="_Toc242264017"/>
+      <w:bookmarkStart w:id="9" w:name="_Toc242264572"/>
       <w:r>
         <w:t>5. Visualización de datos</w:t>
       </w:r>
@@ -13039,7 +12558,7 @@
           <w:noProof/>
         </w:rPr>
         <w:drawing>
-          <wp:inline distT="0" distB="0" distL="0" distR="0" wp14:anchorId="3CD7C35B" wp14:editId="3C6E5D0A">
+          <wp:inline distT="0" distB="0" distL="0" distR="0" wp14:anchorId="16F72E13" wp14:editId="23AF3D23">
             <wp:extent cx="5715000" cy="3438525"/>
             <wp:effectExtent l="0" t="0" r="0" b="0"/>
             <wp:docPr id="1" name="fig01_histograma_quantity.png" descr="Histograma de frecuencias de las unidades por línea de venta" title="Histograma de frecuencias de las unidades por línea de venta"/>
@@ -13120,7 +12639,7 @@
           <w:noProof/>
         </w:rPr>
         <w:drawing>
-          <wp:inline distT="0" distB="0" distL="0" distR="0" wp14:anchorId="70F42072" wp14:editId="608DB11E">
+          <wp:inline distT="0" distB="0" distL="0" distR="0" wp14:anchorId="14C91DF7" wp14:editId="028F53B1">
             <wp:extent cx="5715000" cy="3590925"/>
             <wp:effectExtent l="0" t="0" r="0" b="0"/>
             <wp:docPr id="2" name="fig02_densidad_price.png" descr="Histograma y curva de densidad del precio unitario" title="Histograma y curva de densidad del precio unitario"/>
@@ -13201,7 +12720,7 @@
           <w:noProof/>
         </w:rPr>
         <w:drawing>
-          <wp:inline distT="0" distB="0" distL="0" distR="0" wp14:anchorId="36D0C7E8" wp14:editId="0291DA5D">
+          <wp:inline distT="0" distB="0" distL="0" distR="0" wp14:anchorId="4F8A614D" wp14:editId="0AC3A311">
             <wp:extent cx="5715000" cy="3600450"/>
             <wp:effectExtent l="0" t="0" r="0" b="0"/>
             <wp:docPr id="3" name="fig03_densidad_total.png" descr="Curva de densidad del importe por línea en escala logarítmica" title="Curva de densidad del importe por línea en escala logarítmica"/>
@@ -13282,7 +12801,7 @@
           <w:noProof/>
         </w:rPr>
         <w:drawing>
-          <wp:inline distT="0" distB="0" distL="0" distR="0" wp14:anchorId="3072D569" wp14:editId="4071FCC1">
+          <wp:inline distT="0" distB="0" distL="0" distR="0" wp14:anchorId="0E53705C" wp14:editId="320A4134">
             <wp:extent cx="5715000" cy="3905250"/>
             <wp:effectExtent l="0" t="0" r="0" b="0"/>
             <wp:docPr id="4" name="fig04_boxplots.png" descr="Diagramas de caja y bigotes de Quantity, Price y Total" title="Diagramas de caja y bigotes de Quantity, Price y Total"/>
@@ -13363,7 +12882,7 @@
           <w:noProof/>
         </w:rPr>
         <w:drawing>
-          <wp:inline distT="0" distB="0" distL="0" distR="0" wp14:anchorId="6FFA6043" wp14:editId="734BD69C">
+          <wp:inline distT="0" distB="0" distL="0" distR="0" wp14:anchorId="4E74422E" wp14:editId="5D1BB3D4">
             <wp:extent cx="5715000" cy="3867150"/>
             <wp:effectExtent l="0" t="0" r="0" b="0"/>
             <wp:docPr id="5" name="fig05_dispersion_unidades_ingreso.png" descr="Gráfico de dispersión entre unidades vendidas e ingreso por producto" title="Gráfico de dispersión entre unidades vendidas e ingreso por producto"/>
@@ -13444,7 +12963,7 @@
           <w:noProof/>
         </w:rPr>
         <w:drawing>
-          <wp:inline distT="0" distB="0" distL="0" distR="0" wp14:anchorId="3F750AA5" wp14:editId="08262C0B">
+          <wp:inline distT="0" distB="0" distL="0" distR="0" wp14:anchorId="0ACEB30C" wp14:editId="36B77D78">
             <wp:extent cx="5715000" cy="3171825"/>
             <wp:effectExtent l="0" t="0" r="0" b="0"/>
             <wp:docPr id="6" name="fig06_ingreso_mensual.png" descr="Ingreso mensual por venta de productos" title="Ingreso mensual por venta de productos"/>
@@ -13525,7 +13044,7 @@
           <w:noProof/>
         </w:rPr>
         <w:drawing>
-          <wp:inline distT="0" distB="0" distL="0" distR="0" wp14:anchorId="3B745C24" wp14:editId="79FFA91E">
+          <wp:inline distT="0" distB="0" distL="0" distR="0" wp14:anchorId="38554195" wp14:editId="39C1B491">
             <wp:extent cx="5715000" cy="3152775"/>
             <wp:effectExtent l="0" t="0" r="0" b="0"/>
             <wp:docPr id="7" name="fig07_top10_productos.png" descr="Diez productos con mayor ingreso" title="Diez productos con mayor ingreso"/>
@@ -13606,7 +13125,7 @@
           <w:noProof/>
         </w:rPr>
         <w:drawing>
-          <wp:inline distT="0" distB="0" distL="0" distR="0" wp14:anchorId="6007CE25" wp14:editId="267C5129">
+          <wp:inline distT="0" distB="0" distL="0" distR="0" wp14:anchorId="5738E46F" wp14:editId="3CA05449">
             <wp:extent cx="5715000" cy="3657600"/>
             <wp:effectExtent l="0" t="0" r="0" b="0"/>
             <wp:docPr id="8" name="fig08_ingreso_por_pais.png" descr="Diez países con mayor ingreso, sin contar al Reino Unido" title="Diez países con mayor ingreso, sin contar al Reino Unido"/>
@@ -13687,7 +13206,7 @@
           <w:noProof/>
         </w:rPr>
         <w:drawing>
-          <wp:inline distT="0" distB="0" distL="0" distR="0" wp14:anchorId="0A426512" wp14:editId="302C087B">
+          <wp:inline distT="0" distB="0" distL="0" distR="0" wp14:anchorId="6DCE45D0" wp14:editId="1D593FD7">
             <wp:extent cx="4762500" cy="3771900"/>
             <wp:effectExtent l="0" t="0" r="0" b="0"/>
             <wp:docPr id="9" name="fig09_correlacion_productos.png" descr="Mapa de calor de la correlación de Spearman entre variables de producto" title="Mapa de calor de la correlación de Spearman entre variables de producto"/>
@@ -13778,7 +13297,7 @@
           <w:noProof/>
         </w:rPr>
         <w:drawing>
-          <wp:inline distT="0" distB="0" distL="0" distR="0" wp14:anchorId="244E1F37" wp14:editId="64105439">
+          <wp:inline distT="0" distB="0" distL="0" distR="0" wp14:anchorId="03F2D794" wp14:editId="1644EC49">
             <wp:extent cx="5715000" cy="3533775"/>
             <wp:effectExtent l="0" t="0" r="0" b="0"/>
             <wp:docPr id="10" name="fig10_pareto_ingreso.png" descr="Curva de concentración del ingreso por producto" title="Curva de concentración del ingreso por producto"/>
@@ -13852,7 +13371,7 @@
       <w:pPr>
         <w:pStyle w:val="Ttulo1"/>
       </w:pPr>
-      <w:bookmarkStart w:id="10" w:name="_Toc242264018"/>
+      <w:bookmarkStart w:id="10" w:name="_Toc242264573"/>
       <w:r>
         <w:t>6. Conclusiones</w:t>
       </w:r>
@@ -13869,7 +13388,7 @@
         <w:jc w:val="both"/>
       </w:pPr>
       <w:r>
-        <w:t>Las tres variables de venta tienen asimetría positiva fuerte. La venta típica es pequeña: 4 unidades, £2.08 por unidad y £9.90 por línea, según las medianas. Por eso la mediana y el rango intercuartílico describen mejor estos datos que la media y la desviación estándar, que están influidas por los pedidos grandes.</w:t>
+        <w:t>Las ventas son pequeñas y asimétricas. Quantity, Price y Total tienen asimetría positiva fuerte (coeficientes de 33.43, 20.37 y 30.28). La venta típica es de 4 unidades, £2.08 por unidad y £9.90 por línea (medianas), muy por debajo de las medias (10.25 unidades, £3.26 y £18.87). Por eso la mediana y el rango intercuartílico describen mejor estos datos que la media y la desviación estándar.</w:t>
       </w:r>
     </w:p>
     <w:p>
@@ -13883,7 +13402,13 @@
         <w:jc w:val="both"/>
       </w:pPr>
       <w:r>
-        <w:t>Según la variable, los valores atípicos representan entre el 5.14 % (Quantity) y el 7.80 % (Total) de las líneas. Son pedidos de mayoreo y productos de precio alto que forman parte del negocio, y explican que la desviación estándar de Quantity (36.95) sea mucho mayor que su IQR (10).</w:t>
+        <w:t xml:space="preserve">Los valores atípicos son parte del negocio. Según la variable, entre el 5.14 % (Quantity) </w:t>
+      </w:r>
+      <w:r>
+        <w:t>y el 7.80 % (Total) de las líneas son atípicas por la regla</w:t>
+      </w:r>
+      <w:r>
+        <w:t xml:space="preserve"> de 1.5 × IQR. Corresponden a pedidos de mayoreo y a productos de precio alto, y explican que la desviación estándar de Quantity (36.95) sea mucho mayor que su IQR (10).</w:t>
       </w:r>
     </w:p>
     <w:p>
@@ -13897,7 +13422,7 @@
         <w:jc w:val="both"/>
       </w:pPr>
       <w:r>
-        <w:t>El precio y la cantidad tienen una relación inversa moderada (Spearman</w:t>
+        <w:t>El precio y la cantidad tienen una relación inversa. La correlación de Spearman entre ambos es de</w:t>
       </w:r>
       <w:r>
         <w:t xml:space="preserve"> </w:t>
@@ -13907,7 +13432,17 @@
         <w:t>0</w:t>
       </w:r>
       <w:r>
-        <w:t>.406): los productos baratos se compran en mayores cantidades. El importe de una línea se relaciona más con la cantidad (Spearman 0.684) que con el precio (0.329), en parte porque el importe se calcula como cantidad por precio.</w:t>
+        <w:t xml:space="preserve">.406: los productos baratos se compran en mayores cantidades. Con Pearson la relación casi no se nota </w:t>
+      </w:r>
+      <w:r>
+        <w:t>(</w:t>
+      </w:r>
+      <w:r>
+        <w:noBreakHyphen/>
+        <w:t>0</w:t>
+      </w:r>
+      <w:r>
+        <w:t>.094), porque no es lineal y los valores extremos la distorsionan.</w:t>
       </w:r>
     </w:p>
     <w:p>
@@ -13921,7 +13456,7 @@
         <w:jc w:val="both"/>
       </w:pPr>
       <w:r>
-        <w:t>A nivel producto, el ingreso se relaciona con la frecuencia con que se vende cada artículo (Spearman entre facturas e ingreso de 0.925) y no con su precio (0.090). Como 834 productos generan el 80 % del ingreso, conviene priorizar su disponibilidad en el inventario.</w:t>
+        <w:t>El ingreso de un producto se relaciona con la frecuencia con que se vende, no con su precio. A nivel producto, la correlación de Spearman entre el número de facturas y el ingreso es de 0.925, mientras que entre el precio mediano y el ingreso es de solo 0.090.</w:t>
       </w:r>
     </w:p>
     <w:p>
@@ -13935,7 +13470,7 @@
         <w:jc w:val="both"/>
       </w:pPr>
       <w:r>
-        <w:t>Las ventas aumentan antes de Navidad: noviembre de 2011 fue 2.27 veces el promedio mensual de enero a agosto, y diciembre de 2010 fue el mes más alto antes de septiembre. Con un solo año de datos no se puede confirmar que el patrón se repita, pero es congruente con un catálogo de regalos y sugiere aumentar las existencias de los productos principales desde septiembre.</w:t>
+        <w:t>El ingreso está muy concentrado en pocos productos. 834 productos, el 22.0 % del catálogo, generan el 80 % del ingreso, y la mitad de los productos con menor ingreso aporta solo el 4.3 %.</w:t>
       </w:r>
     </w:p>
     <w:p>
@@ -13949,7 +13484,7 @@
         <w:jc w:val="both"/>
       </w:pPr>
       <w:r>
-        <w:t>El negocio depende del mercado del Reino Unido, que aporta el 84.80 % del ingreso. Los principales mercados internacionales son Países Bajos, Irlanda, Alemania y Francia, que en conjunto suman 9.49 %.</w:t>
+        <w:t>Las ventas aumentan antes de Navidad. Noviembre de 2011 fue 2.27 veces el promedio mensual de enero a agosto, y diciembre de 2010 fue el mes más alto antes de septiembre. Con un solo año de datos no se puede confirmar que el patrón se repita cada año.</w:t>
       </w:r>
     </w:p>
     <w:p>
@@ -13963,14 +13498,30 @@
         <w:jc w:val="both"/>
       </w:pPr>
       <w:r>
-        <w:t>La limpieza de datos fue necesaria para obtener resultados confiables. Sin eliminar las compras canceladas, la cantidad máxima habría sido de 80,995 unidades en lugar de 4,800, lo que habría inflado la media y la varianza de Quantity y de Total.</w:t>
+        <w:t>El mercado principal es el Reino Unido. Aporta el 84.80 % del ingreso. Le siguen Países Bajos, Irlanda, Alemania y Francia, que juntos suman el 9.49 %.</w:t>
+      </w:r>
+    </w:p>
+    <w:p>
+      <w:pPr>
+        <w:spacing w:after="160" w:line="300" w:lineRule="auto"/>
+        <w:jc w:val="both"/>
+      </w:pPr>
+      <w:r>
+        <w:rPr>
+          <w:b/>
+          <w:bCs/>
+        </w:rPr>
+        <w:t xml:space="preserve">Implicaciones para el inventario. </w:t>
+      </w:r>
+      <w:r>
+        <w:t>Aunque los datos son de ventas y no de existencias, los resultados sirven para planear el inventario: conviene asegurar la disponibilidad de los 834 productos que generan el 80 % del ingreso, preparar más existencias de esos productos desde septiembre y manejar presentaciones por paquete, ya que el 19.6 % de las líneas de venta son múltiplos de 12 unidades.</w:t>
       </w:r>
     </w:p>
     <w:p>
       <w:pPr>
         <w:pStyle w:val="Ttulo1"/>
       </w:pPr>
-      <w:bookmarkStart w:id="11" w:name="_Toc242264019"/>
+      <w:bookmarkStart w:id="11" w:name="_Toc242264574"/>
       <w:r>
         <w:t>Referencias</w:t>
       </w:r>
@@ -14098,10 +13649,64 @@
 <file path=word/numbering.xml><?xml version="1.0" encoding="utf-8"?>
 <w:numbering xmlns:wpc="http://schemas.microsoft.com/office/word/2010/wordprocessingCanvas" xmlns:cx="http://schemas.microsoft.com/office/drawing/2014/chartex" xmlns:cx1="http://schemas.microsoft.com/office/drawing/2015/9/8/chartex" xmlns:cx2="http://schemas.microsoft.com/office/drawing/2015/10/21/chartex" xmlns:cx3="http://schemas.microsoft.com/office/drawing/2016/5/9/chartex" xmlns:cx4="http://schemas.microsoft.com/office/drawing/2016/5/10/chartex" xmlns:cx5="http://schemas.microsoft.com/office/drawing/2016/5/11/chartex" xmlns:cx6="http://schemas.microsoft.com/office/drawing/2016/5/12/chartex" xmlns:cx7="http://schemas.microsoft.com/office/drawing/2016/5/13/chartex" xmlns:cx8="http://schemas.microsoft.com/office/drawing/2016/5/14/chartex" xmlns:mc="http://schemas.openxmlformats.org/markup-compatibility/2006" xmlns:aink="http://schemas.microsoft.com/office/drawing/2016/ink" xmlns:am3d="http://schemas.microsoft.com/office/drawing/2017/model3d" xmlns:o="urn:schemas-microsoft-com:office:office" xmlns:oel="http://schemas.microsoft.com/office/2019/extlst" xmlns:r="http://schemas.openxmlformats.org/officeDocument/2006/relationships" xmlns:m="http://schemas.openxmlformats.org/officeDocument/2006/math" xmlns:v="urn:schemas-microsoft-com:vml" xmlns:wp14="http://schemas.microsoft.com/office/word/2010/wordprocessingDrawing" xmlns:wp="http://schemas.openxmlformats.org/drawingml/2006/wordprocessingDrawing" xmlns:w10="urn:schemas-microsoft-com:office:word" xmlns:w="http://schemas.openxmlformats.org/wordprocessingml/2006/main" xmlns:w14="http://schemas.microsoft.com/office/word/2010/wordml" xmlns:w15="http://schemas.microsoft.com/office/word/2012/wordml" xmlns:w16cex="http://schemas.microsoft.com/office/word/2018/wordml/cex" xmlns:w16cid="http://schemas.microsoft.com/office/word/2016/wordml/cid" xmlns:w16="http://schemas.microsoft.com/office/word/2018/wordml" xmlns:w16du="http://schemas.microsoft.com/office/word/2023/wordml/word16du" xmlns:w16sdtdh="http://schemas.microsoft.com/office/word/2020/wordml/sdtdatahash" xmlns:w16sdtfl="http://schemas.microsoft.com/office/word/2024/wordml/sdtformatlock" xmlns:w16se="http://schemas.microsoft.com/office/word/2015/wordml/symex" xmlns:wpg="http://schemas.microsoft.com/office/word/2010/wordprocessingGroup" xmlns:wpi="http://schemas.microsoft.com/office/word/2010/wordprocessingInk" xmlns:wne="http://schemas.microsoft.com/office/word/2006/wordml" xmlns:wps="http://schemas.microsoft.com/office/word/2010/wordprocessingShape" mc:Ignorable="w14 w15 w16se w16cid w16 w16cex w16sdtdh w16sdtfl w16du wp14">
   <w:abstractNum w:abstractNumId="0" w15:restartNumberingAfterBreak="0">
-    <w:nsid w:val="2E3C7A08"/>
+    <w:nsid w:val="3FE4432F"/>
     <w:multiLevelType w:val="hybridMultilevel"/>
-    <w:tmpl w:val="7DB62544"/>
-    <w:lvl w:ilvl="0" w:tplc="FE20D122" w:tentative="1">
+    <w:tmpl w:val="292E22B2"/>
+    <w:lvl w:ilvl="0" w:tplc="4838D864">
+      <w:start w:val="1"/>
+      <w:numFmt w:val="decimal"/>
+      <w:lvlText w:val="%1."/>
+      <w:lvlJc w:val="left"/>
+      <w:pPr>
+        <w:ind w:left="720" w:hanging="360"/>
+      </w:pPr>
+    </w:lvl>
+    <w:lvl w:ilvl="1" w:tplc="F22665DC">
+      <w:numFmt w:val="decimal"/>
+      <w:lvlText w:val=""/>
+      <w:lvlJc w:val="left"/>
+    </w:lvl>
+    <w:lvl w:ilvl="2" w:tplc="071C3192">
+      <w:numFmt w:val="decimal"/>
+      <w:lvlText w:val=""/>
+      <w:lvlJc w:val="left"/>
+    </w:lvl>
+    <w:lvl w:ilvl="3" w:tplc="146E2166">
+      <w:numFmt w:val="decimal"/>
+      <w:lvlText w:val=""/>
+      <w:lvlJc w:val="left"/>
+    </w:lvl>
+    <w:lvl w:ilvl="4" w:tplc="A35810EE">
+      <w:numFmt w:val="decimal"/>
+      <w:lvlText w:val=""/>
+      <w:lvlJc w:val="left"/>
+    </w:lvl>
+    <w:lvl w:ilvl="5" w:tplc="D0525D98">
+      <w:numFmt w:val="decimal"/>
+      <w:lvlText w:val=""/>
+      <w:lvlJc w:val="left"/>
+    </w:lvl>
+    <w:lvl w:ilvl="6" w:tplc="E85E0536">
+      <w:numFmt w:val="decimal"/>
+      <w:lvlText w:val=""/>
+      <w:lvlJc w:val="left"/>
+    </w:lvl>
+    <w:lvl w:ilvl="7" w:tplc="53344606">
+      <w:numFmt w:val="decimal"/>
+      <w:lvlText w:val=""/>
+      <w:lvlJc w:val="left"/>
+    </w:lvl>
+    <w:lvl w:ilvl="8" w:tplc="C00893D6">
+      <w:numFmt w:val="decimal"/>
+      <w:lvlText w:val=""/>
+      <w:lvlJc w:val="left"/>
+    </w:lvl>
+  </w:abstractNum>
+  <w:abstractNum w:abstractNumId="1" w15:restartNumberingAfterBreak="0">
+    <w:nsid w:val="4CFA5C2C"/>
+    <w:multiLevelType w:val="hybridMultilevel"/>
+    <w:tmpl w:val="9C0CFD3E"/>
+    <w:lvl w:ilvl="0" w:tplc="CAA0E810" w:tentative="1">
       <w:start w:val="1"/>
       <w:numFmt w:val="bullet"/>
       <w:lvlText w:val="●"/>
@@ -14110,7 +13715,7 @@
         <w:ind w:left="720" w:hanging="360"/>
       </w:pPr>
     </w:lvl>
-    <w:lvl w:ilvl="1" w:tplc="7FB6DA70" w:tentative="1">
+    <w:lvl w:ilvl="1" w:tplc="5504EE88" w:tentative="1">
       <w:start w:val="1"/>
       <w:numFmt w:val="bullet"/>
       <w:lvlText w:val="○"/>
@@ -14119,7 +13724,7 @@
         <w:ind w:left="1440" w:hanging="360"/>
       </w:pPr>
     </w:lvl>
-    <w:lvl w:ilvl="2" w:tplc="916A13D6" w:tentative="1">
+    <w:lvl w:ilvl="2" w:tplc="9C26E700" w:tentative="1">
       <w:start w:val="1"/>
       <w:numFmt w:val="bullet"/>
       <w:lvlText w:val="■"/>
@@ -14128,7 +13733,7 @@
         <w:ind w:left="2160" w:hanging="360"/>
       </w:pPr>
     </w:lvl>
-    <w:lvl w:ilvl="3" w:tplc="54B049A2" w:tentative="1">
+    <w:lvl w:ilvl="3" w:tplc="7910FFFC" w:tentative="1">
       <w:start w:val="1"/>
       <w:numFmt w:val="bullet"/>
       <w:lvlText w:val="●"/>
@@ -14137,7 +13742,7 @@
         <w:ind w:left="2880" w:hanging="360"/>
       </w:pPr>
     </w:lvl>
-    <w:lvl w:ilvl="4" w:tplc="37564618" w:tentative="1">
+    <w:lvl w:ilvl="4" w:tplc="FD30E754" w:tentative="1">
       <w:start w:val="1"/>
       <w:numFmt w:val="bullet"/>
       <w:lvlText w:val="○"/>
@@ -14146,7 +13751,7 @@
         <w:ind w:left="3600" w:hanging="360"/>
       </w:pPr>
     </w:lvl>
-    <w:lvl w:ilvl="5" w:tplc="5AF255FA" w:tentative="1">
+    <w:lvl w:ilvl="5" w:tplc="3BBC0786" w:tentative="1">
       <w:start w:val="1"/>
       <w:numFmt w:val="bullet"/>
       <w:lvlText w:val="■"/>
@@ -14155,7 +13760,7 @@
         <w:ind w:left="4320" w:hanging="360"/>
       </w:pPr>
     </w:lvl>
-    <w:lvl w:ilvl="6" w:tplc="BC685122" w:tentative="1">
+    <w:lvl w:ilvl="6" w:tplc="DC96FD92" w:tentative="1">
       <w:start w:val="1"/>
       <w:numFmt w:val="bullet"/>
       <w:lvlText w:val="●"/>
@@ -14164,7 +13769,7 @@
         <w:ind w:left="5040" w:hanging="360"/>
       </w:pPr>
     </w:lvl>
-    <w:lvl w:ilvl="7" w:tplc="F71EDD76" w:tentative="1">
+    <w:lvl w:ilvl="7" w:tplc="5D4CAE7A" w:tentative="1">
       <w:start w:val="1"/>
       <w:numFmt w:val="bullet"/>
       <w:lvlText w:val="●"/>
@@ -14173,7 +13778,7 @@
         <w:ind w:left="5760" w:hanging="360"/>
       </w:pPr>
     </w:lvl>
-    <w:lvl w:ilvl="8" w:tplc="A8A665FA" w:tentative="1">
+    <w:lvl w:ilvl="8" w:tplc="F8BCF6F0" w:tentative="1">
       <w:start w:val="1"/>
       <w:numFmt w:val="bullet"/>
       <w:lvlText w:val="●"/>
@@ -14183,65 +13788,11 @@
       </w:pPr>
     </w:lvl>
   </w:abstractNum>
-  <w:abstractNum w:abstractNumId="1" w15:restartNumberingAfterBreak="0">
-    <w:nsid w:val="55EE63F2"/>
+  <w:abstractNum w:abstractNumId="2" w15:restartNumberingAfterBreak="0">
+    <w:nsid w:val="69A11A62"/>
     <w:multiLevelType w:val="hybridMultilevel"/>
-    <w:tmpl w:val="079E9A60"/>
-    <w:lvl w:ilvl="0" w:tplc="C2306280">
-      <w:start w:val="1"/>
-      <w:numFmt w:val="decimal"/>
-      <w:lvlText w:val="%1."/>
-      <w:lvlJc w:val="left"/>
-      <w:pPr>
-        <w:ind w:left="720" w:hanging="360"/>
-      </w:pPr>
-    </w:lvl>
-    <w:lvl w:ilvl="1" w:tplc="5CCC6CEA">
-      <w:numFmt w:val="decimal"/>
-      <w:lvlText w:val=""/>
-      <w:lvlJc w:val="left"/>
-    </w:lvl>
-    <w:lvl w:ilvl="2" w:tplc="C722D77A">
-      <w:numFmt w:val="decimal"/>
-      <w:lvlText w:val=""/>
-      <w:lvlJc w:val="left"/>
-    </w:lvl>
-    <w:lvl w:ilvl="3" w:tplc="1444F192">
-      <w:numFmt w:val="decimal"/>
-      <w:lvlText w:val=""/>
-      <w:lvlJc w:val="left"/>
-    </w:lvl>
-    <w:lvl w:ilvl="4" w:tplc="31B8D818">
-      <w:numFmt w:val="decimal"/>
-      <w:lvlText w:val=""/>
-      <w:lvlJc w:val="left"/>
-    </w:lvl>
-    <w:lvl w:ilvl="5" w:tplc="CE1483A2">
-      <w:numFmt w:val="decimal"/>
-      <w:lvlText w:val=""/>
-      <w:lvlJc w:val="left"/>
-    </w:lvl>
-    <w:lvl w:ilvl="6" w:tplc="7D84A1D6">
-      <w:numFmt w:val="decimal"/>
-      <w:lvlText w:val=""/>
-      <w:lvlJc w:val="left"/>
-    </w:lvl>
-    <w:lvl w:ilvl="7" w:tplc="FFAAAB24">
-      <w:numFmt w:val="decimal"/>
-      <w:lvlText w:val=""/>
-      <w:lvlJc w:val="left"/>
-    </w:lvl>
-    <w:lvl w:ilvl="8" w:tplc="2BF6C9FA">
-      <w:numFmt w:val="decimal"/>
-      <w:lvlText w:val=""/>
-      <w:lvlJc w:val="left"/>
-    </w:lvl>
-  </w:abstractNum>
-  <w:abstractNum w:abstractNumId="2" w15:restartNumberingAfterBreak="0">
-    <w:nsid w:val="712C6857"/>
-    <w:multiLevelType w:val="hybridMultilevel"/>
-    <w:tmpl w:val="23108394"/>
-    <w:lvl w:ilvl="0" w:tplc="50F67608">
+    <w:tmpl w:val="BE6A633C"/>
+    <w:lvl w:ilvl="0" w:tplc="4AB20840">
       <w:start w:val="1"/>
       <w:numFmt w:val="bullet"/>
       <w:lvlText w:val="•"/>
@@ -14250,61 +13801,61 @@
         <w:ind w:left="720" w:hanging="360"/>
       </w:pPr>
     </w:lvl>
-    <w:lvl w:ilvl="1" w:tplc="9692D89C">
+    <w:lvl w:ilvl="1" w:tplc="DF100A78">
       <w:numFmt w:val="decimal"/>
       <w:lvlText w:val=""/>
       <w:lvlJc w:val="left"/>
     </w:lvl>
-    <w:lvl w:ilvl="2" w:tplc="5FFE269A">
+    <w:lvl w:ilvl="2" w:tplc="DBB2D406">
       <w:numFmt w:val="decimal"/>
       <w:lvlText w:val=""/>
       <w:lvlJc w:val="left"/>
     </w:lvl>
-    <w:lvl w:ilvl="3" w:tplc="307EAF0E">
+    <w:lvl w:ilvl="3" w:tplc="92100C62">
       <w:numFmt w:val="decimal"/>
       <w:lvlText w:val=""/>
       <w:lvlJc w:val="left"/>
     </w:lvl>
-    <w:lvl w:ilvl="4" w:tplc="52BC6336">
+    <w:lvl w:ilvl="4" w:tplc="87A8E1F0">
       <w:numFmt w:val="decimal"/>
       <w:lvlText w:val=""/>
       <w:lvlJc w:val="left"/>
     </w:lvl>
-    <w:lvl w:ilvl="5" w:tplc="8356F32A">
+    <w:lvl w:ilvl="5" w:tplc="46046396">
       <w:numFmt w:val="decimal"/>
       <w:lvlText w:val=""/>
       <w:lvlJc w:val="left"/>
     </w:lvl>
-    <w:lvl w:ilvl="6" w:tplc="1F38EE64">
+    <w:lvl w:ilvl="6" w:tplc="0EE6CEAE">
       <w:numFmt w:val="decimal"/>
       <w:lvlText w:val=""/>
       <w:lvlJc w:val="left"/>
     </w:lvl>
-    <w:lvl w:ilvl="7" w:tplc="07A80424">
+    <w:lvl w:ilvl="7" w:tplc="77D23586">
       <w:numFmt w:val="decimal"/>
       <w:lvlText w:val=""/>
       <w:lvlJc w:val="left"/>
     </w:lvl>
-    <w:lvl w:ilvl="8" w:tplc="15D01C5A">
+    <w:lvl w:ilvl="8" w:tplc="B028956A">
       <w:numFmt w:val="decimal"/>
       <w:lvlText w:val=""/>
       <w:lvlJc w:val="left"/>
     </w:lvl>
   </w:abstractNum>
-  <w:num w:numId="1" w16cid:durableId="827786820">
-    <w:abstractNumId w:val="0"/>
+  <w:num w:numId="1" w16cid:durableId="1842230250">
+    <w:abstractNumId w:val="1"/>
     <w:lvlOverride w:ilvl="0">
       <w:startOverride w:val="1"/>
     </w:lvlOverride>
   </w:num>
-  <w:num w:numId="2" w16cid:durableId="215512733">
+  <w:num w:numId="2" w16cid:durableId="324018332">
     <w:abstractNumId w:val="2"/>
     <w:lvlOverride w:ilvl="0">
       <w:startOverride w:val="1"/>
     </w:lvlOverride>
   </w:num>
-  <w:num w:numId="3" w16cid:durableId="629359685">
-    <w:abstractNumId w:val="1"/>
+  <w:num w:numId="3" w16cid:durableId="1542396216">
+    <w:abstractNumId w:val="0"/>
     <w:lvlOverride w:ilvl="0">
       <w:startOverride w:val="1"/>
     </w:lvlOverride>
@@ -14943,7 +14494,7 @@
     <w:autoRedefine/>
     <w:uiPriority w:val="39"/>
     <w:unhideWhenUsed/>
-    <w:rsid w:val="007E4B26"/>
+    <w:rsid w:val="009C2B93"/>
     <w:pPr>
       <w:spacing w:after="100"/>
     </w:pPr>
@@ -14955,7 +14506,7 @@
     <w:autoRedefine/>
     <w:uiPriority w:val="39"/>
     <w:unhideWhenUsed/>
-    <w:rsid w:val="007E4B26"/>
+    <w:rsid w:val="009C2B93"/>
     <w:pPr>
       <w:spacing w:after="100"/>
       <w:ind w:left="220"/>

</xml_diff>